<commit_message>
Pareceres do revisor: achado do arranjo, reducao de arbitrariedade e levantamento para a monografia
</commit_message>
<xml_diff>
--- a/projeto/18_HISTORICO_DECISOES_E_FONTES.docx
+++ b/projeto/18_HISTORICO_DECISOES_E_FONTES.docx
@@ -107,7 +107,7 @@
           <w:sz w:val="20"/>
           <w:szCs w:val="20"/>
         </w:rPr>
-        <w:t xml:space="preserve">Versão 1 — 16 de setembro de 2026</w:t>
+        <w:t xml:space="preserve">Versão 4 — 17 de setembro de 2026 (A-13: decomposição premissa × modelo no contraste entre arranjos)</w:t>
       </w:r>
     </w:p>
     <w:p>
@@ -505,6 +505,290 @@
       </w:r>
     </w:p>
     <w:p>
+      <w:pPr>
+        <w:pStyle w:val="Heading3"/>
+        <w:spacing w:after="100" w:before="220"/>
+      </w:pPr>
+      <w:r>
+        <w:rPr>
+          <w:rFonts w:ascii="Calibri" w:cs="Calibri" w:eastAsia="Calibri" w:hAnsi="Calibri"/>
+          <w:b/>
+          <w:bCs/>
+          <w:color w:val="333333"/>
+          <w:sz w:val="21"/>
+          <w:szCs w:val="21"/>
+        </w:rPr>
+        <w:t xml:space="preserve">Quem é canônico para quê — leia antes de usar este arquivo</w:t>
+      </w:r>
+    </w:p>
+    <w:p>
+      <w:pPr>
+        <w:spacing w:after="120" w:before="0"/>
+      </w:pPr>
+      <w:r>
+        <w:rPr>
+          <w:rFonts w:ascii="Calibri" w:cs="Calibri" w:eastAsia="Calibri" w:hAnsi="Calibri"/>
+          <w:sz w:val="20"/>
+          <w:szCs w:val="20"/>
+        </w:rPr>
+        <w:t xml:space="preserve">O repositório já tinha dois registros quando este Word foi criado. Três documentos concorrentes sobre as mesmas fontes é pior do que nenhum, então a divisão é esta e não deve ser quebrada:</w:t>
+      </w:r>
+    </w:p>
+    <w:tbl>
+      <w:tblPr>
+        <w:tblW w:type="dxa" w:w="9700"/>
+        <w:tblBorders>
+          <w:top w:val="single" w:color="auto" w:sz="4"/>
+          <w:left w:val="single" w:color="auto" w:sz="4"/>
+          <w:bottom w:val="single" w:color="auto" w:sz="4"/>
+          <w:right w:val="single" w:color="auto" w:sz="4"/>
+          <w:insideH w:val="single" w:color="auto" w:sz="4"/>
+          <w:insideV w:val="single" w:color="auto" w:sz="4"/>
+        </w:tblBorders>
+      </w:tblPr>
+      <w:tblGrid>
+        <w:gridCol w:w="2600"/>
+        <w:gridCol w:w="7100"/>
+      </w:tblGrid>
+      <w:tr>
+        <w:trPr>
+          <w:tblHeader/>
+        </w:trPr>
+        <w:tc>
+          <w:tcPr>
+            <w:tcW w:type="dxa" w:w="2600"/>
+            <w:shd w:fill="9B2C5E" w:color="auto" w:val="clear"/>
+            <w:tcMar>
+              <w:top w:type="dxa" w:w="80"/>
+              <w:left w:type="dxa" w:w="100"/>
+              <w:bottom w:type="dxa" w:w="80"/>
+              <w:right w:type="dxa" w:w="100"/>
+            </w:tcMar>
+          </w:tcPr>
+          <w:p>
+            <w:r>
+              <w:rPr>
+                <w:rFonts w:ascii="Calibri" w:cs="Calibri" w:eastAsia="Calibri" w:hAnsi="Calibri"/>
+                <w:b/>
+                <w:bCs/>
+                <w:color w:val="FFFFFF"/>
+                <w:sz w:val="18"/>
+                <w:szCs w:val="18"/>
+              </w:rPr>
+              <w:t xml:space="preserve">Documento</w:t>
+            </w:r>
+          </w:p>
+        </w:tc>
+        <w:tc>
+          <w:tcPr>
+            <w:tcW w:type="dxa" w:w="7100"/>
+            <w:shd w:fill="9B2C5E" w:color="auto" w:val="clear"/>
+            <w:tcMar>
+              <w:top w:type="dxa" w:w="80"/>
+              <w:left w:type="dxa" w:w="100"/>
+              <w:bottom w:type="dxa" w:w="80"/>
+              <w:right w:type="dxa" w:w="100"/>
+            </w:tcMar>
+          </w:tcPr>
+          <w:p>
+            <w:r>
+              <w:rPr>
+                <w:rFonts w:ascii="Calibri" w:cs="Calibri" w:eastAsia="Calibri" w:hAnsi="Calibri"/>
+                <w:b/>
+                <w:bCs/>
+                <w:color w:val="FFFFFF"/>
+                <w:sz w:val="18"/>
+                <w:szCs w:val="18"/>
+              </w:rPr>
+              <w:t xml:space="preserve">É canônico para</w:t>
+            </w:r>
+          </w:p>
+        </w:tc>
+      </w:tr>
+      <w:tr>
+        <w:trPr>
+          <w:cantSplit/>
+        </w:trPr>
+        <w:tc>
+          <w:tcPr>
+            <w:tcW w:type="dxa" w:w="2600"/>
+            <w:tcMar>
+              <w:top w:type="dxa" w:w="80"/>
+              <w:left w:type="dxa" w:w="100"/>
+              <w:bottom w:type="dxa" w:w="80"/>
+              <w:right w:type="dxa" w:w="100"/>
+            </w:tcMar>
+          </w:tcPr>
+          <w:p>
+            <w:pPr>
+              <w:spacing w:after="40"/>
+            </w:pPr>
+            <w:r>
+              <w:rPr>
+                <w:rFonts w:ascii="Calibri" w:cs="Calibri" w:eastAsia="Calibri" w:hAnsi="Calibri"/>
+                <w:b/>
+                <w:bCs/>
+                <w:sz w:val="20"/>
+                <w:szCs w:val="20"/>
+              </w:rPr>
+              <w:t xml:space="preserve">projeto/04_FONTES.md</w:t>
+            </w:r>
+          </w:p>
+        </w:tc>
+        <w:tc>
+          <w:tcPr>
+            <w:tcW w:type="dxa" w:w="7100"/>
+            <w:tcMar>
+              <w:top w:type="dxa" w:w="80"/>
+              <w:left w:type="dxa" w:w="100"/>
+              <w:bottom w:type="dxa" w:w="80"/>
+              <w:right w:type="dxa" w:w="100"/>
+            </w:tcMar>
+          </w:tcPr>
+          <w:p>
+            <w:pPr>
+              <w:spacing w:after="40"/>
+            </w:pPr>
+            <w:r>
+              <w:rPr>
+                <w:rFonts w:ascii="Calibri" w:cs="Calibri" w:eastAsia="Calibri" w:hAnsi="Calibri"/>
+                <w:sz w:val="18"/>
+                <w:szCs w:val="18"/>
+              </w:rPr>
+              <w:t xml:space="preserve">O CATÁLOGO DE FONTES. Toda referência, com link, o que sustenta e — a parte que mais importa — o que ela NÃO sustenta. Qualquer fonte nova entra ali primeiro. Este Word não redefine o estado de nenhuma fonte que já esteja lá.</w:t>
+            </w:r>
+          </w:p>
+        </w:tc>
+      </w:tr>
+      <w:tr>
+        <w:trPr>
+          <w:cantSplit/>
+        </w:trPr>
+        <w:tc>
+          <w:tcPr>
+            <w:tcW w:type="dxa" w:w="2600"/>
+            <w:shd w:fill="F2F2F2" w:color="auto" w:val="clear"/>
+            <w:tcMar>
+              <w:top w:type="dxa" w:w="80"/>
+              <w:left w:type="dxa" w:w="100"/>
+              <w:bottom w:type="dxa" w:w="80"/>
+              <w:right w:type="dxa" w:w="100"/>
+            </w:tcMar>
+          </w:tcPr>
+          <w:p>
+            <w:pPr>
+              <w:spacing w:after="40"/>
+            </w:pPr>
+            <w:r>
+              <w:rPr>
+                <w:rFonts w:ascii="Calibri" w:cs="Calibri" w:eastAsia="Calibri" w:hAnsi="Calibri"/>
+                <w:b/>
+                <w:bCs/>
+                <w:sz w:val="20"/>
+                <w:szCs w:val="20"/>
+              </w:rPr>
+              <w:t xml:space="preserve">docs/registro_de_decisoes.md</w:t>
+            </w:r>
+          </w:p>
+        </w:tc>
+        <w:tc>
+          <w:tcPr>
+            <w:tcW w:type="dxa" w:w="7100"/>
+            <w:shd w:fill="F2F2F2" w:color="auto" w:val="clear"/>
+            <w:tcMar>
+              <w:top w:type="dxa" w:w="80"/>
+              <w:left w:type="dxa" w:w="100"/>
+              <w:bottom w:type="dxa" w:w="80"/>
+              <w:right w:type="dxa" w:w="100"/>
+            </w:tcMar>
+          </w:tcPr>
+          <w:p>
+            <w:pPr>
+              <w:spacing w:after="40"/>
+            </w:pPr>
+            <w:r>
+              <w:rPr>
+                <w:rFonts w:ascii="Calibri" w:cs="Calibri" w:eastAsia="Calibri" w:hAnsi="Calibri"/>
+                <w:sz w:val="18"/>
+                <w:szCs w:val="18"/>
+              </w:rPr>
+              <w:t xml:space="preserve">AS DECISÕES DO PIPELINE, com as marcas [LITERATURA] / [DECISÃO] / [ACHADO] / [ABERTO]. Limpeza D″, auditoria da base NASA, construção do proxy de dificuldade. É o registro mais detalhado e mais antigo do trabalho.</w:t>
+            </w:r>
+          </w:p>
+        </w:tc>
+      </w:tr>
+      <w:tr>
+        <w:trPr>
+          <w:cantSplit/>
+        </w:trPr>
+        <w:tc>
+          <w:tcPr>
+            <w:tcW w:type="dxa" w:w="2600"/>
+            <w:tcMar>
+              <w:top w:type="dxa" w:w="80"/>
+              <w:left w:type="dxa" w:w="100"/>
+              <w:bottom w:type="dxa" w:w="80"/>
+              <w:right w:type="dxa" w:w="100"/>
+            </w:tcMar>
+          </w:tcPr>
+          <w:p>
+            <w:pPr>
+              <w:spacing w:after="40"/>
+            </w:pPr>
+            <w:r>
+              <w:rPr>
+                <w:rFonts w:ascii="Calibri" w:cs="Calibri" w:eastAsia="Calibri" w:hAnsi="Calibri"/>
+                <w:b/>
+                <w:bCs/>
+                <w:sz w:val="20"/>
+                <w:szCs w:val="20"/>
+              </w:rPr>
+              <w:t xml:space="preserve">Este Word (projeto/18)</w:t>
+            </w:r>
+          </w:p>
+        </w:tc>
+        <w:tc>
+          <w:tcPr>
+            <w:tcW w:type="dxa" w:w="7100"/>
+            <w:tcMar>
+              <w:top w:type="dxa" w:w="80"/>
+              <w:left w:type="dxa" w:w="100"/>
+              <w:bottom w:type="dxa" w:w="80"/>
+              <w:right w:type="dxa" w:w="100"/>
+            </w:tcMar>
+          </w:tcPr>
+          <w:p>
+            <w:pPr>
+              <w:spacing w:after="40"/>
+            </w:pPr>
+            <w:r>
+              <w:rPr>
+                <w:rFonts w:ascii="Calibri" w:cs="Calibri" w:eastAsia="Calibri" w:hAnsi="Calibri"/>
+                <w:sz w:val="18"/>
+                <w:szCs w:val="18"/>
+              </w:rPr>
+              <w:t xml:space="preserve">A CAMADA DA REVISÃO INDEPENDENTE: decisões negociadas entre autora e revisor, achados da auditoria adversarial, retratações do revisor e gargalos abertos. Quando cita uma fonte, aponta para o 04_FONTES em vez de repetir o estado dela.</w:t>
+            </w:r>
+          </w:p>
+        </w:tc>
+      </w:tr>
+    </w:tbl>
+    <w:p>
+      <w:pPr>
+        <w:spacing w:after="120" w:before="0"/>
+      </w:pPr>
+      <w:r>
+        <w:rPr>
+          <w:rFonts w:ascii="Calibri" w:cs="Calibri" w:eastAsia="Calibri" w:hAnsi="Calibri"/>
+          <w:b/>
+          <w:bCs/>
+          <w:sz w:val="20"/>
+          <w:szCs w:val="20"/>
+        </w:rPr>
+        <w:t xml:space="preserve">Regra prática: fonte nova vai para o 04_FONTES. Decisão de pipeline vai para o registro_de_decisoes. Decisão de revisão, achado adversarial ou retratação vem para cá.</w:t>
+      </w:r>
+    </w:p>
+    <w:p>
       <w:r>
         <w:br w:type="page"/>
       </w:r>
@@ -603,7 +887,50 @@
           <w:sz w:val="20"/>
           <w:szCs w:val="20"/>
         </w:rPr>
-        <w:t xml:space="preserve">Crowder, Robinson, Hughes &amp; Sim (2012), equação (4). O PDF está nos arquivos do projeto e a equação foi lida literalmente — não parafraseada de resumo.</w:t>
+        <w:t xml:space="preserve">Crowder, Robinson, Hughes &amp; Sim (2012), equação (4). O PDF está nos arquivos do projeto e a equação foi lida literalmente — não parafraseada de resumo. Na forma em que o 04_FONTES.md já a registra: ΔC = [15 + 3(C_k − C)] / 100.</w:t>
+      </w:r>
+    </w:p>
+    <w:p>
+      <w:pPr>
+        <w:spacing w:after="90"/>
+        <w:ind w:left="200"/>
+      </w:pPr>
+      <w:r>
+        <w:rPr>
+          <w:rFonts w:ascii="Calibri" w:cs="Calibri" w:eastAsia="Calibri" w:hAnsi="Calibri"/>
+          <w:b/>
+          <w:bCs/>
+          <w:color w:val="9B2C5E"/>
+          <w:sz w:val="20"/>
+          <w:szCs w:val="20"/>
+        </w:rPr>
+        <w:t xml:space="preserve">Condições de contorno que vêm do próprio artigo:  </w:t>
+      </w:r>
+      <w:r>
+        <w:rPr>
+          <w:rFonts w:ascii="Calibri" w:cs="Calibri" w:eastAsia="Calibri" w:hAnsi="Calibri"/>
+          <w:sz w:val="20"/>
+          <w:szCs w:val="20"/>
+        </w:rPr>
+        <w:t xml:space="preserve">o 04_FONTES.md já registrava três, e elas não são opcionais: ΔC ∈ [0 ; 0,3]; a competência após ajuda não ultrapassa a dificuldade da subtarefa; e </w:t>
+      </w:r>
+      <w:r>
+        <w:rPr>
+          <w:rFonts w:ascii="Calibri" w:cs="Calibri" w:eastAsia="Calibri" w:hAnsi="Calibri"/>
+          <w:b/>
+          <w:bCs/>
+          <w:sz w:val="20"/>
+          <w:szCs w:val="20"/>
+        </w:rPr>
+        <w:t xml:space="preserve">ao terminar a subtarefa a competência volta ao valor inicial</w:t>
+      </w:r>
+      <w:r>
+        <w:rPr>
+          <w:rFonts w:ascii="Calibri" w:cs="Calibri" w:eastAsia="Calibri" w:hAnsi="Calibri"/>
+          <w:sz w:val="20"/>
+          <w:szCs w:val="20"/>
+        </w:rPr>
+        <w:t xml:space="preserve">. O código atual faz o ganho ser permanente — divergência registrada como item C6. Ou o reset é implementado, ou o trabalho passa a declarar que usa a fórmula de Crowder dentro de uma dinâmica diferente da dele. Uma das duas; não as duas.</w:t>
       </w:r>
     </w:p>
     <w:p>
@@ -1244,6 +1571,31 @@
     </w:p>
     <w:p>
       <w:pPr>
+        <w:spacing w:after="90"/>
+        <w:ind w:left="200"/>
+      </w:pPr>
+      <w:r>
+        <w:rPr>
+          <w:rFonts w:ascii="Calibri" w:cs="Calibri" w:eastAsia="Calibri" w:hAnsi="Calibri"/>
+          <w:b/>
+          <w:bCs/>
+          <w:color w:val="9B2C5E"/>
+          <w:sz w:val="20"/>
+          <w:szCs w:val="20"/>
+        </w:rPr>
+        <w:t xml:space="preserve">Precedente no próprio repositório:  </w:t>
+      </w:r>
+      <w:r>
+        <w:rPr>
+          <w:rFonts w:ascii="Calibri" w:cs="Calibri" w:eastAsia="Calibri" w:hAnsi="Calibri"/>
+          <w:sz w:val="20"/>
+          <w:szCs w:val="20"/>
+        </w:rPr>
+        <w:t xml:space="preserve">o 04_FONTES.md já havia corrigido uma atribuição imprópria do mesmo tipo — a formulação preliminar atribuía Di a De Reyck &amp; Herroelen (1996), que caracterizam complexidade DA REDE INTEIRA e não um índice por atividade. A referência foi realocada para caracterização de rede. D-05 é a continuação dessa mesma correção, agora no nome da variável.</w:t>
+      </w:r>
+    </w:p>
+    <w:p>
+      <w:pPr>
         <w:pBdr>
           <w:bottom w:val="single" w:color="D9A8C0" w:sz="6"/>
         </w:pBdr>
@@ -1618,7 +1970,7 @@
           <w:sz w:val="24"/>
           <w:szCs w:val="24"/>
         </w:rPr>
-        <w:t xml:space="preserve">D-08 — O 46% de retrabalho do modelo: nem defensável nem refutável hoje</w:t>
+        <w:t xml:space="preserve">D-08 — O 46% de retrabalho do modelo: a unidade bate, o domínio não</w:t>
       </w:r>
     </w:p>
     <w:p>
@@ -1679,15 +2031,52 @@
           <w:sz w:val="20"/>
           <w:szCs w:val="20"/>
         </w:rPr>
-        <w:t xml:space="preserve">Posição atual:  </w:t>
-      </w:r>
-      <w:r>
-        <w:rPr>
-          <w:rFonts w:ascii="Calibri" w:cs="Calibri" w:eastAsia="Calibri" w:hAnsi="Calibri"/>
-          <w:sz w:val="20"/>
-          <w:szCs w:val="20"/>
-        </w:rPr>
-        <w:t xml:space="preserve">concedo o exagero. Mas a justificativa de substituição reintroduz exatamente o empréstimo entre domínios que acabávamos de eliminar — trocar a comparação com construção por uma comparação com software não resolve o problema de unidade, apenas o desloca. A posição honesta é a seguinte: 46% hoje não é defensável nem refutável, por falta de um comparador na mesma unidade. Enquanto o retrabalho do modelo for medido em uma grandeza e a literatura em outra, a comparação não decide nada.</w:t>
+        <w:t xml:space="preserve">Segunda correção, esta mais séria:  </w:t>
+      </w:r>
+      <w:r>
+        <w:rPr>
+          <w:rFonts w:ascii="Calibri" w:cs="Calibri" w:eastAsia="Calibri" w:hAnsi="Calibri"/>
+          <w:sz w:val="20"/>
+          <w:szCs w:val="20"/>
+        </w:rPr>
+        <w:t xml:space="preserve">eu escrevi em seguida que “46% não é defensável nem refutável por falta de um comparador na mesma unidade”. </w:t>
+      </w:r>
+      <w:r>
+        <w:rPr>
+          <w:rFonts w:ascii="Calibri" w:cs="Calibri" w:eastAsia="Calibri" w:hAnsi="Calibri"/>
+          <w:b/>
+          <w:bCs/>
+          <w:color w:val="9C2B1B"/>
+          <w:sz w:val="20"/>
+          <w:szCs w:val="20"/>
+        </w:rPr>
+        <w:t xml:space="preserve">Isso também está errado.</w:t>
+      </w:r>
+      <w:r>
+        <w:rPr>
+          <w:rFonts w:ascii="Calibri" w:cs="Calibri" w:eastAsia="Calibri" w:hAnsi="Calibri"/>
+          <w:sz w:val="20"/>
+          <w:szCs w:val="20"/>
+        </w:rPr>
+        <w:t xml:space="preserve"> O 04_FONTES.md do próprio repositório já registrava, verificado e com link que abre, que Boehm &amp; Basili (2001) medem </w:t>
+      </w:r>
+      <w:r>
+        <w:rPr>
+          <w:rFonts w:ascii="Calibri" w:cs="Calibri" w:eastAsia="Calibri" w:hAnsi="Calibri"/>
+          <w:b/>
+          <w:bCs/>
+          <w:sz w:val="20"/>
+          <w:szCs w:val="20"/>
+        </w:rPr>
+        <w:t xml:space="preserve">esforço</w:t>
+      </w:r>
+      <w:r>
+        <w:rPr>
+          <w:rFonts w:ascii="Calibri" w:cs="Calibri" w:eastAsia="Calibri" w:hAnsi="Calibri"/>
+          <w:sz w:val="20"/>
+          <w:szCs w:val="20"/>
+        </w:rPr>
+        <w:t xml:space="preserve"> — e anotava textualmente que é “a única referência na mesma unidade da saída do modelo”. O comparador de unidade existe e estava catalogado antes de eu escrever o contrário. Ver R-06.</w:t>
       </w:r>
     </w:p>
     <w:p>
@@ -1704,6 +2093,56 @@
           <w:sz w:val="20"/>
           <w:szCs w:val="20"/>
         </w:rPr>
+        <w:t xml:space="preserve">Posição corrigida:  </w:t>
+      </w:r>
+      <w:r>
+        <w:rPr>
+          <w:rFonts w:ascii="Calibri" w:cs="Calibri" w:eastAsia="Calibri" w:hAnsi="Calibri"/>
+          <w:sz w:val="20"/>
+          <w:szCs w:val="20"/>
+        </w:rPr>
+        <w:t xml:space="preserve">a unidade bate — esforço contra esforço. O que não bate é o domínio: Boehm &amp; Basili medem desenvolvimento de software, e o modelo simula execução de projeto genérico sobre instâncias do PSPLIB J60. Então 46% não é absurdo do ponto de vista de grandeza; é uma comparação entre domínios diferentes, e é assim que precisa ser apresentado — com o empréstimo declarado, não escondido nem negado.</w:t>
+      </w:r>
+    </w:p>
+    <w:p>
+      <w:pPr>
+        <w:spacing w:after="90"/>
+        <w:ind w:left="200"/>
+      </w:pPr>
+      <w:r>
+        <w:rPr>
+          <w:rFonts w:ascii="Calibri" w:cs="Calibri" w:eastAsia="Calibri" w:hAnsi="Calibri"/>
+          <w:b/>
+          <w:bCs/>
+          <w:color w:val="9B2C5E"/>
+          <w:sz w:val="20"/>
+          <w:szCs w:val="20"/>
+        </w:rPr>
+        <w:t xml:space="preserve">Contraste de denominadores que a leitura conjunta revelou:  </w:t>
+      </w:r>
+      <w:r>
+        <w:rPr>
+          <w:rFonts w:ascii="Calibri" w:cs="Calibri" w:eastAsia="Calibri" w:hAnsi="Calibri"/>
+          <w:sz w:val="20"/>
+          <w:szCs w:val="20"/>
+        </w:rPr>
+        <w:t xml:space="preserve">a compilação CMAA põe o retrabalho em 4–11% do CUSTO; Love (2026), verificado no 04_FONTES, põe em 0,38% do VALOR DE CONTRATO (máximo 3,67%; 0,76% incluindo pós-conclusão); Love &amp; Li (2000) em 3,15% e 2,40% do valor contratual; Boehm &amp; Basili em 40–50% do ESFORÇO. Essas quatro cifras não se contradizem — elas medem coisas diferentes. Qualquer uma citada sem o denominador ao lado vira erro.</w:t>
+      </w:r>
+    </w:p>
+    <w:p>
+      <w:pPr>
+        <w:spacing w:after="90"/>
+        <w:ind w:left="200"/>
+      </w:pPr>
+      <w:r>
+        <w:rPr>
+          <w:rFonts w:ascii="Calibri" w:cs="Calibri" w:eastAsia="Calibri" w:hAnsi="Calibri"/>
+          <w:b/>
+          <w:bCs/>
+          <w:color w:val="9B2C5E"/>
+          <w:sz w:val="20"/>
+          <w:szCs w:val="20"/>
+        </w:rPr>
         <w:t xml:space="preserve">Consequência prática:  </w:t>
       </w:r>
       <w:r>
@@ -1712,7 +2151,7 @@
           <w:sz w:val="20"/>
           <w:szCs w:val="20"/>
         </w:rPr>
-        <w:t xml:space="preserve">o primeiro dos três gargalos abertos é justamente construir esse comparador — retrabalho medido em horas, contra E_plano na mesma base. Ver seção 5.</w:t>
+        <w:t xml:space="preserve">G-01 muda de natureza. Não é mais “achar um comparador na mesma unidade”, porque ele existe. É decidir e justificar se o empréstimo software → engenharia de projeto é aceitável, e com que ressalva. Ver seção 5.</w:t>
       </w:r>
     </w:p>
     <w:p>
@@ -1794,7 +2233,93 @@
           <w:sz w:val="20"/>
           <w:szCs w:val="20"/>
         </w:rPr>
-        <w:t xml:space="preserve">Andrianakis et al. (2015), tutorial de History Matching bayesiano com emulação; Pukelsheim (1994) para a justificativa do corte em 3 desvios.</w:t>
+        <w:t xml:space="preserve">Andrianakis et al. (2015), tutorial de History Matching bayesiano com emulação; Pukelsheim (1994) para a justificativa do corte em 3 desvios; McCulloch et al. (2022, JASSS) para o teste do gêmeo idêntico. As três já estão catalogadas e verificadas no 04_FONTES.md.</w:t>
+      </w:r>
+    </w:p>
+    <w:p>
+      <w:pPr>
+        <w:spacing w:after="90"/>
+        <w:ind w:left="200"/>
+      </w:pPr>
+      <w:r>
+        <w:rPr>
+          <w:rFonts w:ascii="Calibri" w:cs="Calibri" w:eastAsia="Calibri" w:hAnsi="Calibri"/>
+          <w:b/>
+          <w:bCs/>
+          <w:color w:val="9B2C5E"/>
+          <w:sz w:val="20"/>
+          <w:szCs w:val="20"/>
+        </w:rPr>
+        <w:t xml:space="preserve">Precisão exigida pela fonte (do 04_FONTES, item E7):  </w:t>
+      </w:r>
+      <w:r>
+        <w:rPr>
+          <w:rFonts w:ascii="Calibri" w:cs="Calibri" w:eastAsia="Calibri" w:hAnsi="Calibri"/>
+          <w:sz w:val="20"/>
+          <w:szCs w:val="20"/>
+        </w:rPr>
+        <w:t xml:space="preserve">a desigualdade de Pukelsheim vale para distribuições com </w:t>
+      </w:r>
+      <w:r>
+        <w:rPr>
+          <w:rFonts w:ascii="Calibri" w:cs="Calibri" w:eastAsia="Calibri" w:hAnsi="Calibri"/>
+          <w:b/>
+          <w:bCs/>
+          <w:sz w:val="20"/>
+          <w:szCs w:val="20"/>
+        </w:rPr>
+        <w:t xml:space="preserve">densidade</w:t>
+      </w:r>
+      <w:r>
+        <w:rPr>
+          <w:rFonts w:ascii="Calibri" w:cs="Calibri" w:eastAsia="Calibri" w:hAnsi="Calibri"/>
+          <w:sz w:val="20"/>
+          <w:szCs w:val="20"/>
+        </w:rPr>
+        <w:t xml:space="preserve"> unimodal — não para “qualquer distribuição unimodal”. O texto precisa dizer isso. É o tipo exato de esticamento de citação que o 04_FONTES foi feito para impedir.</w:t>
+      </w:r>
+    </w:p>
+    <w:p>
+      <w:pPr>
+        <w:spacing w:after="90"/>
+        <w:ind w:left="200"/>
+      </w:pPr>
+      <w:r>
+        <w:rPr>
+          <w:rFonts w:ascii="Calibri" w:cs="Calibri" w:eastAsia="Calibri" w:hAnsi="Calibri"/>
+          <w:b/>
+          <w:bCs/>
+          <w:color w:val="9B2C5E"/>
+          <w:sz w:val="20"/>
+          <w:szCs w:val="20"/>
+        </w:rPr>
+        <w:t xml:space="preserve">Reforço da limitação (do 04_FONTES):  </w:t>
+      </w:r>
+      <w:r>
+        <w:rPr>
+          <w:rFonts w:ascii="Calibri" w:cs="Calibri" w:eastAsia="Calibri" w:hAnsi="Calibri"/>
+          <w:sz w:val="20"/>
+          <w:szCs w:val="20"/>
+        </w:rPr>
+        <w:t xml:space="preserve">McCulloch et al. enfatizam que modelos reais sempre têm discrepância e que ignorá-la </w:t>
+      </w:r>
+      <w:r>
+        <w:rPr>
+          <w:rFonts w:ascii="Calibri" w:cs="Calibri" w:eastAsia="Calibri" w:hAnsi="Calibri"/>
+          <w:b/>
+          <w:bCs/>
+          <w:sz w:val="20"/>
+          <w:szCs w:val="20"/>
+        </w:rPr>
+        <w:t xml:space="preserve">prende os parâmetros ao modelo</w:t>
+      </w:r>
+      <w:r>
+        <w:rPr>
+          <w:rFonts w:ascii="Calibri" w:cs="Calibri" w:eastAsia="Calibri" w:hAnsi="Calibri"/>
+          <w:sz w:val="20"/>
+          <w:szCs w:val="20"/>
+        </w:rPr>
+        <w:t xml:space="preserve"> em vez de representá-los como grandezas fisicamente significativas. Isso não é um detalhe: é a justificativa publicada para D-11, que rebaixa a calibração a limitação declarada.</w:t>
       </w:r>
     </w:p>
     <w:p>
@@ -2180,25 +2705,18 @@
       </w:r>
     </w:p>
     <w:p>
-      <w:r>
-        <w:br w:type="page"/>
-      </w:r>
-    </w:p>
-    <w:p>
-      <w:pPr>
-        <w:pStyle w:val="Heading1"/>
-        <w:spacing w:after="200" w:before="360"/>
-      </w:pPr>
-      <w:r>
-        <w:rPr>
-          <w:rFonts w:ascii="Calibri" w:cs="Calibri" w:eastAsia="Calibri" w:hAnsi="Calibri"/>
-          <w:b/>
-          <w:bCs/>
-          <w:color w:val="9B2C5E"/>
-          <w:sz w:val="30"/>
-          <w:szCs w:val="30"/>
-        </w:rPr>
-        <w:t xml:space="preserve">2. Catálogo de fontes</w:t>
+      <w:pPr>
+        <w:pBdr>
+          <w:bottom w:val="single" w:color="D9A8C0" w:sz="6"/>
+        </w:pBdr>
+        <w:spacing w:after="160" w:before="60"/>
+      </w:pPr>
+      <w:r>
+        <w:rPr>
+          <w:sz w:val="2"/>
+          <w:szCs w:val="2"/>
+        </w:rPr>
+        <w:t xml:space="preserve"/>
       </w:r>
     </w:p>
     <w:p>
@@ -2215,7 +2733,600 @@
           <w:sz w:val="24"/>
           <w:szCs w:val="24"/>
         </w:rPr>
-        <w:t xml:space="preserve">2.1 Fontes com texto lido ou dado recalculado — citáveis</w:t>
+        <w:t xml:space="preserve">D-13 — O precedente mais próximo do trabalho não está citado em lugar nenhum</w:t>
+      </w:r>
+    </w:p>
+    <w:p>
+      <w:pPr>
+        <w:spacing w:after="90"/>
+        <w:ind w:left="200"/>
+      </w:pPr>
+      <w:r>
+        <w:rPr>
+          <w:rFonts w:ascii="Calibri" w:cs="Calibri" w:eastAsia="Calibri" w:hAnsi="Calibri"/>
+          <w:b/>
+          <w:bCs/>
+          <w:color w:val="9B2C5E"/>
+          <w:sz w:val="20"/>
+          <w:szCs w:val="20"/>
+        </w:rPr>
+        <w:t xml:space="preserve">Achado:  </w:t>
+      </w:r>
+      <w:r>
+        <w:rPr>
+          <w:rFonts w:ascii="Calibri" w:cs="Calibri" w:eastAsia="Calibri" w:hAnsi="Calibri"/>
+          <w:sz w:val="20"/>
+          <w:szCs w:val="20"/>
+        </w:rPr>
+        <w:t xml:space="preserve">o 04_FONTES.md registra, com a marca de pendência, um arcabouço ABM + Dinâmica de Sistemas para execução de projetos de P&amp;D </w:t>
+      </w:r>
+      <w:r>
+        <w:rPr>
+          <w:rFonts w:ascii="Calibri" w:cs="Calibri" w:eastAsia="Calibri" w:hAnsi="Calibri"/>
+          <w:b/>
+          <w:bCs/>
+          <w:sz w:val="20"/>
+          <w:szCs w:val="20"/>
+        </w:rPr>
+        <w:t xml:space="preserve">com ciclos de retrabalho</w:t>
+      </w:r>
+      <w:r>
+        <w:rPr>
+          <w:rFonts w:ascii="Calibri" w:cs="Calibri" w:eastAsia="Calibri" w:hAnsi="Calibri"/>
+          <w:sz w:val="20"/>
+          <w:szCs w:val="20"/>
+        </w:rPr>
+        <w:t xml:space="preserve"> — e anota que é “o precedente mais próximo do que foi construído e ainda não é citado em lugar nenhum”. O PDF está nos arquivos do Projeto TCC2.</w:t>
+      </w:r>
+    </w:p>
+    <w:p>
+      <w:pPr>
+        <w:spacing w:after="90"/>
+        <w:ind w:left="200"/>
+      </w:pPr>
+      <w:r>
+        <w:rPr>
+          <w:rFonts w:ascii="Calibri" w:cs="Calibri" w:eastAsia="Calibri" w:hAnsi="Calibri"/>
+          <w:b/>
+          <w:bCs/>
+          <w:color w:val="9B2C5E"/>
+          <w:sz w:val="20"/>
+          <w:szCs w:val="20"/>
+        </w:rPr>
+        <w:t xml:space="preserve">Por que isso é urgente e não cosmético:  </w:t>
+      </w:r>
+      <w:r>
+        <w:rPr>
+          <w:rFonts w:ascii="Calibri" w:cs="Calibri" w:eastAsia="Calibri" w:hAnsi="Calibri"/>
+          <w:sz w:val="20"/>
+          <w:szCs w:val="20"/>
+        </w:rPr>
+        <w:t xml:space="preserve">um TCC que constrói exatamente um híbrido ABM + SD com ciclos de retrabalho e não cita o trabalho publicado que fez a mesma coisa tem um problema de posicionamento, não de bibliografia. A banca pergunta o que este trabalho faz que aquele não fez — e a resposta precisa estar escrita antes da pergunta, não improvisada na defesa.</w:t>
+      </w:r>
+    </w:p>
+    <w:p>
+      <w:pPr>
+        <w:spacing w:after="90"/>
+        <w:ind w:left="200"/>
+      </w:pPr>
+      <w:r>
+        <w:rPr>
+          <w:rFonts w:ascii="Calibri" w:cs="Calibri" w:eastAsia="Calibri" w:hAnsi="Calibri"/>
+          <w:b/>
+          <w:bCs/>
+          <w:color w:val="9B2C5E"/>
+          <w:sz w:val="20"/>
+          <w:szCs w:val="20"/>
+        </w:rPr>
+        <w:t xml:space="preserve">Ação:  </w:t>
+      </w:r>
+      <w:r>
+        <w:rPr>
+          <w:rFonts w:ascii="Calibri" w:cs="Calibri" w:eastAsia="Calibri" w:hAnsi="Calibri"/>
+          <w:sz w:val="20"/>
+          <w:szCs w:val="20"/>
+        </w:rPr>
+        <w:t xml:space="preserve">ler o PDF, citar, e escrever explicitamente o delta: o que este trabalho acrescenta (degradação cognitiva por porta de decisão, arranjos de governança contrastados, ancoragem externa dos parâmetros de falha) e o que ele herda. Enquanto isso não for feito, é o item de maior risco de arguição do trabalho inteiro.</w:t>
+      </w:r>
+    </w:p>
+    <w:p>
+      <w:pPr>
+        <w:spacing w:after="90"/>
+        <w:ind w:left="200"/>
+      </w:pPr>
+      <w:r>
+        <w:rPr>
+          <w:rFonts w:ascii="Calibri" w:cs="Calibri" w:eastAsia="Calibri" w:hAnsi="Calibri"/>
+          <w:b/>
+          <w:bCs/>
+          <w:color w:val="9B2C5E"/>
+          <w:sz w:val="20"/>
+          <w:szCs w:val="20"/>
+        </w:rPr>
+        <w:t xml:space="preserve">Estado:  </w:t>
+      </w:r>
+      <w:r>
+        <w:rPr>
+          <w:rFonts w:ascii="Calibri" w:cs="Calibri" w:eastAsia="Calibri" w:hAnsi="Calibri"/>
+          <w:sz w:val="20"/>
+          <w:szCs w:val="20"/>
+        </w:rPr>
+        <w:t xml:space="preserve">aberto. Não depende de dado novo nem de rodada de simulação — depende de leitura e de meia página de texto.</w:t>
+      </w:r>
+    </w:p>
+    <w:p>
+      <w:pPr>
+        <w:pBdr>
+          <w:bottom w:val="single" w:color="D9A8C0" w:sz="6"/>
+        </w:pBdr>
+        <w:spacing w:after="160" w:before="60"/>
+      </w:pPr>
+      <w:r>
+        <w:rPr>
+          <w:sz w:val="2"/>
+          <w:szCs w:val="2"/>
+        </w:rPr>
+        <w:t xml:space="preserve"/>
+      </w:r>
+    </w:p>
+    <w:p>
+      <w:pPr>
+        <w:pStyle w:val="Heading2"/>
+        <w:spacing w:after="140" w:before="280"/>
+      </w:pPr>
+      <w:r>
+        <w:rPr>
+          <w:rFonts w:ascii="Calibri" w:cs="Calibri" w:eastAsia="Calibri" w:hAnsi="Calibri"/>
+          <w:b/>
+          <w:bCs/>
+          <w:color w:val="5E1B39"/>
+          <w:sz w:val="24"/>
+          <w:szCs w:val="24"/>
+        </w:rPr>
+        <w:t xml:space="preserve">D-14 — E_total deixa de sustentar conclusão de governança</w:t>
+      </w:r>
+    </w:p>
+    <w:p>
+      <w:pPr>
+        <w:spacing w:after="90"/>
+        <w:ind w:left="200"/>
+      </w:pPr>
+      <w:r>
+        <w:rPr>
+          <w:rFonts w:ascii="Calibri" w:cs="Calibri" w:eastAsia="Calibri" w:hAnsi="Calibri"/>
+          <w:b/>
+          <w:bCs/>
+          <w:color w:val="9B2C5E"/>
+          <w:sz w:val="20"/>
+          <w:szCs w:val="20"/>
+        </w:rPr>
+        <w:t xml:space="preserve">Decisão:  </w:t>
+      </w:r>
+      <w:r>
+        <w:rPr>
+          <w:rFonts w:ascii="Calibri" w:cs="Calibri" w:eastAsia="Calibri" w:hAnsi="Calibri"/>
+          <w:sz w:val="20"/>
+          <w:szCs w:val="20"/>
+        </w:rPr>
+        <w:t xml:space="preserve">a razão E_total = TW/(TW+TL+TU+TR) </w:t>
+      </w:r>
+      <w:r>
+        <w:rPr>
+          <w:rFonts w:ascii="Calibri" w:cs="Calibri" w:eastAsia="Calibri" w:hAnsi="Calibri"/>
+          <w:b/>
+          <w:bCs/>
+          <w:sz w:val="20"/>
+          <w:szCs w:val="20"/>
+        </w:rPr>
+        <w:t xml:space="preserve">não pode mais ser apresentada como resultado de governança</w:t>
+      </w:r>
+      <w:r>
+        <w:rPr>
+          <w:rFonts w:ascii="Calibri" w:cs="Calibri" w:eastAsia="Calibri" w:hAnsi="Calibri"/>
+          <w:sz w:val="20"/>
+          <w:szCs w:val="20"/>
+        </w:rPr>
+        <w:t xml:space="preserve">. O sinal do contraste entre arranjos depende de uma convenção contábil interna, não do fenômeno.</w:t>
+      </w:r>
+    </w:p>
+    <w:p>
+      <w:pPr>
+        <w:spacing w:after="90"/>
+        <w:ind w:left="200"/>
+      </w:pPr>
+      <w:r>
+        <w:rPr>
+          <w:rFonts w:ascii="Calibri" w:cs="Calibri" w:eastAsia="Calibri" w:hAnsi="Calibri"/>
+          <w:b/>
+          <w:bCs/>
+          <w:color w:val="9B2C5E"/>
+          <w:sz w:val="20"/>
+          <w:szCs w:val="20"/>
+        </w:rPr>
+        <w:t xml:space="preserve">Evidência decisiva (17/09/2026):  </w:t>
+      </w:r>
+      <w:r>
+        <w:rPr>
+          <w:rFonts w:ascii="Calibri" w:cs="Calibri" w:eastAsia="Calibri" w:hAnsi="Calibri"/>
+          <w:sz w:val="20"/>
+          <w:szCs w:val="20"/>
+        </w:rPr>
+        <w:t xml:space="preserve">o teste discriminante de TL rodou o nominal em duas convenções, tudo o mais idêntico. Contando TL += 1 por ajuda bem-sucedida — convenção do simulador, sem base externa — o contraste (adaptativa − centralizada) é −0,050845. Contando TL pela equação (3) de Crowder, TL += 0,5·ΔC, o contraste é +0,051973. O sinal inverte. E o valor legado era +0,104631. Três convenções, três sinais/magnitudes diferentes, mesmo fenômeno simulado.</w:t>
+      </w:r>
+    </w:p>
+    <w:p>
+      <w:pPr>
+        <w:spacing w:after="90"/>
+        <w:ind w:left="200"/>
+      </w:pPr>
+      <w:r>
+        <w:rPr>
+          <w:rFonts w:ascii="Calibri" w:cs="Calibri" w:eastAsia="Calibri" w:hAnsi="Calibri"/>
+          <w:b/>
+          <w:bCs/>
+          <w:color w:val="9B2C5E"/>
+          <w:sz w:val="20"/>
+          <w:szCs w:val="20"/>
+        </w:rPr>
+        <w:t xml:space="preserve">Corroboração independente:  </w:t>
+      </w:r>
+      <w:r>
+        <w:rPr>
+          <w:rFonts w:ascii="Calibri" w:cs="Calibri" w:eastAsia="Calibri" w:hAnsi="Calibri"/>
+          <w:sz w:val="20"/>
+          <w:szCs w:val="20"/>
+        </w:rPr>
+        <w:t xml:space="preserve">antes da rodada, eu havia previsto de mesa, a partir apenas dos componentes publicados do ramo adaptativo, um deslocamento de +0,106 no contraste. O deslocamento observado foi +0,102818. A previsão foi feita com dados diferentes e antes do experimento — o que torna o número reportado internamente consistente.</w:t>
+      </w:r>
+    </w:p>
+    <w:p>
+      <w:pPr>
+        <w:spacing w:after="90"/>
+        <w:ind w:left="200"/>
+      </w:pPr>
+      <w:r>
+        <w:rPr>
+          <w:rFonts w:ascii="Calibri" w:cs="Calibri" w:eastAsia="Calibri" w:hAnsi="Calibri"/>
+          <w:b/>
+          <w:bCs/>
+          <w:color w:val="9B2C5E"/>
+          <w:sz w:val="20"/>
+          <w:szCs w:val="20"/>
+        </w:rPr>
+        <w:t xml:space="preserve">O diagnóstico de fundo, que é maior que este achado:  </w:t>
+      </w:r>
+      <w:r>
+        <w:rPr>
+          <w:rFonts w:ascii="Calibri" w:cs="Calibri" w:eastAsia="Calibri" w:hAnsi="Calibri"/>
+          <w:sz w:val="20"/>
+          <w:szCs w:val="20"/>
+        </w:rPr>
+        <w:t xml:space="preserve">E_total soma no denominador grandezas que </w:t>
+      </w:r>
+      <w:r>
+        <w:rPr>
+          <w:rFonts w:ascii="Calibri" w:cs="Calibri" w:eastAsia="Calibri" w:hAnsi="Calibri"/>
+          <w:b/>
+          <w:bCs/>
+          <w:sz w:val="20"/>
+          <w:szCs w:val="20"/>
+        </w:rPr>
+        <w:t xml:space="preserve">não estão na mesma unidade</w:t>
+      </w:r>
+      <w:r>
+        <w:rPr>
+          <w:rFonts w:ascii="Calibri" w:cs="Calibri" w:eastAsia="Calibri" w:hAnsi="Calibri"/>
+          <w:sz w:val="20"/>
+          <w:szCs w:val="20"/>
+        </w:rPr>
+        <w:t xml:space="preserve">: TW é período de trabalho, TL é contagem de eventos de ajuda (ou incremento de competência, conforme a convenção), TU é período bloqueado, TR é esforço de reparo. É uma razão cujo denominador soma coisas diferentes. É exatamente a mesma doença que apareceu em F_ancora (D-07) e na comparação de retrabalho (D-08, G-01) — descasamento de unidade e de fronteira de sistema — agora num indicador de saída.</w:t>
+      </w:r>
+    </w:p>
+    <w:p>
+      <w:pPr>
+        <w:spacing w:after="90"/>
+        <w:ind w:left="200"/>
+      </w:pPr>
+      <w:r>
+        <w:rPr>
+          <w:rFonts w:ascii="Calibri" w:cs="Calibri" w:eastAsia="Calibri" w:hAnsi="Calibri"/>
+          <w:b/>
+          <w:bCs/>
+          <w:color w:val="9B2C5E"/>
+          <w:sz w:val="20"/>
+          <w:szCs w:val="20"/>
+        </w:rPr>
+        <w:t xml:space="preserve">Encaminhamento:  </w:t>
+      </w:r>
+      <w:r>
+        <w:rPr>
+          <w:rFonts w:ascii="Calibri" w:cs="Calibri" w:eastAsia="Calibri" w:hAnsi="Calibri"/>
+          <w:sz w:val="20"/>
+          <w:szCs w:val="20"/>
+        </w:rPr>
+        <w:t xml:space="preserve">ou E_total é aposentado como desfecho, ou é redefinido com os quatro termos numa única unidade declarada e defensável. Enquanto isso não for feito, ele entra na monografia como grandeza diagnóstica interna, nunca como evidência sobre arranjos de governança.</w:t>
+      </w:r>
+    </w:p>
+    <w:p>
+      <w:pPr>
+        <w:spacing w:after="90"/>
+        <w:ind w:left="200"/>
+      </w:pPr>
+      <w:r>
+        <w:rPr>
+          <w:rFonts w:ascii="Calibri" w:cs="Calibri" w:eastAsia="Calibri" w:hAnsi="Calibri"/>
+          <w:b/>
+          <w:bCs/>
+          <w:color w:val="9B2C5E"/>
+          <w:sz w:val="20"/>
+          <w:szCs w:val="20"/>
+        </w:rPr>
+        <w:t xml:space="preserve">O que sobrevive à convenção de TL:  </w:t>
+      </w:r>
+      <w:r>
+        <w:rPr>
+          <w:rFonts w:ascii="Calibri" w:cs="Calibri" w:eastAsia="Calibri" w:hAnsi="Calibri"/>
+          <w:sz w:val="20"/>
+          <w:szCs w:val="20"/>
+        </w:rPr>
+        <w:t xml:space="preserve">atraso_relativo, taxa de falhas não reportadas e dívida latente tiveram contraste negativo em </w:t>
+      </w:r>
+      <w:r>
+        <w:rPr>
+          <w:rFonts w:ascii="Calibri" w:cs="Calibri" w:eastAsia="Calibri" w:hAnsi="Calibri"/>
+          <w:b/>
+          <w:bCs/>
+          <w:sz w:val="20"/>
+          <w:szCs w:val="20"/>
+        </w:rPr>
+        <w:t xml:space="preserve">129 de 129 configurações</w:t>
+      </w:r>
+      <w:r>
+        <w:rPr>
+          <w:rFonts w:ascii="Calibri" w:cs="Calibri" w:eastAsia="Calibri" w:hAnsi="Calibri"/>
+          <w:sz w:val="20"/>
+          <w:szCs w:val="20"/>
+        </w:rPr>
+        <w:t xml:space="preserve"> de robustez, e nenhuma delas tem TL no denominador.</w:t>
+      </w:r>
+    </w:p>
+    <w:p>
+      <w:pPr>
+        <w:spacing w:after="90"/>
+        <w:ind w:left="200"/>
+      </w:pPr>
+      <w:r>
+        <w:rPr>
+          <w:rFonts w:ascii="Calibri" w:cs="Calibri" w:eastAsia="Calibri" w:hAnsi="Calibri"/>
+          <w:b/>
+          <w:bCs/>
+          <w:color w:val="9B2C5E"/>
+          <w:sz w:val="20"/>
+          <w:szCs w:val="20"/>
+        </w:rPr>
+        <w:t xml:space="preserve">CORREÇÃO em 17/09/2026 — sobreviver a TL não basta:  </w:t>
+      </w:r>
+      <w:r>
+        <w:rPr>
+          <w:rFonts w:ascii="Calibri" w:cs="Calibri" w:eastAsia="Calibri" w:hAnsi="Calibri"/>
+          <w:sz w:val="20"/>
+          <w:szCs w:val="20"/>
+        </w:rPr>
+        <w:t xml:space="preserve">a auditoria seguinte (A-13, parecer 23) mediu que duas dessas três são majoritariamente reenunciados de uma premissa declarada. taxa_omissao conta falhas </w:t>
+      </w:r>
+      <w:r>
+        <w:rPr>
+          <w:rFonts w:ascii="Calibri" w:cs="Calibri" w:eastAsia="Calibri" w:hAnsi="Calibri"/>
+          <w:b/>
+          <w:bCs/>
+          <w:sz w:val="20"/>
+          <w:szCs w:val="20"/>
+        </w:rPr>
+        <w:t xml:space="preserve">não reportadas</w:t>
+      </w:r>
+      <w:r>
+        <w:rPr>
+          <w:rFonts w:ascii="Calibri" w:cs="Calibri" w:eastAsia="Calibri" w:hAnsi="Calibri"/>
+          <w:sz w:val="20"/>
+          <w:szCs w:val="20"/>
+        </w:rPr>
+        <w:t xml:space="preserve">, e p_reporte é premissa: 0,15 contra 0,75. A razão da premissa sozinha é 3,400; o contraste observado é 3,708 — </w:t>
+      </w:r>
+      <w:r>
+        <w:rPr>
+          <w:rFonts w:ascii="Calibri" w:cs="Calibri" w:eastAsia="Calibri" w:hAnsi="Calibri"/>
+          <w:b/>
+          <w:bCs/>
+          <w:sz w:val="20"/>
+          <w:szCs w:val="20"/>
+        </w:rPr>
+        <w:t xml:space="preserve">93,4% do contraste é a premissa</w:t>
+      </w:r>
+      <w:r>
+        <w:rPr>
+          <w:rFonts w:ascii="Calibri" w:cs="Calibri" w:eastAsia="Calibri" w:hAnsi="Calibri"/>
+          <w:sz w:val="20"/>
+          <w:szCs w:val="20"/>
+        </w:rPr>
+        <w:t xml:space="preserve">, 6,6% é o modelo. Em dívida latente, 87,4% é premissa. Portanto a frase anterior desta decisão — de que as três carregam o argumento de governança — </w:t>
+      </w:r>
+      <w:r>
+        <w:rPr>
+          <w:rFonts w:ascii="Calibri" w:cs="Calibri" w:eastAsia="Calibri" w:hAnsi="Calibri"/>
+          <w:b/>
+          <w:bCs/>
+          <w:sz w:val="20"/>
+          <w:szCs w:val="20"/>
+        </w:rPr>
+        <w:t xml:space="preserve">estava errada para duas delas</w:t>
+      </w:r>
+      <w:r>
+        <w:rPr>
+          <w:rFonts w:ascii="Calibri" w:cs="Calibri" w:eastAsia="Calibri" w:hAnsi="Calibri"/>
+          <w:sz w:val="20"/>
+          <w:szCs w:val="20"/>
+        </w:rPr>
+        <w:t xml:space="preserve">. O que o modelo de fato produz é 1,502× em atraso, 1,135× na taxa de falha efetiva e 1,224× na fração de decisões pela Porta 1.</w:t>
+      </w:r>
+    </w:p>
+    <w:p>
+      <w:pPr>
+        <w:spacing w:after="90"/>
+        <w:ind w:left="200"/>
+      </w:pPr>
+      <w:r>
+        <w:rPr>
+          <w:rFonts w:ascii="Calibri" w:cs="Calibri" w:eastAsia="Calibri" w:hAnsi="Calibri"/>
+          <w:b/>
+          <w:bCs/>
+          <w:color w:val="9B2C5E"/>
+          <w:sz w:val="20"/>
+          <w:szCs w:val="20"/>
+        </w:rPr>
+        <w:t xml:space="preserve">Custo de ter descoberto agora:  </w:t>
+      </w:r>
+      <w:r>
+        <w:rPr>
+          <w:rFonts w:ascii="Calibri" w:cs="Calibri" w:eastAsia="Calibri" w:hAnsi="Calibri"/>
+          <w:sz w:val="20"/>
+          <w:szCs w:val="20"/>
+        </w:rPr>
+        <w:t xml:space="preserve">uma rodada e duas linhas de código. Custo de descobrir depois: retirar um achado já redigido, defendido e possivelmente já apresentado.</w:t>
+      </w:r>
+    </w:p>
+    <w:p>
+      <w:r>
+        <w:br w:type="page"/>
+      </w:r>
+    </w:p>
+    <w:p>
+      <w:pPr>
+        <w:pStyle w:val="Heading1"/>
+        <w:spacing w:after="200" w:before="360"/>
+      </w:pPr>
+      <w:r>
+        <w:rPr>
+          <w:rFonts w:ascii="Calibri" w:cs="Calibri" w:eastAsia="Calibri" w:hAnsi="Calibri"/>
+          <w:b/>
+          <w:bCs/>
+          <w:color w:val="9B2C5E"/>
+          <w:sz w:val="30"/>
+          <w:szCs w:val="30"/>
+        </w:rPr>
+        <w:t xml:space="preserve">2. Fontes trazidas pela revisão</w:t>
+      </w:r>
+    </w:p>
+    <w:p>
+      <w:pPr>
+        <w:spacing w:after="90"/>
+        <w:ind w:left="200"/>
+      </w:pPr>
+      <w:r>
+        <w:rPr>
+          <w:rFonts w:ascii="Calibri" w:cs="Calibri" w:eastAsia="Calibri" w:hAnsi="Calibri"/>
+          <w:b/>
+          <w:bCs/>
+          <w:color w:val="9B2C5E"/>
+          <w:sz w:val="20"/>
+          <w:szCs w:val="20"/>
+        </w:rPr>
+        <w:t xml:space="preserve">Leia isto primeiro:  </w:t>
+      </w:r>
+      <w:r>
+        <w:rPr>
+          <w:rFonts w:ascii="Calibri" w:cs="Calibri" w:eastAsia="Calibri" w:hAnsi="Calibri"/>
+          <w:sz w:val="20"/>
+          <w:szCs w:val="20"/>
+        </w:rPr>
+        <w:t xml:space="preserve">o catálogo de fontes do trabalho é o </w:t>
+      </w:r>
+      <w:r>
+        <w:rPr>
+          <w:rFonts w:ascii="Calibri" w:cs="Calibri" w:eastAsia="Calibri" w:hAnsi="Calibri"/>
+          <w:b/>
+          <w:bCs/>
+          <w:sz w:val="20"/>
+          <w:szCs w:val="20"/>
+        </w:rPr>
+        <w:t xml:space="preserve">projeto/04_FONTES.md</w:t>
+      </w:r>
+      <w:r>
+        <w:rPr>
+          <w:rFonts w:ascii="Calibri" w:cs="Calibri" w:eastAsia="Calibri" w:hAnsi="Calibri"/>
+          <w:sz w:val="20"/>
+          <w:szCs w:val="20"/>
+        </w:rPr>
+        <w:t xml:space="preserve">. Esta seção NÃO o substitui e não redefine o estado de nada que já esteja lá. Ela lista apenas as fontes que entraram pela revisão independente e que </w:t>
+      </w:r>
+      <w:r>
+        <w:rPr>
+          <w:rFonts w:ascii="Calibri" w:cs="Calibri" w:eastAsia="Calibri" w:hAnsi="Calibri"/>
+          <w:b/>
+          <w:bCs/>
+          <w:sz w:val="20"/>
+          <w:szCs w:val="20"/>
+        </w:rPr>
+        <w:t xml:space="preserve">ainda não estavam catalogadas</w:t>
+      </w:r>
+      <w:r>
+        <w:rPr>
+          <w:rFonts w:ascii="Calibri" w:cs="Calibri" w:eastAsia="Calibri" w:hAnsi="Calibri"/>
+          <w:sz w:val="20"/>
+          <w:szCs w:val="20"/>
+        </w:rPr>
+        <w:t xml:space="preserve">. Depois de conferidas, elas devem ser migradas para o 04_FONTES, no formato dele — com a linha do que a fonte NÃO sustenta, que é a disciplina que aquele arquivo impõe e que este aqui não tem.</w:t>
+      </w:r>
+    </w:p>
+    <w:p>
+      <w:pPr>
+        <w:spacing w:after="90"/>
+        <w:ind w:left="200"/>
+      </w:pPr>
+      <w:r>
+        <w:rPr>
+          <w:rFonts w:ascii="Calibri" w:cs="Calibri" w:eastAsia="Calibri" w:hAnsi="Calibri"/>
+          <w:b/>
+          <w:bCs/>
+          <w:color w:val="9B2C5E"/>
+          <w:sz w:val="20"/>
+          <w:szCs w:val="20"/>
+        </w:rPr>
+        <w:t xml:space="preserve">Já catalogadas lá, não repetidas aqui:  </w:t>
+      </w:r>
+      <w:r>
+        <w:rPr>
+          <w:rFonts w:ascii="Calibri" w:cs="Calibri" w:eastAsia="Calibri" w:hAnsi="Calibri"/>
+          <w:sz w:val="20"/>
+          <w:szCs w:val="20"/>
+        </w:rPr>
+        <w:t xml:space="preserve">Shepperd et al. (2013) e a coleção Figshare das bases limpas; Crowder et al. (2012); Andrianakis et al. (2015); Pukelsheim (1994); McCulloch et al. (2022); Kolisch &amp; Sprecher (1995, 1996, 1997) e o PSPLIB; Love &amp; Li (2000); Love (2026); Boehm &amp; Basili (2001); De Reyck &amp; Herroelen (1996); Liu, Triantis &amp; Sarangi (2011); Van Broekhoven &amp; De Baets (2009); Macal &amp; North (2010); Sterman (2000); Rodrigues (2000); McCabe (1976); NASA SWE-220 e NASA/TM-20205011566. </w:t>
+      </w:r>
+      <w:r>
+        <w:rPr>
+          <w:rFonts w:ascii="Calibri" w:cs="Calibri" w:eastAsia="Calibri" w:hAnsi="Calibri"/>
+          <w:i/>
+          <w:iCs/>
+          <w:sz w:val="20"/>
+          <w:szCs w:val="20"/>
+        </w:rPr>
+        <w:t xml:space="preserve">Se precisar do link ou do estado de qualquer uma delas, o lugar é o 04_FONTES.</w:t>
+      </w:r>
+    </w:p>
+    <w:p>
+      <w:pPr>
+        <w:pStyle w:val="Heading2"/>
+        <w:spacing w:after="140" w:before="280"/>
+      </w:pPr>
+      <w:r>
+        <w:rPr>
+          <w:rFonts w:ascii="Calibri" w:cs="Calibri" w:eastAsia="Calibri" w:hAnsi="Calibri"/>
+          <w:b/>
+          <w:bCs/>
+          <w:color w:val="5E1B39"/>
+          <w:sz w:val="24"/>
+          <w:szCs w:val="24"/>
+        </w:rPr>
+        <w:t xml:space="preserve">2.1 Fontes novas com texto lido ou dado recalculado</w:t>
       </w:r>
     </w:p>
     <w:p>
@@ -2419,7 +3530,7 @@
             <w:pPr>
               <w:spacing w:after="40"/>
             </w:pPr>
-            <w:hyperlink w:history="1" r:id="rId1oozxhinqvjck_85jyalo">
+            <w:hyperlink w:history="1" r:id="rIdmw-tmu5toxi2zzl21wop8">
               <w:r>
                 <w:rPr>
                   <w:rStyle w:val="Hyperlink"/>
@@ -2553,7 +3664,7 @@
             <w:pPr>
               <w:spacing w:after="40"/>
             </w:pPr>
-            <w:hyperlink w:history="1" r:id="rIdgis_sjpuho-zlw7jm8dpe">
+            <w:hyperlink w:history="1" r:id="rIde3gyhpdtub-bs3bl1pwih">
               <w:r>
                 <w:rPr>
                   <w:rStyle w:val="Hyperlink"/>
@@ -2702,7 +3813,7 @@
             <w:pPr>
               <w:spacing w:after="40"/>
             </w:pPr>
-            <w:hyperlink w:history="1" r:id="rIdevdu4cg660w1xt68dhi6_">
+            <w:hyperlink w:history="1" r:id="rIdh5yzko7xbs3ov8h-7sqns">
               <w:r>
                 <w:rPr>
                   <w:rStyle w:val="Hyperlink"/>
@@ -2942,15 +4053,15 @@
                 <w:sz w:val="20"/>
                 <w:szCs w:val="20"/>
               </w:rPr>
-              <w:t xml:space="preserve">Shepperd, M.; Song, Q.; Sun, Z.; Mair, C. (2013). </w:t>
-            </w:r>
-            <w:r>
-              <w:rPr>
-                <w:rFonts w:ascii="Calibri" w:cs="Calibri" w:eastAsia="Calibri" w:hAnsi="Calibri"/>
-                <w:sz w:val="18"/>
-                <w:szCs w:val="18"/>
-              </w:rPr>
-              <w:t xml:space="preserve">“Data Quality: Some Comments on the NASA Software Defect Datasets”. IEEE Transactions on Software Engineering, 39(9), 1208–1215.</w:t>
+              <w:t xml:space="preserve">Wood, R. E. (1986). </w:t>
+            </w:r>
+            <w:r>
+              <w:rPr>
+                <w:rFonts w:ascii="Calibri" w:cs="Calibri" w:eastAsia="Calibri" w:hAnsi="Calibri"/>
+                <w:sz w:val="18"/>
+                <w:szCs w:val="18"/>
+              </w:rPr>
+              <w:t xml:space="preserve">“Task complexity: Definition of the construct”. Organizational Behavior and Human Decision Processes, 37(1), 60–82.</w:t>
             </w:r>
           </w:p>
         </w:tc>
@@ -2968,141 +4079,7 @@
             <w:pPr>
               <w:spacing w:after="40"/>
             </w:pPr>
-            <w:hyperlink w:history="1" r:id="rIdv1vt2lzhb5zvprsi7otm9">
-              <w:r>
-                <w:rPr>
-                  <w:rStyle w:val="Hyperlink"/>
-                  <w:rFonts w:ascii="Calibri" w:cs="Calibri" w:eastAsia="Calibri" w:hAnsi="Calibri"/>
-                  <w:sz w:val="16"/>
-                  <w:szCs w:val="16"/>
-                </w:rPr>
-                <w:t xml:space="preserve">doi.org/10.1109/TSE.2013.11</w:t>
-              </w:r>
-            </w:hyperlink>
-          </w:p>
-        </w:tc>
-        <w:tc>
-          <w:tcPr>
-            <w:tcW w:type="dxa" w:w="2900"/>
-            <w:tcMar>
-              <w:top w:type="dxa" w:w="80"/>
-              <w:left w:type="dxa" w:w="100"/>
-              <w:bottom w:type="dxa" w:w="80"/>
-              <w:right w:type="dxa" w:w="100"/>
-            </w:tcMar>
-          </w:tcPr>
-          <w:p>
-            <w:pPr>
-              <w:spacing w:after="40"/>
-            </w:pPr>
-            <w:r>
-              <w:rPr>
-                <w:rFonts w:ascii="Calibri" w:cs="Calibri" w:eastAsia="Calibri" w:hAnsi="Calibri"/>
-                <w:sz w:val="18"/>
-                <w:szCs w:val="18"/>
-              </w:rPr>
-              <w:t xml:space="preserve">Qualidade dos conjuntos NASA: duplicatas, inconsistências, valores impossíveis; versões limpas publicadas. Obriga a declarar qual versão foi usada (D-06).</w:t>
-            </w:r>
-          </w:p>
-        </w:tc>
-        <w:tc>
-          <w:tcPr>
-            <w:tcW w:type="dxa" w:w="1900"/>
-            <w:tcMar>
-              <w:top w:type="dxa" w:w="80"/>
-              <w:left w:type="dxa" w:w="100"/>
-              <w:bottom w:type="dxa" w:w="80"/>
-              <w:right w:type="dxa" w:w="100"/>
-            </w:tcMar>
-          </w:tcPr>
-          <w:p>
-            <w:pPr>
-              <w:spacing w:after="40"/>
-            </w:pPr>
-            <w:r>
-              <w:rPr>
-                <w:rFonts w:ascii="Calibri" w:cs="Calibri" w:eastAsia="Calibri" w:hAnsi="Calibri"/>
-                <w:b/>
-                <w:bCs/>
-                <w:color w:val="8A6300"/>
-                <w:sz w:val="18"/>
-                <w:szCs w:val="18"/>
-              </w:rPr>
-              <w:t xml:space="preserve">METADADOS CONFERIDOS</w:t>
-            </w:r>
-          </w:p>
-          <w:p>
-            <w:pPr>
-              <w:spacing w:after="40"/>
-            </w:pPr>
-            <w:r>
-              <w:rPr>
-                <w:rFonts w:ascii="Calibri" w:cs="Calibri" w:eastAsia="Calibri" w:hAnsi="Calibri"/>
-                <w:i/>
-                <w:iCs/>
-                <w:sz w:val="20"/>
-                <w:szCs w:val="20"/>
-              </w:rPr>
-              <w:t xml:space="preserve">Conteúdo conhecido pelo uso, mas obter o PDF antes de citar número.</w:t>
-            </w:r>
-          </w:p>
-        </w:tc>
-      </w:tr>
-      <w:tr>
-        <w:trPr>
-          <w:cantSplit/>
-        </w:trPr>
-        <w:tc>
-          <w:tcPr>
-            <w:tcW w:type="dxa" w:w="2750"/>
-            <w:shd w:fill="F2F2F2" w:color="auto" w:val="clear"/>
-            <w:tcMar>
-              <w:top w:type="dxa" w:w="80"/>
-              <w:left w:type="dxa" w:w="100"/>
-              <w:bottom w:type="dxa" w:w="80"/>
-              <w:right w:type="dxa" w:w="100"/>
-            </w:tcMar>
-          </w:tcPr>
-          <w:p>
-            <w:pPr>
-              <w:spacing w:after="40"/>
-            </w:pPr>
-            <w:r>
-              <w:rPr>
-                <w:rFonts w:ascii="Calibri" w:cs="Calibri" w:eastAsia="Calibri" w:hAnsi="Calibri"/>
-                <w:b/>
-                <w:bCs/>
-                <w:sz w:val="20"/>
-                <w:szCs w:val="20"/>
-              </w:rPr>
-              <w:t xml:space="preserve">Wood, R. E. (1986). </w:t>
-            </w:r>
-            <w:r>
-              <w:rPr>
-                <w:rFonts w:ascii="Calibri" w:cs="Calibri" w:eastAsia="Calibri" w:hAnsi="Calibri"/>
-                <w:sz w:val="18"/>
-                <w:szCs w:val="18"/>
-              </w:rPr>
-              <w:t xml:space="preserve">“Task complexity: Definition of the construct”. Organizational Behavior and Human Decision Processes, 37(1), 60–82.</w:t>
-            </w:r>
-          </w:p>
-        </w:tc>
-        <w:tc>
-          <w:tcPr>
-            <w:tcW w:type="dxa" w:w="2150"/>
-            <w:shd w:fill="F2F2F2" w:color="auto" w:val="clear"/>
-            <w:tcMar>
-              <w:top w:type="dxa" w:w="80"/>
-              <w:left w:type="dxa" w:w="100"/>
-              <w:bottom w:type="dxa" w:w="80"/>
-              <w:right w:type="dxa" w:w="100"/>
-            </w:tcMar>
-          </w:tcPr>
-          <w:p>
-            <w:pPr>
-              <w:spacing w:after="40"/>
-            </w:pPr>
-            <w:hyperlink w:history="1" r:id="rIdip0o5l0ngsrrpu50aaebf">
+            <w:hyperlink w:history="1" r:id="rIdfjaznglphg-3skwhhld6c">
               <w:r>
                 <w:rPr>
                   <w:rStyle w:val="Hyperlink"/>
@@ -3118,7 +4095,6 @@
         <w:tc>
           <w:tcPr>
             <w:tcW w:type="dxa" w:w="2900"/>
-            <w:shd w:fill="F2F2F2" w:color="auto" w:val="clear"/>
             <w:tcMar>
               <w:top w:type="dxa" w:w="80"/>
               <w:left w:type="dxa" w:w="100"/>
@@ -3143,7 +4119,6 @@
         <w:tc>
           <w:tcPr>
             <w:tcW w:type="dxa" w:w="1900"/>
-            <w:shd w:fill="F2F2F2" w:color="auto" w:val="clear"/>
             <w:tcMar>
               <w:top w:type="dxa" w:w="80"/>
               <w:left w:type="dxa" w:w="100"/>
@@ -3176,6 +4151,7 @@
         <w:tc>
           <w:tcPr>
             <w:tcW w:type="dxa" w:w="2750"/>
+            <w:shd w:fill="F2F2F2" w:color="auto" w:val="clear"/>
             <w:tcMar>
               <w:top w:type="dxa" w:w="80"/>
               <w:left w:type="dxa" w:w="100"/>
@@ -3210,18 +4186,19 @@
         <w:tc>
           <w:tcPr>
             <w:tcW w:type="dxa" w:w="2150"/>
-            <w:tcMar>
-              <w:top w:type="dxa" w:w="80"/>
-              <w:left w:type="dxa" w:w="100"/>
-              <w:bottom w:type="dxa" w:w="80"/>
-              <w:right w:type="dxa" w:w="100"/>
-            </w:tcMar>
-          </w:tcPr>
-          <w:p>
-            <w:pPr>
-              <w:spacing w:after="40"/>
-            </w:pPr>
-            <w:hyperlink w:history="1" r:id="rIdaubq_csj0flmpake8i58r">
+            <w:shd w:fill="F2F2F2" w:color="auto" w:val="clear"/>
+            <w:tcMar>
+              <w:top w:type="dxa" w:w="80"/>
+              <w:left w:type="dxa" w:w="100"/>
+              <w:bottom w:type="dxa" w:w="80"/>
+              <w:right w:type="dxa" w:w="100"/>
+            </w:tcMar>
+          </w:tcPr>
+          <w:p>
+            <w:pPr>
+              <w:spacing w:after="40"/>
+            </w:pPr>
+            <w:hyperlink w:history="1" r:id="rIdgjyr0hie1umgyyi6uqiao">
               <w:r>
                 <w:rPr>
                   <w:rStyle w:val="Hyperlink"/>
@@ -3237,6 +4214,7 @@
         <w:tc>
           <w:tcPr>
             <w:tcW w:type="dxa" w:w="2900"/>
+            <w:shd w:fill="F2F2F2" w:color="auto" w:val="clear"/>
             <w:tcMar>
               <w:top w:type="dxa" w:w="80"/>
               <w:left w:type="dxa" w:w="100"/>
@@ -3261,6 +4239,7 @@
         <w:tc>
           <w:tcPr>
             <w:tcW w:type="dxa" w:w="1900"/>
+            <w:shd w:fill="F2F2F2" w:color="auto" w:val="clear"/>
             <w:tcMar>
               <w:top w:type="dxa" w:w="80"/>
               <w:left w:type="dxa" w:w="100"/>
@@ -3293,7 +4272,6 @@
         <w:tc>
           <w:tcPr>
             <w:tcW w:type="dxa" w:w="2750"/>
-            <w:shd w:fill="F2F2F2" w:color="auto" w:val="clear"/>
             <w:tcMar>
               <w:top w:type="dxa" w:w="80"/>
               <w:left w:type="dxa" w:w="100"/>
@@ -3313,287 +4291,33 @@
                 <w:sz w:val="20"/>
                 <w:szCs w:val="20"/>
               </w:rPr>
-              <w:t xml:space="preserve">Andrianakis, I. et al. (2015). </w:t>
-            </w:r>
-            <w:r>
-              <w:rPr>
-                <w:rFonts w:ascii="Calibri" w:cs="Calibri" w:eastAsia="Calibri" w:hAnsi="Calibri"/>
-                <w:sz w:val="18"/>
-                <w:szCs w:val="18"/>
-              </w:rPr>
-              <w:t xml:space="preserve">“Bayesian History Matching of Complex Infectious Disease Models Using Emulation: A Tutorial and a Case Study on HIV in Uganda”. PLoS Computational Biology, 11(1), e1003968.</w:t>
+              <w:t xml:space="preserve">Raue, A. et al. (2009). </w:t>
+            </w:r>
+            <w:r>
+              <w:rPr>
+                <w:rFonts w:ascii="Calibri" w:cs="Calibri" w:eastAsia="Calibri" w:hAnsi="Calibri"/>
+                <w:sz w:val="18"/>
+                <w:szCs w:val="18"/>
+              </w:rPr>
+              <w:t xml:space="preserve">“Structural and practical identifiability analysis of partially observed dynamical models by exploiting the profile likelihood”. Bioinformatics, 25(15), 1923–1929.</w:t>
             </w:r>
           </w:p>
         </w:tc>
         <w:tc>
           <w:tcPr>
             <w:tcW w:type="dxa" w:w="2150"/>
-            <w:shd w:fill="F2F2F2" w:color="auto" w:val="clear"/>
-            <w:tcMar>
-              <w:top w:type="dxa" w:w="80"/>
-              <w:left w:type="dxa" w:w="100"/>
-              <w:bottom w:type="dxa" w:w="80"/>
-              <w:right w:type="dxa" w:w="100"/>
-            </w:tcMar>
-          </w:tcPr>
-          <w:p>
-            <w:pPr>
-              <w:spacing w:after="40"/>
-            </w:pPr>
-            <w:hyperlink w:history="1" r:id="rIdekkbb4euqf87y5kroc_02">
-              <w:r>
-                <w:rPr>
-                  <w:rStyle w:val="Hyperlink"/>
-                  <w:rFonts w:ascii="Calibri" w:cs="Calibri" w:eastAsia="Calibri" w:hAnsi="Calibri"/>
-                  <w:sz w:val="16"/>
-                  <w:szCs w:val="16"/>
-                </w:rPr>
-                <w:t xml:space="preserve">doi.org/10.1371/journal.pcbi.1003968</w:t>
-              </w:r>
-            </w:hyperlink>
-          </w:p>
-        </w:tc>
-        <w:tc>
-          <w:tcPr>
-            <w:tcW w:type="dxa" w:w="2900"/>
-            <w:shd w:fill="F2F2F2" w:color="auto" w:val="clear"/>
-            <w:tcMar>
-              <w:top w:type="dxa" w:w="80"/>
-              <w:left w:type="dxa" w:w="100"/>
-              <w:bottom w:type="dxa" w:w="80"/>
-              <w:right w:type="dxa" w:w="100"/>
-            </w:tcMar>
-          </w:tcPr>
-          <w:p>
-            <w:pPr>
-              <w:spacing w:after="40"/>
-            </w:pPr>
-            <w:r>
-              <w:rPr>
-                <w:rFonts w:ascii="Calibri" w:cs="Calibri" w:eastAsia="Calibri" w:hAnsi="Calibri"/>
-                <w:sz w:val="18"/>
-                <w:szCs w:val="18"/>
-              </w:rPr>
-              <w:t xml:space="preserve">Definição de History Matching, implausibilidade e região NROY (D-09). Acesso aberto.</w:t>
-            </w:r>
-          </w:p>
-        </w:tc>
-        <w:tc>
-          <w:tcPr>
-            <w:tcW w:type="dxa" w:w="1900"/>
-            <w:shd w:fill="F2F2F2" w:color="auto" w:val="clear"/>
-            <w:tcMar>
-              <w:top w:type="dxa" w:w="80"/>
-              <w:left w:type="dxa" w:w="100"/>
-              <w:bottom w:type="dxa" w:w="80"/>
-              <w:right w:type="dxa" w:w="100"/>
-            </w:tcMar>
-          </w:tcPr>
-          <w:p>
-            <w:pPr>
-              <w:spacing w:after="40"/>
-            </w:pPr>
-            <w:r>
-              <w:rPr>
-                <w:rFonts w:ascii="Calibri" w:cs="Calibri" w:eastAsia="Calibri" w:hAnsi="Calibri"/>
-                <w:b/>
-                <w:bCs/>
-                <w:color w:val="8A6300"/>
-                <w:sz w:val="18"/>
-                <w:szCs w:val="18"/>
-              </w:rPr>
-              <w:t xml:space="preserve">METADADOS CONFERIDOS</w:t>
-            </w:r>
-          </w:p>
-          <w:p>
-            <w:pPr>
-              <w:spacing w:after="40"/>
-            </w:pPr>
-            <w:r>
-              <w:rPr>
-                <w:rFonts w:ascii="Calibri" w:cs="Calibri" w:eastAsia="Calibri" w:hAnsi="Calibri"/>
-                <w:i/>
-                <w:iCs/>
-                <w:sz w:val="20"/>
-                <w:szCs w:val="20"/>
-              </w:rPr>
-              <w:t xml:space="preserve">Acesso aberto — baixar e ler antes de citar a fórmula.</w:t>
-            </w:r>
-          </w:p>
-        </w:tc>
-      </w:tr>
-      <w:tr>
-        <w:trPr>
-          <w:cantSplit/>
-        </w:trPr>
-        <w:tc>
-          <w:tcPr>
-            <w:tcW w:type="dxa" w:w="2750"/>
-            <w:tcMar>
-              <w:top w:type="dxa" w:w="80"/>
-              <w:left w:type="dxa" w:w="100"/>
-              <w:bottom w:type="dxa" w:w="80"/>
-              <w:right w:type="dxa" w:w="100"/>
-            </w:tcMar>
-          </w:tcPr>
-          <w:p>
-            <w:pPr>
-              <w:spacing w:after="40"/>
-            </w:pPr>
-            <w:r>
-              <w:rPr>
-                <w:rFonts w:ascii="Calibri" w:cs="Calibri" w:eastAsia="Calibri" w:hAnsi="Calibri"/>
-                <w:b/>
-                <w:bCs/>
-                <w:sz w:val="20"/>
-                <w:szCs w:val="20"/>
-              </w:rPr>
-              <w:t xml:space="preserve">Pukelsheim, F. (1994). </w:t>
-            </w:r>
-            <w:r>
-              <w:rPr>
-                <w:rFonts w:ascii="Calibri" w:cs="Calibri" w:eastAsia="Calibri" w:hAnsi="Calibri"/>
-                <w:sz w:val="18"/>
-                <w:szCs w:val="18"/>
-              </w:rPr>
-              <w:t xml:space="preserve">“The Three Sigma Rule”. The American Statistician, 48(2), 88–91.</w:t>
-            </w:r>
-          </w:p>
-        </w:tc>
-        <w:tc>
-          <w:tcPr>
-            <w:tcW w:type="dxa" w:w="2150"/>
-            <w:tcMar>
-              <w:top w:type="dxa" w:w="80"/>
-              <w:left w:type="dxa" w:w="100"/>
-              <w:bottom w:type="dxa" w:w="80"/>
-              <w:right w:type="dxa" w:w="100"/>
-            </w:tcMar>
-          </w:tcPr>
-          <w:p>
-            <w:pPr>
-              <w:spacing w:after="40"/>
-            </w:pPr>
-            <w:hyperlink w:history="1" r:id="rIdobwmlntvnajw_ffyj1b3p">
-              <w:r>
-                <w:rPr>
-                  <w:rStyle w:val="Hyperlink"/>
-                  <w:rFonts w:ascii="Calibri" w:cs="Calibri" w:eastAsia="Calibri" w:hAnsi="Calibri"/>
-                  <w:sz w:val="16"/>
-                  <w:szCs w:val="16"/>
-                </w:rPr>
-                <w:t xml:space="preserve">doi.org/10.1080/00031305.1994.10476030</w:t>
-              </w:r>
-            </w:hyperlink>
-          </w:p>
-        </w:tc>
-        <w:tc>
-          <w:tcPr>
-            <w:tcW w:type="dxa" w:w="2900"/>
-            <w:tcMar>
-              <w:top w:type="dxa" w:w="80"/>
-              <w:left w:type="dxa" w:w="100"/>
-              <w:bottom w:type="dxa" w:w="80"/>
-              <w:right w:type="dxa" w:w="100"/>
-            </w:tcMar>
-          </w:tcPr>
-          <w:p>
-            <w:pPr>
-              <w:spacing w:after="40"/>
-            </w:pPr>
-            <w:r>
-              <w:rPr>
-                <w:rFonts w:ascii="Calibri" w:cs="Calibri" w:eastAsia="Calibri" w:hAnsi="Calibri"/>
-                <w:sz w:val="18"/>
-                <w:szCs w:val="18"/>
-              </w:rPr>
-              <w:t xml:space="preserve">Justificativa do corte de implausibilidade em 3 (D-09).</w:t>
-            </w:r>
-          </w:p>
-        </w:tc>
-        <w:tc>
-          <w:tcPr>
-            <w:tcW w:type="dxa" w:w="1900"/>
-            <w:tcMar>
-              <w:top w:type="dxa" w:w="80"/>
-              <w:left w:type="dxa" w:w="100"/>
-              <w:bottom w:type="dxa" w:w="80"/>
-              <w:right w:type="dxa" w:w="100"/>
-            </w:tcMar>
-          </w:tcPr>
-          <w:p>
-            <w:pPr>
-              <w:spacing w:after="40"/>
-            </w:pPr>
-            <w:r>
-              <w:rPr>
-                <w:rFonts w:ascii="Calibri" w:cs="Calibri" w:eastAsia="Calibri" w:hAnsi="Calibri"/>
-                <w:b/>
-                <w:bCs/>
-                <w:color w:val="8A6300"/>
-                <w:sz w:val="18"/>
-                <w:szCs w:val="18"/>
-              </w:rPr>
-              <w:t xml:space="preserve">METADADOS CONFERIDOS</w:t>
-            </w:r>
-          </w:p>
-        </w:tc>
-      </w:tr>
-      <w:tr>
-        <w:trPr>
-          <w:cantSplit/>
-        </w:trPr>
-        <w:tc>
-          <w:tcPr>
-            <w:tcW w:type="dxa" w:w="2750"/>
-            <w:shd w:fill="F2F2F2" w:color="auto" w:val="clear"/>
-            <w:tcMar>
-              <w:top w:type="dxa" w:w="80"/>
-              <w:left w:type="dxa" w:w="100"/>
-              <w:bottom w:type="dxa" w:w="80"/>
-              <w:right w:type="dxa" w:w="100"/>
-            </w:tcMar>
-          </w:tcPr>
-          <w:p>
-            <w:pPr>
-              <w:spacing w:after="40"/>
-            </w:pPr>
-            <w:r>
-              <w:rPr>
-                <w:rFonts w:ascii="Calibri" w:cs="Calibri" w:eastAsia="Calibri" w:hAnsi="Calibri"/>
-                <w:b/>
-                <w:bCs/>
-                <w:sz w:val="20"/>
-                <w:szCs w:val="20"/>
-              </w:rPr>
-              <w:t xml:space="preserve">Raue, A. et al. (2009). </w:t>
-            </w:r>
-            <w:r>
-              <w:rPr>
-                <w:rFonts w:ascii="Calibri" w:cs="Calibri" w:eastAsia="Calibri" w:hAnsi="Calibri"/>
-                <w:sz w:val="18"/>
-                <w:szCs w:val="18"/>
-              </w:rPr>
-              <w:t xml:space="preserve">“Structural and practical identifiability analysis of partially observed dynamical models by exploiting the profile likelihood”. Bioinformatics, 25(15), 1923–1929.</w:t>
-            </w:r>
-          </w:p>
-        </w:tc>
-        <w:tc>
-          <w:tcPr>
-            <w:tcW w:type="dxa" w:w="2150"/>
-            <w:shd w:fill="F2F2F2" w:color="auto" w:val="clear"/>
-            <w:tcMar>
-              <w:top w:type="dxa" w:w="80"/>
-              <w:left w:type="dxa" w:w="100"/>
-              <w:bottom w:type="dxa" w:w="80"/>
-              <w:right w:type="dxa" w:w="100"/>
-            </w:tcMar>
-          </w:tcPr>
-          <w:p>
-            <w:pPr>
-              <w:spacing w:after="40"/>
-            </w:pPr>
-            <w:hyperlink w:history="1" r:id="rIdsb1edig3elwoeorybp_ua">
+            <w:tcMar>
+              <w:top w:type="dxa" w:w="80"/>
+              <w:left w:type="dxa" w:w="100"/>
+              <w:bottom w:type="dxa" w:w="80"/>
+              <w:right w:type="dxa" w:w="100"/>
+            </w:tcMar>
+          </w:tcPr>
+          <w:p>
+            <w:pPr>
+              <w:spacing w:after="40"/>
+            </w:pPr>
+            <w:hyperlink w:history="1" r:id="rIdcc37m0o3wkdo5iflh0lgd">
               <w:r>
                 <w:rPr>
                   <w:rStyle w:val="Hyperlink"/>
@@ -3609,7 +4333,6 @@
         <w:tc>
           <w:tcPr>
             <w:tcW w:type="dxa" w:w="2900"/>
-            <w:shd w:fill="F2F2F2" w:color="auto" w:val="clear"/>
             <w:tcMar>
               <w:top w:type="dxa" w:w="80"/>
               <w:left w:type="dxa" w:w="100"/>
@@ -3634,7 +4357,6 @@
         <w:tc>
           <w:tcPr>
             <w:tcW w:type="dxa" w:w="1900"/>
-            <w:shd w:fill="F2F2F2" w:color="auto" w:val="clear"/>
             <w:tcMar>
               <w:top w:type="dxa" w:w="80"/>
               <w:left w:type="dxa" w:w="100"/>
@@ -3667,6 +4389,7 @@
         <w:tc>
           <w:tcPr>
             <w:tcW w:type="dxa" w:w="2750"/>
+            <w:shd w:fill="F2F2F2" w:color="auto" w:val="clear"/>
             <w:tcMar>
               <w:top w:type="dxa" w:w="80"/>
               <w:left w:type="dxa" w:w="100"/>
@@ -3701,18 +4424,19 @@
         <w:tc>
           <w:tcPr>
             <w:tcW w:type="dxa" w:w="2150"/>
-            <w:tcMar>
-              <w:top w:type="dxa" w:w="80"/>
-              <w:left w:type="dxa" w:w="100"/>
-              <w:bottom w:type="dxa" w:w="80"/>
-              <w:right w:type="dxa" w:w="100"/>
-            </w:tcMar>
-          </w:tcPr>
-          <w:p>
-            <w:pPr>
-              <w:spacing w:after="40"/>
-            </w:pPr>
-            <w:hyperlink w:history="1" r:id="rIdd3j_qa0pllf7gdngxfvoy">
+            <w:shd w:fill="F2F2F2" w:color="auto" w:val="clear"/>
+            <w:tcMar>
+              <w:top w:type="dxa" w:w="80"/>
+              <w:left w:type="dxa" w:w="100"/>
+              <w:bottom w:type="dxa" w:w="80"/>
+              <w:right w:type="dxa" w:w="100"/>
+            </w:tcMar>
+          </w:tcPr>
+          <w:p>
+            <w:pPr>
+              <w:spacing w:after="40"/>
+            </w:pPr>
+            <w:hyperlink w:history="1" r:id="rIdz2qxq5hti8oro1tvupahv">
               <w:r>
                 <w:rPr>
                   <w:rStyle w:val="Hyperlink"/>
@@ -3728,6 +4452,7 @@
         <w:tc>
           <w:tcPr>
             <w:tcW w:type="dxa" w:w="2900"/>
+            <w:shd w:fill="F2F2F2" w:color="auto" w:val="clear"/>
             <w:tcMar>
               <w:top w:type="dxa" w:w="80"/>
               <w:left w:type="dxa" w:w="100"/>
@@ -3752,6 +4477,7 @@
         <w:tc>
           <w:tcPr>
             <w:tcW w:type="dxa" w:w="1900"/>
+            <w:shd w:fill="F2F2F2" w:color="auto" w:val="clear"/>
             <w:tcMar>
               <w:top w:type="dxa" w:w="80"/>
               <w:left w:type="dxa" w:w="100"/>
@@ -3784,7 +4510,6 @@
         <w:tc>
           <w:tcPr>
             <w:tcW w:type="dxa" w:w="2750"/>
-            <w:shd w:fill="F2F2F2" w:color="auto" w:val="clear"/>
             <w:tcMar>
               <w:top w:type="dxa" w:w="80"/>
               <w:left w:type="dxa" w:w="100"/>
@@ -3819,19 +4544,18 @@
         <w:tc>
           <w:tcPr>
             <w:tcW w:type="dxa" w:w="2150"/>
-            <w:shd w:fill="F2F2F2" w:color="auto" w:val="clear"/>
-            <w:tcMar>
-              <w:top w:type="dxa" w:w="80"/>
-              <w:left w:type="dxa" w:w="100"/>
-              <w:bottom w:type="dxa" w:w="80"/>
-              <w:right w:type="dxa" w:w="100"/>
-            </w:tcMar>
-          </w:tcPr>
-          <w:p>
-            <w:pPr>
-              <w:spacing w:after="40"/>
-            </w:pPr>
-            <w:hyperlink w:history="1" r:id="rId-ycc3s-djt_jgqd5gl-bu">
+            <w:tcMar>
+              <w:top w:type="dxa" w:w="80"/>
+              <w:left w:type="dxa" w:w="100"/>
+              <w:bottom w:type="dxa" w:w="80"/>
+              <w:right w:type="dxa" w:w="100"/>
+            </w:tcMar>
+          </w:tcPr>
+          <w:p>
+            <w:pPr>
+              <w:spacing w:after="40"/>
+            </w:pPr>
+            <w:hyperlink w:history="1" r:id="rIdbpzezpucci1msjlusc43r">
               <w:r>
                 <w:rPr>
                   <w:rStyle w:val="Hyperlink"/>
@@ -3847,7 +4571,6 @@
         <w:tc>
           <w:tcPr>
             <w:tcW w:type="dxa" w:w="2900"/>
-            <w:shd w:fill="F2F2F2" w:color="auto" w:val="clear"/>
             <w:tcMar>
               <w:top w:type="dxa" w:w="80"/>
               <w:left w:type="dxa" w:w="100"/>
@@ -3872,7 +4595,6 @@
         <w:tc>
           <w:tcPr>
             <w:tcW w:type="dxa" w:w="1900"/>
-            <w:shd w:fill="F2F2F2" w:color="auto" w:val="clear"/>
             <w:tcMar>
               <w:top w:type="dxa" w:w="80"/>
               <w:left w:type="dxa" w:w="100"/>
@@ -4228,15 +4950,15 @@
                 <w:sz w:val="20"/>
                 <w:szCs w:val="20"/>
               </w:rPr>
-              <w:t xml:space="preserve">Love, P. E. D.; Li, H. (2000). </w:t>
-            </w:r>
-            <w:r>
-              <w:rPr>
-                <w:rFonts w:ascii="Calibri" w:cs="Calibri" w:eastAsia="Calibri" w:hAnsi="Calibri"/>
-                <w:sz w:val="18"/>
-                <w:szCs w:val="18"/>
-              </w:rPr>
-              <w:t xml:space="preserve">“Quantifying the causes and costs of rework in construction”. Construction Management and Economics, 18(4), 479–490.</w:t>
+              <w:t xml:space="preserve">HEART — Human Error Assessment and Reduction Technique.</w:t>
+            </w:r>
+            <w:r>
+              <w:rPr>
+                <w:rFonts w:ascii="Calibri" w:cs="Calibri" w:eastAsia="Calibri" w:hAnsi="Calibri"/>
+                <w:sz w:val="18"/>
+                <w:szCs w:val="18"/>
+              </w:rPr>
+              <w:t xml:space="preserve"> Williams, J. C. (origem, 1986) e consolidações posteriores (Williams &amp; Bell, 2017/2023). Validação: Kirwan, B. et al. (1997).</w:t>
             </w:r>
           </w:p>
         </w:tc>
@@ -4255,17 +4977,14 @@
             <w:pPr>
               <w:spacing w:after="40"/>
             </w:pPr>
-            <w:hyperlink w:history="1" r:id="rIdimeoaaatjm7yzl82rltuv">
-              <w:r>
-                <w:rPr>
-                  <w:rStyle w:val="Hyperlink"/>
-                  <w:rFonts w:ascii="Calibri" w:cs="Calibri" w:eastAsia="Calibri" w:hAnsi="Calibri"/>
-                  <w:sz w:val="16"/>
-                  <w:szCs w:val="16"/>
-                </w:rPr>
-                <w:t xml:space="preserve">doi.org/10.1080/01446190050024897</w:t>
-              </w:r>
-            </w:hyperlink>
+            <w:r>
+              <w:rPr>
+                <w:rFonts w:ascii="Calibri" w:cs="Calibri" w:eastAsia="Calibri" w:hAnsi="Calibri"/>
+                <w:sz w:val="18"/>
+                <w:szCs w:val="18"/>
+              </w:rPr>
+              <w:t xml:space="preserve">Procurar em Safety and Reliability (Taylor &amp; Francis) e Applied Ergonomics. A tabela de tipos genéricos precisa vir da fonte primária.</w:t>
+            </w:r>
           </w:p>
         </w:tc>
         <w:tc>
@@ -4289,7 +5008,7 @@
                 <w:sz w:val="18"/>
                 <w:szCs w:val="18"/>
               </w:rPr>
-              <w:t xml:space="preserve">Mesma função de D-07: restrição sobre o produto.</w:t>
+              <w:t xml:space="preserve">Restrição externa sobre F_ancora (D-07). Estrutura: confiabilidade nominal por tipo genérico × multiplicadores de condições produtoras de erro.</w:t>
             </w:r>
           </w:p>
         </w:tc>
@@ -4317,7 +5036,7 @@
                 <w:sz w:val="18"/>
                 <w:szCs w:val="18"/>
               </w:rPr>
-              <w:t xml:space="preserve">METADADOS APENAS</w:t>
+              <w:t xml:space="preserve">TABELA NÃO VERIFICADA</w:t>
             </w:r>
           </w:p>
           <w:p>
@@ -4332,7 +5051,7 @@
                 <w:sz w:val="20"/>
                 <w:szCs w:val="20"/>
               </w:rPr>
-              <w:t xml:space="preserve">Conteúdo não lido.</w:t>
+              <w:t xml:space="preserve">Verifiquei só a ESTRUTURA e alguns multiplicadores (falta de tempo ×11; situação infrequente ×17; sobrecarga de canal ×6) em documento de aplicação, não na fonte primária.</w:t>
             </w:r>
           </w:p>
         </w:tc>
@@ -4363,15 +5082,15 @@
                 <w:sz w:val="20"/>
                 <w:szCs w:val="20"/>
               </w:rPr>
-              <w:t xml:space="preserve">HEART — Human Error Assessment and Reduction Technique.</w:t>
-            </w:r>
-            <w:r>
-              <w:rPr>
-                <w:rFonts w:ascii="Calibri" w:cs="Calibri" w:eastAsia="Calibri" w:hAnsi="Calibri"/>
-                <w:sz w:val="18"/>
-                <w:szCs w:val="18"/>
-              </w:rPr>
-              <w:t xml:space="preserve"> Williams, J. C. (origem, 1986) e consolidações posteriores (Williams &amp; Bell, 2017/2023). Validação: Kirwan, B. et al. (1997).</w:t>
+              <w:t xml:space="preserve">Soluções ótimas / melhores conhecidas do PSPLIB para o conjunto J60.</w:t>
+            </w:r>
+            <w:r>
+              <w:rPr>
+                <w:rFonts w:ascii="Calibri" w:cs="Calibri" w:eastAsia="Calibri" w:hAnsi="Calibri"/>
+                <w:sz w:val="18"/>
+                <w:szCs w:val="18"/>
+              </w:rPr>
+              <w:t xml:space="preserve"> O PSPLIB em si já está catalogado no 04_FONTES (Kolisch &amp; Sprecher, 1995/1996/1997); o que falta conferir é especificamente a publicação dos ótimos.</w:t>
             </w:r>
           </w:p>
         </w:tc>
@@ -4389,269 +5108,7 @@
             <w:pPr>
               <w:spacing w:after="40"/>
             </w:pPr>
-            <w:r>
-              <w:rPr>
-                <w:rFonts w:ascii="Calibri" w:cs="Calibri" w:eastAsia="Calibri" w:hAnsi="Calibri"/>
-                <w:sz w:val="18"/>
-                <w:szCs w:val="18"/>
-              </w:rPr>
-              <w:t xml:space="preserve">Procurar em Safety and Reliability (Taylor &amp; Francis) e Applied Ergonomics. A tabela de tipos genéricos precisa vir da fonte primária.</w:t>
-            </w:r>
-          </w:p>
-        </w:tc>
-        <w:tc>
-          <w:tcPr>
-            <w:tcW w:type="dxa" w:w="2900"/>
-            <w:tcMar>
-              <w:top w:type="dxa" w:w="80"/>
-              <w:left w:type="dxa" w:w="100"/>
-              <w:bottom w:type="dxa" w:w="80"/>
-              <w:right w:type="dxa" w:w="100"/>
-            </w:tcMar>
-          </w:tcPr>
-          <w:p>
-            <w:pPr>
-              <w:spacing w:after="40"/>
-            </w:pPr>
-            <w:r>
-              <w:rPr>
-                <w:rFonts w:ascii="Calibri" w:cs="Calibri" w:eastAsia="Calibri" w:hAnsi="Calibri"/>
-                <w:sz w:val="18"/>
-                <w:szCs w:val="18"/>
-              </w:rPr>
-              <w:t xml:space="preserve">Restrição externa sobre F_ancora (D-07). Estrutura: confiabilidade nominal por tipo genérico × multiplicadores de condições produtoras de erro.</w:t>
-            </w:r>
-          </w:p>
-        </w:tc>
-        <w:tc>
-          <w:tcPr>
-            <w:tcW w:type="dxa" w:w="1900"/>
-            <w:tcMar>
-              <w:top w:type="dxa" w:w="80"/>
-              <w:left w:type="dxa" w:w="100"/>
-              <w:bottom w:type="dxa" w:w="80"/>
-              <w:right w:type="dxa" w:w="100"/>
-            </w:tcMar>
-          </w:tcPr>
-          <w:p>
-            <w:pPr>
-              <w:spacing w:after="40"/>
-            </w:pPr>
-            <w:r>
-              <w:rPr>
-                <w:rFonts w:ascii="Calibri" w:cs="Calibri" w:eastAsia="Calibri" w:hAnsi="Calibri"/>
-                <w:b/>
-                <w:bCs/>
-                <w:color w:val="9C2B1B"/>
-                <w:sz w:val="18"/>
-                <w:szCs w:val="18"/>
-              </w:rPr>
-              <w:t xml:space="preserve">TABELA NÃO VERIFICADA</w:t>
-            </w:r>
-          </w:p>
-          <w:p>
-            <w:pPr>
-              <w:spacing w:after="40"/>
-            </w:pPr>
-            <w:r>
-              <w:rPr>
-                <w:rFonts w:ascii="Calibri" w:cs="Calibri" w:eastAsia="Calibri" w:hAnsi="Calibri"/>
-                <w:i/>
-                <w:iCs/>
-                <w:sz w:val="20"/>
-                <w:szCs w:val="20"/>
-              </w:rPr>
-              <w:t xml:space="preserve">Verifiquei só a ESTRUTURA e alguns multiplicadores (falta de tempo ×11; situação infrequente ×17; sobrecarga de canal ×6) em documento de aplicação, não na fonte primária.</w:t>
-            </w:r>
-          </w:p>
-        </w:tc>
-      </w:tr>
-      <w:tr>
-        <w:trPr>
-          <w:cantSplit/>
-        </w:trPr>
-        <w:tc>
-          <w:tcPr>
-            <w:tcW w:type="dxa" w:w="2750"/>
-            <w:shd w:fill="F2F2F2" w:color="auto" w:val="clear"/>
-            <w:tcMar>
-              <w:top w:type="dxa" w:w="80"/>
-              <w:left w:type="dxa" w:w="100"/>
-              <w:bottom w:type="dxa" w:w="80"/>
-              <w:right w:type="dxa" w:w="100"/>
-            </w:tcMar>
-          </w:tcPr>
-          <w:p>
-            <w:pPr>
-              <w:spacing w:after="40"/>
-            </w:pPr>
-            <w:r>
-              <w:rPr>
-                <w:rFonts w:ascii="Calibri" w:cs="Calibri" w:eastAsia="Calibri" w:hAnsi="Calibri"/>
-                <w:b/>
-                <w:bCs/>
-                <w:sz w:val="20"/>
-                <w:szCs w:val="20"/>
-              </w:rPr>
-              <w:t xml:space="preserve">Boehm, B.; Basili, V. </w:t>
-            </w:r>
-            <w:r>
-              <w:rPr>
-                <w:rFonts w:ascii="Calibri" w:cs="Calibri" w:eastAsia="Calibri" w:hAnsi="Calibri"/>
-                <w:sz w:val="18"/>
-                <w:szCs w:val="18"/>
-              </w:rPr>
-              <w:t xml:space="preserve">“Software Defect Reduction Top 10 List” (IEEE Computer, 2001) — e a afirmação de 40–50% do esforço de software em retrabalho evitável.</w:t>
-            </w:r>
-          </w:p>
-        </w:tc>
-        <w:tc>
-          <w:tcPr>
-            <w:tcW w:type="dxa" w:w="2150"/>
-            <w:shd w:fill="F2F2F2" w:color="auto" w:val="clear"/>
-            <w:tcMar>
-              <w:top w:type="dxa" w:w="80"/>
-              <w:left w:type="dxa" w:w="100"/>
-              <w:bottom w:type="dxa" w:w="80"/>
-              <w:right w:type="dxa" w:w="100"/>
-            </w:tcMar>
-          </w:tcPr>
-          <w:p>
-            <w:pPr>
-              <w:spacing w:after="40"/>
-            </w:pPr>
-            <w:r>
-              <w:rPr>
-                <w:rFonts w:ascii="Calibri" w:cs="Calibri" w:eastAsia="Calibri" w:hAnsi="Calibri"/>
-                <w:sz w:val="18"/>
-                <w:szCs w:val="18"/>
-              </w:rPr>
-              <w:t xml:space="preserve">Chegou pela sua contraposição via GPT. Procurar em IEEE Xplore.</w:t>
-            </w:r>
-          </w:p>
-        </w:tc>
-        <w:tc>
-          <w:tcPr>
-            <w:tcW w:type="dxa" w:w="2900"/>
-            <w:shd w:fill="F2F2F2" w:color="auto" w:val="clear"/>
-            <w:tcMar>
-              <w:top w:type="dxa" w:w="80"/>
-              <w:left w:type="dxa" w:w="100"/>
-              <w:bottom w:type="dxa" w:w="80"/>
-              <w:right w:type="dxa" w:w="100"/>
-            </w:tcMar>
-          </w:tcPr>
-          <w:p>
-            <w:pPr>
-              <w:spacing w:after="40"/>
-            </w:pPr>
-            <w:r>
-              <w:rPr>
-                <w:rFonts w:ascii="Calibri" w:cs="Calibri" w:eastAsia="Calibri" w:hAnsi="Calibri"/>
-                <w:sz w:val="18"/>
-                <w:szCs w:val="18"/>
-              </w:rPr>
-              <w:t xml:space="preserve">Contraponto ao meu exagero sobre os 46% (D-08).</w:t>
-            </w:r>
-          </w:p>
-        </w:tc>
-        <w:tc>
-          <w:tcPr>
-            <w:tcW w:type="dxa" w:w="1900"/>
-            <w:shd w:fill="F2F2F2" w:color="auto" w:val="clear"/>
-            <w:tcMar>
-              <w:top w:type="dxa" w:w="80"/>
-              <w:left w:type="dxa" w:w="100"/>
-              <w:bottom w:type="dxa" w:w="80"/>
-              <w:right w:type="dxa" w:w="100"/>
-            </w:tcMar>
-          </w:tcPr>
-          <w:p>
-            <w:pPr>
-              <w:spacing w:after="40"/>
-            </w:pPr>
-            <w:r>
-              <w:rPr>
-                <w:rFonts w:ascii="Calibri" w:cs="Calibri" w:eastAsia="Calibri" w:hAnsi="Calibri"/>
-                <w:b/>
-                <w:bCs/>
-                <w:color w:val="9C2B1B"/>
-                <w:sz w:val="18"/>
-                <w:szCs w:val="18"/>
-              </w:rPr>
-              <w:t xml:space="preserve">NÃO VERIFICADA</w:t>
-            </w:r>
-          </w:p>
-          <w:p>
-            <w:pPr>
-              <w:spacing w:after="40"/>
-            </w:pPr>
-            <w:r>
-              <w:rPr>
-                <w:rFonts w:ascii="Calibri" w:cs="Calibri" w:eastAsia="Calibri" w:hAnsi="Calibri"/>
-                <w:i/>
-                <w:iCs/>
-                <w:sz w:val="20"/>
-                <w:szCs w:val="20"/>
-              </w:rPr>
-              <w:t xml:space="preserve">Mesmo verificada, reintroduz empréstimo entre domínios. Ver D-08.</w:t>
-            </w:r>
-          </w:p>
-        </w:tc>
-      </w:tr>
-      <w:tr>
-        <w:trPr>
-          <w:cantSplit/>
-        </w:trPr>
-        <w:tc>
-          <w:tcPr>
-            <w:tcW w:type="dxa" w:w="2750"/>
-            <w:tcMar>
-              <w:top w:type="dxa" w:w="80"/>
-              <w:left w:type="dxa" w:w="100"/>
-              <w:bottom w:type="dxa" w:w="80"/>
-              <w:right w:type="dxa" w:w="100"/>
-            </w:tcMar>
-          </w:tcPr>
-          <w:p>
-            <w:pPr>
-              <w:spacing w:after="40"/>
-            </w:pPr>
-            <w:r>
-              <w:rPr>
-                <w:rFonts w:ascii="Calibri" w:cs="Calibri" w:eastAsia="Calibri" w:hAnsi="Calibri"/>
-                <w:b/>
-                <w:bCs/>
-                <w:sz w:val="20"/>
-                <w:szCs w:val="20"/>
-              </w:rPr>
-              <w:t xml:space="preserve">PSPLIB — Kolisch, R.; Sprecher, A. </w:t>
-            </w:r>
-            <w:r>
-              <w:rPr>
-                <w:rFonts w:ascii="Calibri" w:cs="Calibri" w:eastAsia="Calibri" w:hAnsi="Calibri"/>
-                <w:sz w:val="18"/>
-                <w:szCs w:val="18"/>
-              </w:rPr>
-              <w:t xml:space="preserve">“PSPLIB – A project scheduling problem library”. European Journal of Operational Research (1997).</w:t>
-            </w:r>
-          </w:p>
-        </w:tc>
-        <w:tc>
-          <w:tcPr>
-            <w:tcW w:type="dxa" w:w="2150"/>
-            <w:tcMar>
-              <w:top w:type="dxa" w:w="80"/>
-              <w:left w:type="dxa" w:w="100"/>
-              <w:bottom w:type="dxa" w:w="80"/>
-              <w:right w:type="dxa" w:w="100"/>
-            </w:tcMar>
-          </w:tcPr>
-          <w:p>
-            <w:pPr>
-              <w:spacing w:after="40"/>
-            </w:pPr>
-            <w:hyperlink w:history="1" r:id="rIdj4ktsjojr5tulfagbwcn8">
+            <w:hyperlink w:history="1" r:id="rId3zla-eqs8zw6h2k5yrkmi">
               <w:r>
                 <w:rPr>
                   <w:rStyle w:val="Hyperlink"/>
@@ -4726,7 +5183,7 @@
                 <w:sz w:val="20"/>
                 <w:szCs w:val="20"/>
               </w:rPr>
-              <w:t xml:space="preserve">A existência de ótimos publicados para J60 é plausível e amplamente sabida, mas não conferida.</w:t>
+              <w:t xml:space="preserve">Plausível e amplamente sabido, mas não conferido.</w:t>
             </w:r>
           </w:p>
         </w:tc>
@@ -4758,7 +5215,15 @@
                 <w:sz w:val="20"/>
                 <w:szCs w:val="20"/>
               </w:rPr>
-              <w:t xml:space="preserve">Setayesh et al. (2022); Levine et al. (2024); Zhang et al. (2012); Kam et al. (2025); Love (2026); Zou et al. (2021); Serva et al. (2005); Li et al. (2019); Bjorvatn &amp; Wald (2020); Kalluri (2026).</w:t>
+              <w:t xml:space="preserve">Setayesh et al. (2022); Levine et al. (2024); Zhang et al. (2012); Kam et al. (2025); Zou et al. (2021); Serva et al. (2005); Li et al. (2019); Bjorvatn &amp; Wald (2020); Kalluri (2026).</w:t>
+            </w:r>
+            <w:r>
+              <w:rPr>
+                <w:rFonts w:ascii="Calibri" w:cs="Calibri" w:eastAsia="Calibri" w:hAnsi="Calibri"/>
+                <w:sz w:val="18"/>
+                <w:szCs w:val="18"/>
+              </w:rPr>
+              <w:t xml:space="preserve"> (Love, 2026, saiu desta lista: já está verificada no 04_FONTES.)</w:t>
             </w:r>
           </w:p>
         </w:tc>
@@ -5915,6 +6380,175 @@
           </w:p>
         </w:tc>
       </w:tr>
+      <w:tr>
+        <w:trPr>
+          <w:cantSplit/>
+        </w:trPr>
+        <w:tc>
+          <w:tcPr>
+            <w:tcW w:type="dxa" w:w="2400"/>
+            <w:tcMar>
+              <w:top w:type="dxa" w:w="80"/>
+              <w:left w:type="dxa" w:w="100"/>
+              <w:bottom w:type="dxa" w:w="80"/>
+              <w:right w:type="dxa" w:w="100"/>
+            </w:tcMar>
+          </w:tcPr>
+          <w:p>
+            <w:pPr>
+              <w:spacing w:after="40"/>
+            </w:pPr>
+            <w:r>
+              <w:rPr>
+                <w:rFonts w:ascii="Calibri" w:cs="Calibri" w:eastAsia="Calibri" w:hAnsi="Calibri"/>
+                <w:b/>
+                <w:bCs/>
+                <w:sz w:val="20"/>
+                <w:szCs w:val="20"/>
+              </w:rPr>
+              <w:t xml:space="preserve">A-11 · GRAVE — A inversão de E_total era artefato da convenção de TL</w:t>
+            </w:r>
+            <w:r>
+              <w:rPr>
+                <w:rFonts w:ascii="Calibri" w:cs="Calibri" w:eastAsia="Calibri" w:hAnsi="Calibri"/>
+                <w:sz w:val="18"/>
+                <w:szCs w:val="18"/>
+              </w:rPr>
+              <w:t xml:space="preserve"> (16–17/09/2026)</w:t>
+            </w:r>
+          </w:p>
+        </w:tc>
+        <w:tc>
+          <w:tcPr>
+            <w:tcW w:type="dxa" w:w="4300"/>
+            <w:tcMar>
+              <w:top w:type="dxa" w:w="80"/>
+              <w:left w:type="dxa" w:w="100"/>
+              <w:bottom w:type="dxa" w:w="80"/>
+              <w:right w:type="dxa" w:w="100"/>
+            </w:tcMar>
+          </w:tcPr>
+          <w:p>
+            <w:pPr>
+              <w:spacing w:after="40"/>
+            </w:pPr>
+            <w:r>
+              <w:rPr>
+                <w:rFonts w:ascii="Calibri" w:cs="Calibri" w:eastAsia="Calibri" w:hAnsi="Calibri"/>
+                <w:sz w:val="18"/>
+                <w:szCs w:val="18"/>
+              </w:rPr>
+              <w:t xml:space="preserve">E_total = TW/(TW+TL+TU+TR). O código contava TL += 1 por ajuda bem-sucedida; a equação (3) de Crowder (p. 1431) é TL += 0,5·ΔC_r, cerca de 9,5× menor com ΔC ≈ 0,21. Teste discriminante: o contraste passa de −0,050845 para +0,051973 entre as duas convenções. Previsão de mesa feita antes da rodada: +0,106; deslocamento observado: +0,102818.</w:t>
+            </w:r>
+          </w:p>
+        </w:tc>
+        <w:tc>
+          <w:tcPr>
+            <w:tcW w:type="dxa" w:w="3000"/>
+            <w:tcMar>
+              <w:top w:type="dxa" w:w="80"/>
+              <w:left w:type="dxa" w:w="100"/>
+              <w:bottom w:type="dxa" w:w="80"/>
+              <w:right w:type="dxa" w:w="100"/>
+            </w:tcMar>
+          </w:tcPr>
+          <w:p>
+            <w:pPr>
+              <w:spacing w:after="40"/>
+            </w:pPr>
+            <w:r>
+              <w:rPr>
+                <w:rFonts w:ascii="Calibri" w:cs="Calibri" w:eastAsia="Calibri" w:hAnsi="Calibri"/>
+                <w:sz w:val="18"/>
+                <w:szCs w:val="18"/>
+              </w:rPr>
+              <w:t xml:space="preserve">CONFIRMADO e resolvido. Ver D-14. O achado de governança sobre E_total foi retirado; a convenção passou a ser alternativa varrida em vez de escolha implícita.</w:t>
+            </w:r>
+          </w:p>
+        </w:tc>
+      </w:tr>
+      <w:tr>
+        <w:trPr>
+          <w:cantSplit/>
+        </w:trPr>
+        <w:tc>
+          <w:tcPr>
+            <w:tcW w:type="dxa" w:w="2400"/>
+            <w:shd w:fill="F2F2F2" w:color="auto" w:val="clear"/>
+            <w:tcMar>
+              <w:top w:type="dxa" w:w="80"/>
+              <w:left w:type="dxa" w:w="100"/>
+              <w:bottom w:type="dxa" w:w="80"/>
+              <w:right w:type="dxa" w:w="100"/>
+            </w:tcMar>
+          </w:tcPr>
+          <w:p>
+            <w:pPr>
+              <w:spacing w:after="40"/>
+            </w:pPr>
+            <w:r>
+              <w:rPr>
+                <w:rFonts w:ascii="Calibri" w:cs="Calibri" w:eastAsia="Calibri" w:hAnsi="Calibri"/>
+                <w:b/>
+                <w:bCs/>
+                <w:sz w:val="20"/>
+                <w:szCs w:val="20"/>
+              </w:rPr>
+              <w:t xml:space="preserve">A-12 · MENOR — Escala da fórmula de competência no braço legado</w:t>
+            </w:r>
+          </w:p>
+        </w:tc>
+        <w:tc>
+          <w:tcPr>
+            <w:tcW w:type="dxa" w:w="4300"/>
+            <w:shd w:fill="F2F2F2" w:color="auto" w:val="clear"/>
+            <w:tcMar>
+              <w:top w:type="dxa" w:w="80"/>
+              <w:left w:type="dxa" w:w="100"/>
+              <w:bottom w:type="dxa" w:w="80"/>
+              <w:right w:type="dxa" w:w="100"/>
+            </w:tcMar>
+          </w:tcPr>
+          <w:p>
+            <w:pPr>
+              <w:spacing w:after="40"/>
+            </w:pPr>
+            <w:r>
+              <w:rPr>
+                <w:rFonts w:ascii="Calibri" w:cs="Calibri" w:eastAsia="Calibri" w:hAnsi="Calibri"/>
+                <w:sz w:val="18"/>
+                <w:szCs w:val="18"/>
+              </w:rPr>
+              <w:t xml:space="preserve">O caminho de ajuda legado aplica (15+3(C_k−C_a))/100 com competências normalizadas 0–1 numa fórmula calibrada para 0–5, sem dividir por 5: +0,162 contra +0,042 do caminho correto. Na escala errada a constante 15 domina 3·(C_k−C_a)=1,2, então o incremento é quase fixo e o mecanismo “aprender mais com quem é mais competente” fica desligado. O teto é 0,98 em vez da dificuldade da subtarefa (Eq. 2).</w:t>
+            </w:r>
+          </w:p>
+        </w:tc>
+        <w:tc>
+          <w:tcPr>
+            <w:tcW w:type="dxa" w:w="3000"/>
+            <w:shd w:fill="F2F2F2" w:color="auto" w:val="clear"/>
+            <w:tcMar>
+              <w:top w:type="dxa" w:w="80"/>
+              <w:left w:type="dxa" w:w="100"/>
+              <w:bottom w:type="dxa" w:w="80"/>
+              <w:right w:type="dxa" w:w="100"/>
+            </w:tcMar>
+          </w:tcPr>
+          <w:p>
+            <w:pPr>
+              <w:spacing w:after="40"/>
+            </w:pPr>
+            <w:r>
+              <w:rPr>
+                <w:rFonts w:ascii="Calibri" w:cs="Calibri" w:eastAsia="Calibri" w:hAnsi="Calibri"/>
+                <w:sz w:val="18"/>
+                <w:szCs w:val="18"/>
+              </w:rPr>
+              <w:t xml:space="preserve">Preservação deliberada — sustenta o controle exato de identidade. Não recodificar. Declarado na leitura da tabela incremental, porque o degrau de comunicação muda protocolo E escala ao mesmo tempo.</w:t>
+            </w:r>
+          </w:p>
+        </w:tc>
+      </w:tr>
     </w:tbl>
     <w:p>
       <w:r>
@@ -6283,6 +6917,233 @@
           <w:sz w:val="21"/>
           <w:szCs w:val="21"/>
         </w:rPr>
+        <w:t xml:space="preserve">R-07 — “Reset da confiança por subtarefa” (D-01)</w:t>
+      </w:r>
+    </w:p>
+    <w:p>
+      <w:pPr>
+        <w:spacing w:after="90"/>
+        <w:ind w:left="200"/>
+      </w:pPr>
+      <w:r>
+        <w:rPr>
+          <w:rFonts w:ascii="Calibri" w:cs="Calibri" w:eastAsia="Calibri" w:hAnsi="Calibri"/>
+          <w:b/>
+          <w:bCs/>
+          <w:color w:val="9B2C5E"/>
+          <w:sz w:val="20"/>
+          <w:szCs w:val="20"/>
+        </w:rPr>
+        <w:t xml:space="preserve">O que eu escrevi:  </w:t>
+      </w:r>
+      <w:r>
+        <w:rPr>
+          <w:rFonts w:ascii="Calibri" w:cs="Calibri" w:eastAsia="Calibri" w:hAnsi="Calibri"/>
+          <w:sz w:val="20"/>
+          <w:szCs w:val="20"/>
+        </w:rPr>
+        <w:t xml:space="preserve">no campo de decisão do D-01, “reset da confiança por subtarefa”.</w:t>
+      </w:r>
+    </w:p>
+    <w:p>
+      <w:pPr>
+        <w:spacing w:after="90"/>
+        <w:ind w:left="200"/>
+      </w:pPr>
+      <w:r>
+        <w:rPr>
+          <w:rFonts w:ascii="Calibri" w:cs="Calibri" w:eastAsia="Calibri" w:hAnsi="Calibri"/>
+          <w:b/>
+          <w:bCs/>
+          <w:color w:val="9B2C5E"/>
+          <w:sz w:val="20"/>
+          <w:szCs w:val="20"/>
+        </w:rPr>
+        <w:t xml:space="preserve">Por que está errado:  </w:t>
+      </w:r>
+      <w:r>
+        <w:rPr>
+          <w:rFonts w:ascii="Calibri" w:cs="Calibri" w:eastAsia="Calibri" w:hAnsi="Calibri"/>
+          <w:sz w:val="20"/>
+          <w:szCs w:val="20"/>
+        </w:rPr>
+        <w:t xml:space="preserve">o artigo de Crowder, p. 1431, logo abaixo da equação (2), diz o contrário, sobre competência: “Note that although a DesignerAgent's competency value may increase during a subtask, once completed, this value reverts to its originally inputted level for the next subtask.” É a COMPETÊNCIA que reinicia. A confiança não tem reset em Crowder — a equação (4) não prevê nenhum.</w:t>
+      </w:r>
+    </w:p>
+    <w:p>
+      <w:pPr>
+        <w:spacing w:after="90"/>
+        <w:ind w:left="200"/>
+      </w:pPr>
+      <w:r>
+        <w:rPr>
+          <w:rFonts w:ascii="Calibri" w:cs="Calibri" w:eastAsia="Calibri" w:hAnsi="Calibri"/>
+          <w:b/>
+          <w:bCs/>
+          <w:color w:val="9B2C5E"/>
+          <w:sz w:val="20"/>
+          <w:szCs w:val="20"/>
+        </w:rPr>
+        <w:t xml:space="preserve">Como foi pego:  </w:t>
+      </w:r>
+      <w:r>
+        <w:rPr>
+          <w:rFonts w:ascii="Calibri" w:cs="Calibri" w:eastAsia="Calibri" w:hAnsi="Calibri"/>
+          <w:sz w:val="20"/>
+          <w:szCs w:val="20"/>
+        </w:rPr>
+        <w:t xml:space="preserve">pelo autor (Codex), no parecer 19, indo à fonte primária em vez de seguir o revisor. O meu próprio documento se contradizia: o campo de condições de contorno do mesmo D-01 já dizia corretamente “a competência volta ao valor inicial”. Corrigido aqui e no código, que implementa reset de competência e nenhum de confiança.</w:t>
+      </w:r>
+    </w:p>
+    <w:p>
+      <w:pPr>
+        <w:pStyle w:val="Heading3"/>
+        <w:spacing w:after="100" w:before="220"/>
+      </w:pPr>
+      <w:r>
+        <w:rPr>
+          <w:rFonts w:ascii="Calibri" w:cs="Calibri" w:eastAsia="Calibri" w:hAnsi="Calibri"/>
+          <w:b/>
+          <w:bCs/>
+          <w:color w:val="333333"/>
+          <w:sz w:val="21"/>
+          <w:szCs w:val="21"/>
+        </w:rPr>
+        <w:t xml:space="preserve">R-06 — “Falta um comparador na mesma unidade”</w:t>
+      </w:r>
+    </w:p>
+    <w:p>
+      <w:pPr>
+        <w:spacing w:after="90"/>
+        <w:ind w:left="200"/>
+      </w:pPr>
+      <w:r>
+        <w:rPr>
+          <w:rFonts w:ascii="Calibri" w:cs="Calibri" w:eastAsia="Calibri" w:hAnsi="Calibri"/>
+          <w:b/>
+          <w:bCs/>
+          <w:color w:val="9B2C5E"/>
+          <w:sz w:val="20"/>
+          <w:szCs w:val="20"/>
+        </w:rPr>
+        <w:t xml:space="preserve">O que eu disse:  </w:t>
+      </w:r>
+      <w:r>
+        <w:rPr>
+          <w:rFonts w:ascii="Calibri" w:cs="Calibri" w:eastAsia="Calibri" w:hAnsi="Calibri"/>
+          <w:sz w:val="20"/>
+          <w:szCs w:val="20"/>
+        </w:rPr>
+        <w:t xml:space="preserve">que os 46% de retrabalho do modelo não eram nem defensáveis nem refutáveis por falta de um comparador na mesma unidade, e que o primeiro gargalo do trabalho era construir esse comparador.</w:t>
+      </w:r>
+    </w:p>
+    <w:p>
+      <w:pPr>
+        <w:spacing w:after="90"/>
+        <w:ind w:left="200"/>
+      </w:pPr>
+      <w:r>
+        <w:rPr>
+          <w:rFonts w:ascii="Calibri" w:cs="Calibri" w:eastAsia="Calibri" w:hAnsi="Calibri"/>
+          <w:b/>
+          <w:bCs/>
+          <w:color w:val="9B2C5E"/>
+          <w:sz w:val="20"/>
+          <w:szCs w:val="20"/>
+        </w:rPr>
+        <w:t xml:space="preserve">Por que está errado:  </w:t>
+      </w:r>
+      <w:r>
+        <w:rPr>
+          <w:rFonts w:ascii="Calibri" w:cs="Calibri" w:eastAsia="Calibri" w:hAnsi="Calibri"/>
+          <w:sz w:val="20"/>
+          <w:szCs w:val="20"/>
+        </w:rPr>
+        <w:t xml:space="preserve">o comparador existe e já estava catalogado no próprio repositório. O 04_FONTES.md registra Boehm &amp; Basili (2001) como verificada, com link que abre, e anota explicitamente que ela mede ESFORÇO e que é “a única referência na mesma unidade da saída do modelo”. Eu afirmei uma ausência sem ter lido o arquivo de fontes do trabalho que estava revisando.</w:t>
+      </w:r>
+    </w:p>
+    <w:p>
+      <w:pPr>
+        <w:spacing w:after="90"/>
+        <w:ind w:left="200"/>
+      </w:pPr>
+      <w:r>
+        <w:rPr>
+          <w:rFonts w:ascii="Calibri" w:cs="Calibri" w:eastAsia="Calibri" w:hAnsi="Calibri"/>
+          <w:b/>
+          <w:bCs/>
+          <w:color w:val="9B2C5E"/>
+          <w:sz w:val="20"/>
+          <w:szCs w:val="20"/>
+        </w:rPr>
+        <w:t xml:space="preserve">Posição corrigida:  </w:t>
+      </w:r>
+      <w:r>
+        <w:rPr>
+          <w:rFonts w:ascii="Calibri" w:cs="Calibri" w:eastAsia="Calibri" w:hAnsi="Calibri"/>
+          <w:sz w:val="20"/>
+          <w:szCs w:val="20"/>
+        </w:rPr>
+        <w:t xml:space="preserve">a unidade bate; o que não bate é o domínio (software contra projeto de engenharia genérico). G-01 muda de natureza — ver D-08 e seção 5.</w:t>
+      </w:r>
+    </w:p>
+    <w:p>
+      <w:pPr>
+        <w:spacing w:after="90"/>
+        <w:ind w:left="200"/>
+      </w:pPr>
+      <w:r>
+        <w:rPr>
+          <w:rFonts w:ascii="Calibri" w:cs="Calibri" w:eastAsia="Calibri" w:hAnsi="Calibri"/>
+          <w:b/>
+          <w:bCs/>
+          <w:color w:val="9B2C5E"/>
+          <w:sz w:val="20"/>
+          <w:szCs w:val="20"/>
+        </w:rPr>
+        <w:t xml:space="preserve">Lição de processo, não só de conteúdo:  </w:t>
+      </w:r>
+      <w:r>
+        <w:rPr>
+          <w:rFonts w:ascii="Calibri" w:cs="Calibri" w:eastAsia="Calibri" w:hAnsi="Calibri"/>
+          <w:sz w:val="20"/>
+          <w:szCs w:val="20"/>
+        </w:rPr>
+        <w:t xml:space="preserve">essa retratação só apareceu porque os arquivos do repositório foram finalmente lidos. Um revisor independente que não lê o registro de fontes do trabalho </w:t>
+      </w:r>
+      <w:r>
+        <w:rPr>
+          <w:rFonts w:ascii="Calibri" w:cs="Calibri" w:eastAsia="Calibri" w:hAnsi="Calibri"/>
+          <w:b/>
+          <w:bCs/>
+          <w:sz w:val="20"/>
+          <w:szCs w:val="20"/>
+        </w:rPr>
+        <w:t xml:space="preserve">inventa lacunas</w:t>
+      </w:r>
+      <w:r>
+        <w:rPr>
+          <w:rFonts w:ascii="Calibri" w:cs="Calibri" w:eastAsia="Calibri" w:hAnsi="Calibri"/>
+          <w:sz w:val="20"/>
+          <w:szCs w:val="20"/>
+        </w:rPr>
+        <w:t xml:space="preserve"> — e uma lacuna inventada custa tanto tempo quanto uma afirmação falsa. Daqui em diante, 04_FONTES.md e docs/registro_de_decisoes.md são leitura obrigatória antes de eu declarar qualquer coisa como “em aberto”.</w:t>
+      </w:r>
+    </w:p>
+    <w:p>
+      <w:pPr>
+        <w:pStyle w:val="Heading3"/>
+        <w:spacing w:after="100" w:before="220"/>
+      </w:pPr>
+      <w:r>
+        <w:rPr>
+          <w:rFonts w:ascii="Calibri" w:cs="Calibri" w:eastAsia="Calibri" w:hAnsi="Calibri"/>
+          <w:b/>
+          <w:bCs/>
+          <w:color w:val="333333"/>
+          <w:sz w:val="21"/>
+          <w:szCs w:val="21"/>
+        </w:rPr>
         <w:t xml:space="preserve">R-05 — “History Matching identifica o vetor verdadeiro”</w:t>
       </w:r>
     </w:p>
@@ -6385,7 +7246,7 @@
           <w:sz w:val="24"/>
           <w:szCs w:val="24"/>
         </w:rPr>
-        <w:t xml:space="preserve">G-01 — Retrabalho medido em horas: o comparador que não existe</w:t>
+        <w:t xml:space="preserve">G-01 — O empréstimo de domínio no comparador de retrabalho</w:t>
       </w:r>
     </w:p>
     <w:p>
@@ -6402,15 +7263,34 @@
           <w:sz w:val="20"/>
           <w:szCs w:val="20"/>
         </w:rPr>
-        <w:t xml:space="preserve">O problema:  </w:t>
-      </w:r>
-      <w:r>
-        <w:rPr>
-          <w:rFonts w:ascii="Calibri" w:cs="Calibri" w:eastAsia="Calibri" w:hAnsi="Calibri"/>
-          <w:sz w:val="20"/>
-          <w:szCs w:val="20"/>
-        </w:rPr>
-        <w:t xml:space="preserve">o modelo reporta retrabalho como TR / E_plano, uma fração de esforço. A literatura empírica de construção reporta fração de CUSTO. Enquanto as duas grandezas não forem postas na mesma base, nenhuma comparação decide se o modelo está alto, baixo ou certo — e é exatamente isso que trava D-08.</w:t>
+        <w:t xml:space="preserve">Reformulado em 16/09/2026.  </w:t>
+      </w:r>
+      <w:r>
+        <w:rPr>
+          <w:rFonts w:ascii="Calibri" w:cs="Calibri" w:eastAsia="Calibri" w:hAnsi="Calibri"/>
+          <w:sz w:val="20"/>
+          <w:szCs w:val="20"/>
+        </w:rPr>
+        <w:t xml:space="preserve">A formulação anterior deste gargalo — “falta um comparador na mesma unidade” — </w:t>
+      </w:r>
+      <w:r>
+        <w:rPr>
+          <w:rFonts w:ascii="Calibri" w:cs="Calibri" w:eastAsia="Calibri" w:hAnsi="Calibri"/>
+          <w:b/>
+          <w:bCs/>
+          <w:color w:val="9C2B1B"/>
+          <w:sz w:val="20"/>
+          <w:szCs w:val="20"/>
+        </w:rPr>
+        <w:t xml:space="preserve">estava errada</w:t>
+      </w:r>
+      <w:r>
+        <w:rPr>
+          <w:rFonts w:ascii="Calibri" w:cs="Calibri" w:eastAsia="Calibri" w:hAnsi="Calibri"/>
+          <w:sz w:val="20"/>
+          <w:szCs w:val="20"/>
+        </w:rPr>
+        <w:t xml:space="preserve"> e foi retratada em R-06. O comparador de unidade existe: Boehm &amp; Basili (2001) medem esforço, como o modelo, e já estava catalogado no 04_FONTES.</w:t>
       </w:r>
     </w:p>
     <w:p>
@@ -6427,15 +7307,15 @@
           <w:sz w:val="20"/>
           <w:szCs w:val="20"/>
         </w:rPr>
-        <w:t xml:space="preserve">O que resolveria:  </w:t>
-      </w:r>
-      <w:r>
-        <w:rPr>
-          <w:rFonts w:ascii="Calibri" w:cs="Calibri" w:eastAsia="Calibri" w:hAnsi="Calibri"/>
-          <w:sz w:val="20"/>
-          <w:szCs w:val="20"/>
-        </w:rPr>
-        <w:t xml:space="preserve">um estudo que reporte horas de retrabalho contra horas planejadas, na mesma unidade de trabalho, em projeto de engenharia. Alternativa: uma conversão explícita e defensável de custo para esforço, com a hipótese de proporcionalidade declarada.</w:t>
+        <w:t xml:space="preserve">O problema real:  </w:t>
+      </w:r>
+      <w:r>
+        <w:rPr>
+          <w:rFonts w:ascii="Calibri" w:cs="Calibri" w:eastAsia="Calibri" w:hAnsi="Calibri"/>
+          <w:sz w:val="20"/>
+          <w:szCs w:val="20"/>
+        </w:rPr>
+        <w:t xml:space="preserve">Boehm &amp; Basili medem desenvolvimento de software; o modelo simula execução de projeto genérico sobre instâncias do PSPLIB J60. A comparação é entre domínios. E a literatura de construção, que é o domínio mais próximo, mede custo sobre valor de contrato — outro denominador ainda. Não há hoje uma cifra de retrabalho em esforço, em projeto de engenharia não-software, contra a qual os 46% possam ser postos.</w:t>
       </w:r>
     </w:p>
     <w:p>
@@ -6452,15 +7332,40 @@
           <w:sz w:val="20"/>
           <w:szCs w:val="20"/>
         </w:rPr>
-        <w:t xml:space="preserve">Onde procurar:  </w:t>
-      </w:r>
-      <w:r>
-        <w:rPr>
-          <w:rFonts w:ascii="Calibri" w:cs="Calibri" w:eastAsia="Calibri" w:hAnsi="Calibri"/>
-          <w:sz w:val="20"/>
-          <w:szCs w:val="20"/>
-        </w:rPr>
-        <w:t xml:space="preserve">relatórios do CII com dados de homem-hora; literatura de medição de produtividade em construção e em desenvolvimento de produto; bases públicas de esforço de projeto de software (ISBSG, PROMISE) — com atenção a que qualquer uma delas troca o domínio.</w:t>
+        <w:t xml:space="preserve">Duas saídas, e as duas servem:  </w:t>
+      </w:r>
+      <w:r>
+        <w:rPr>
+          <w:rFonts w:ascii="Calibri" w:cs="Calibri" w:eastAsia="Calibri" w:hAnsi="Calibri"/>
+          <w:sz w:val="20"/>
+          <w:szCs w:val="20"/>
+        </w:rPr>
+        <w:t xml:space="preserve">(a) declarar o empréstimo — comparar com Boehm &amp; Basili, dizendo que a unidade bate e o domínio não, e tratar a cifra como ordem de grandeza e não como validação; (b) achar a cifra em esforço fora de software. A saída (a) é escrevível hoje e já melhora a monografia; a (b) é a que fecharia o argumento.</w:t>
+      </w:r>
+    </w:p>
+    <w:p>
+      <w:pPr>
+        <w:spacing w:after="90"/>
+        <w:ind w:left="200"/>
+      </w:pPr>
+      <w:r>
+        <w:rPr>
+          <w:rFonts w:ascii="Calibri" w:cs="Calibri" w:eastAsia="Calibri" w:hAnsi="Calibri"/>
+          <w:b/>
+          <w:bCs/>
+          <w:color w:val="9B2C5E"/>
+          <w:sz w:val="20"/>
+          <w:szCs w:val="20"/>
+        </w:rPr>
+        <w:t xml:space="preserve">Onde procurar para a saída (b):  </w:t>
+      </w:r>
+      <w:r>
+        <w:rPr>
+          <w:rFonts w:ascii="Calibri" w:cs="Calibri" w:eastAsia="Calibri" w:hAnsi="Calibri"/>
+          <w:sz w:val="20"/>
+          <w:szCs w:val="20"/>
+        </w:rPr>
+        <w:t xml:space="preserve">relatórios do CII com dados de homem-hora (não os de custo, que são os que a compilação CMAA usa); literatura de medição de produtividade em desenvolvimento de produto e em engenharia de projeto; a própria literatura de SYDPIM e dinâmica de sistemas aplicada a projeto, que trabalha nativamente em esforço — Rodrigues (2000), já catalogado, é o ponto de partida natural e ninguém olhou ainda com essa pergunta na mão.</w:t>
       </w:r>
     </w:p>
     <w:p>
@@ -7710,7 +8615,7 @@
         <w:sz w:val="16"/>
         <w:szCs w:val="16"/>
       </w:rPr>
-      <w:t xml:space="preserve">TCC2 — Histórico de decisões e fontes · v1 · 16/09/2026 · página </w:t>
+      <w:t xml:space="preserve">TCC2 — Histórico de decisões e fontes  ·  v3  ·  17/09/2026  ·  página </w:t>
     </w:r>
     <w:r>
       <w:rPr>

</xml_diff>

<commit_message>
Pareceres 27 a 37 do revisor, briefing do orientador, historico v6 e gitignore para Claude outputs
</commit_message>
<xml_diff>
--- a/projeto/18_HISTORICO_DECISOES_E_FONTES.docx
+++ b/projeto/18_HISTORICO_DECISOES_E_FONTES.docx
@@ -107,7 +107,7 @@
           <w:sz w:val="20"/>
           <w:szCs w:val="20"/>
         </w:rPr>
-        <w:t xml:space="preserve">Versão 4 — 17 de setembro de 2026 (A-13: decomposição premissa × modelo no contraste entre arranjos)</w:t>
+        <w:t xml:space="preserve">Versão 6 — 17 de setembro de 2026 (rastreabilidade em três campos e tabela de classificação de grandezas)</w:t>
       </w:r>
     </w:p>
     <w:p>
@@ -518,6 +518,1858 @@
           <w:sz w:val="21"/>
           <w:szCs w:val="21"/>
         </w:rPr>
+        <w:t xml:space="preserve">A tabela que mais protege o trabalho: medido, recalculado, compatível ou decidido</w:t>
+      </w:r>
+    </w:p>
+    <w:p>
+      <w:pPr>
+        <w:spacing w:after="90"/>
+        <w:ind w:left="200"/>
+      </w:pPr>
+      <w:r>
+        <w:rPr>
+          <w:rFonts w:ascii="Calibri" w:cs="Calibri" w:eastAsia="Calibri" w:hAnsi="Calibri"/>
+          <w:b/>
+          <w:bCs/>
+          <w:color w:val="9B2C5E"/>
+          <w:sz w:val="20"/>
+          <w:szCs w:val="20"/>
+        </w:rPr>
+        <w:t xml:space="preserve">Por que ela existe:  </w:t>
+      </w:r>
+      <w:r>
+        <w:rPr>
+          <w:rFonts w:ascii="Calibri" w:cs="Calibri" w:eastAsia="Calibri" w:hAnsi="Calibri"/>
+          <w:sz w:val="20"/>
+          <w:szCs w:val="20"/>
+        </w:rPr>
+        <w:t xml:space="preserve">a falha recorrente deste projeto — e a origem da maioria das catorze retratações do revisor — é uma grandeza </w:t>
+      </w:r>
+      <w:r>
+        <w:rPr>
+          <w:rFonts w:ascii="Calibri" w:cs="Calibri" w:eastAsia="Calibri" w:hAnsi="Calibri"/>
+          <w:b/>
+          <w:bCs/>
+          <w:sz w:val="20"/>
+          <w:szCs w:val="20"/>
+        </w:rPr>
+        <w:t xml:space="preserve">decidida por nós</w:t>
+      </w:r>
+      <w:r>
+        <w:rPr>
+          <w:rFonts w:ascii="Calibri" w:cs="Calibri" w:eastAsia="Calibri" w:hAnsi="Calibri"/>
+          <w:sz w:val="20"/>
+          <w:szCs w:val="20"/>
+        </w:rPr>
+        <w:t xml:space="preserve"> passar, semanas depois, a parecer </w:t>
+      </w:r>
+      <w:r>
+        <w:rPr>
+          <w:rFonts w:ascii="Calibri" w:cs="Calibri" w:eastAsia="Calibri" w:hAnsi="Calibri"/>
+          <w:b/>
+          <w:bCs/>
+          <w:sz w:val="20"/>
+          <w:szCs w:val="20"/>
+        </w:rPr>
+        <w:t xml:space="preserve">resultado da literatura</w:t>
+      </w:r>
+      <w:r>
+        <w:rPr>
+          <w:rFonts w:ascii="Calibri" w:cs="Calibri" w:eastAsia="Calibri" w:hAnsi="Calibri"/>
+          <w:sz w:val="20"/>
+          <w:szCs w:val="20"/>
+        </w:rPr>
+        <w:t xml:space="preserve">. Esta tabela fixa o estatuto de cada número antes que isso aconteça.</w:t>
+      </w:r>
+    </w:p>
+    <w:tbl>
+      <w:tblPr>
+        <w:tblW w:type="dxa" w:w="9700"/>
+        <w:tblBorders>
+          <w:top w:val="single" w:color="auto" w:sz="4"/>
+          <w:left w:val="single" w:color="auto" w:sz="4"/>
+          <w:bottom w:val="single" w:color="auto" w:sz="4"/>
+          <w:right w:val="single" w:color="auto" w:sz="4"/>
+          <w:insideH w:val="single" w:color="auto" w:sz="4"/>
+          <w:insideV w:val="single" w:color="auto" w:sz="4"/>
+        </w:tblBorders>
+      </w:tblPr>
+      <w:tblGrid>
+        <w:gridCol w:w="3500"/>
+        <w:gridCol w:w="2200"/>
+        <w:gridCol w:w="4000"/>
+      </w:tblGrid>
+      <w:tr>
+        <w:trPr>
+          <w:tblHeader/>
+        </w:trPr>
+        <w:tc>
+          <w:tcPr>
+            <w:tcW w:type="dxa" w:w="3500"/>
+            <w:shd w:fill="5E1B39" w:color="auto" w:val="clear"/>
+            <w:tcMar>
+              <w:top w:type="dxa" w:w="80"/>
+              <w:left w:type="dxa" w:w="100"/>
+              <w:bottom w:type="dxa" w:w="80"/>
+              <w:right w:type="dxa" w:w="100"/>
+            </w:tcMar>
+          </w:tcPr>
+          <w:p>
+            <w:r>
+              <w:rPr>
+                <w:rFonts w:ascii="Calibri" w:cs="Calibri" w:eastAsia="Calibri" w:hAnsi="Calibri"/>
+                <w:b/>
+                <w:bCs/>
+                <w:color w:val="FFFFFF"/>
+                <w:sz w:val="18"/>
+                <w:szCs w:val="18"/>
+              </w:rPr>
+              <w:t xml:space="preserve">Grandeza</w:t>
+            </w:r>
+          </w:p>
+        </w:tc>
+        <w:tc>
+          <w:tcPr>
+            <w:tcW w:type="dxa" w:w="2200"/>
+            <w:shd w:fill="5E1B39" w:color="auto" w:val="clear"/>
+            <w:tcMar>
+              <w:top w:type="dxa" w:w="80"/>
+              <w:left w:type="dxa" w:w="100"/>
+              <w:bottom w:type="dxa" w:w="80"/>
+              <w:right w:type="dxa" w:w="100"/>
+            </w:tcMar>
+          </w:tcPr>
+          <w:p>
+            <w:r>
+              <w:rPr>
+                <w:rFonts w:ascii="Calibri" w:cs="Calibri" w:eastAsia="Calibri" w:hAnsi="Calibri"/>
+                <w:b/>
+                <w:bCs/>
+                <w:color w:val="FFFFFF"/>
+                <w:sz w:val="18"/>
+                <w:szCs w:val="18"/>
+              </w:rPr>
+              <w:t xml:space="preserve">Classe</w:t>
+            </w:r>
+          </w:p>
+        </w:tc>
+        <w:tc>
+          <w:tcPr>
+            <w:tcW w:type="dxa" w:w="4000"/>
+            <w:shd w:fill="5E1B39" w:color="auto" w:val="clear"/>
+            <w:tcMar>
+              <w:top w:type="dxa" w:w="80"/>
+              <w:left w:type="dxa" w:w="100"/>
+              <w:bottom w:type="dxa" w:w="80"/>
+              <w:right w:type="dxa" w:w="100"/>
+            </w:tcMar>
+          </w:tcPr>
+          <w:p>
+            <w:r>
+              <w:rPr>
+                <w:rFonts w:ascii="Calibri" w:cs="Calibri" w:eastAsia="Calibri" w:hAnsi="Calibri"/>
+                <w:b/>
+                <w:bCs/>
+                <w:color w:val="FFFFFF"/>
+                <w:sz w:val="18"/>
+                <w:szCs w:val="18"/>
+              </w:rPr>
+              <w:t xml:space="preserve">Origem</w:t>
+            </w:r>
+          </w:p>
+        </w:tc>
+      </w:tr>
+      <w:tr>
+        <w:trPr>
+          <w:cantSplit/>
+        </w:trPr>
+        <w:tc>
+          <w:tcPr>
+            <w:tcW w:type="dxa" w:w="3500"/>
+            <w:tcMar>
+              <w:top w:type="dxa" w:w="80"/>
+              <w:left w:type="dxa" w:w="100"/>
+              <w:bottom w:type="dxa" w:w="80"/>
+              <w:right w:type="dxa" w:w="100"/>
+            </w:tcMar>
+          </w:tcPr>
+          <w:p>
+            <w:r>
+              <w:rPr>
+                <w:rFonts w:ascii="Calibri" w:cs="Calibri" w:eastAsia="Calibri" w:hAnsi="Calibri"/>
+                <w:sz w:val="18"/>
+                <w:szCs w:val="18"/>
+              </w:rPr>
+              <w:t xml:space="preserve">0,0128 por passo de cálculo; 0,0126 consulta a tabela</w:t>
+            </w:r>
+          </w:p>
+        </w:tc>
+        <w:tc>
+          <w:tcPr>
+            <w:tcW w:type="dxa" w:w="2200"/>
+            <w:tcMar>
+              <w:top w:type="dxa" w:w="80"/>
+              <w:left w:type="dxa" w:w="100"/>
+              <w:bottom w:type="dxa" w:w="80"/>
+              <w:right w:type="dxa" w:w="100"/>
+            </w:tcMar>
+          </w:tcPr>
+          <w:p>
+            <w:pPr>
+              <w:spacing w:after="40"/>
+            </w:pPr>
+            <w:r>
+              <w:rPr>
+                <w:rFonts w:ascii="Calibri" w:cs="Calibri" w:eastAsia="Calibri" w:hAnsi="Calibri"/>
+                <w:b/>
+                <w:bCs/>
+                <w:color w:val="1E6B3A"/>
+                <w:sz w:val="18"/>
+                <w:szCs w:val="18"/>
+              </w:rPr>
+              <w:t xml:space="preserve">MEDIDO</w:t>
+            </w:r>
+          </w:p>
+        </w:tc>
+        <w:tc>
+          <w:tcPr>
+            <w:tcW w:type="dxa" w:w="4000"/>
+            <w:tcMar>
+              <w:top w:type="dxa" w:w="80"/>
+              <w:left w:type="dxa" w:w="100"/>
+              <w:bottom w:type="dxa" w:w="80"/>
+              <w:right w:type="dxa" w:w="100"/>
+            </w:tcMar>
+          </w:tcPr>
+          <w:p>
+            <w:r>
+              <w:rPr>
+                <w:rFonts w:ascii="Calibri" w:cs="Calibri" w:eastAsia="Calibri" w:hAnsi="Calibri"/>
+                <w:sz w:val="18"/>
+                <w:szCs w:val="18"/>
+              </w:rPr>
+              <w:t xml:space="preserve">Stewart &amp; Melchers 1988, Tab. 1, p. 290</w:t>
+            </w:r>
+          </w:p>
+        </w:tc>
+      </w:tr>
+      <w:tr>
+        <w:trPr>
+          <w:cantSplit/>
+        </w:trPr>
+        <w:tc>
+          <w:tcPr>
+            <w:tcW w:type="dxa" w:w="3500"/>
+            <w:shd w:fill="F2F2F2" w:color="auto" w:val="clear"/>
+            <w:tcMar>
+              <w:top w:type="dxa" w:w="80"/>
+              <w:left w:type="dxa" w:w="100"/>
+              <w:bottom w:type="dxa" w:w="80"/>
+              <w:right w:type="dxa" w:w="100"/>
+            </w:tcMar>
+          </w:tcPr>
+          <w:p>
+            <w:r>
+              <w:rPr>
+                <w:rFonts w:ascii="Calibri" w:cs="Calibri" w:eastAsia="Calibri" w:hAnsi="Calibri"/>
+                <w:sz w:val="18"/>
+                <w:szCs w:val="18"/>
+              </w:rPr>
+              <w:t xml:space="preserve">Omissão de microtarefa: 0,40 a 0,80</w:t>
+            </w:r>
+          </w:p>
+        </w:tc>
+        <w:tc>
+          <w:tcPr>
+            <w:tcW w:type="dxa" w:w="2200"/>
+            <w:shd w:fill="F2F2F2" w:color="auto" w:val="clear"/>
+            <w:tcMar>
+              <w:top w:type="dxa" w:w="80"/>
+              <w:left w:type="dxa" w:w="100"/>
+              <w:bottom w:type="dxa" w:w="80"/>
+              <w:right w:type="dxa" w:w="100"/>
+            </w:tcMar>
+          </w:tcPr>
+          <w:p>
+            <w:pPr>
+              <w:spacing w:after="40"/>
+            </w:pPr>
+            <w:r>
+              <w:rPr>
+                <w:rFonts w:ascii="Calibri" w:cs="Calibri" w:eastAsia="Calibri" w:hAnsi="Calibri"/>
+                <w:b/>
+                <w:bCs/>
+                <w:color w:val="1E6B3A"/>
+                <w:sz w:val="18"/>
+                <w:szCs w:val="18"/>
+              </w:rPr>
+              <w:t xml:space="preserve">MEDIDO</w:t>
+            </w:r>
+          </w:p>
+        </w:tc>
+        <w:tc>
+          <w:tcPr>
+            <w:tcW w:type="dxa" w:w="4000"/>
+            <w:shd w:fill="F2F2F2" w:color="auto" w:val="clear"/>
+            <w:tcMar>
+              <w:top w:type="dxa" w:w="80"/>
+              <w:left w:type="dxa" w:w="100"/>
+              <w:bottom w:type="dxa" w:w="80"/>
+              <w:right w:type="dxa" w:w="100"/>
+            </w:tcMar>
+          </w:tcPr>
+          <w:p>
+            <w:r>
+              <w:rPr>
+                <w:rFonts w:ascii="Calibri" w:cs="Calibri" w:eastAsia="Calibri" w:hAnsi="Calibri"/>
+                <w:sz w:val="18"/>
+                <w:szCs w:val="18"/>
+              </w:rPr>
+              <w:t xml:space="preserve">Stewart &amp; Melchers 1988, Tab. 1, p. 290</w:t>
+            </w:r>
+          </w:p>
+        </w:tc>
+      </w:tr>
+      <w:tr>
+        <w:trPr>
+          <w:cantSplit/>
+        </w:trPr>
+        <w:tc>
+          <w:tcPr>
+            <w:tcW w:type="dxa" w:w="3500"/>
+            <w:tcMar>
+              <w:top w:type="dxa" w:w="80"/>
+              <w:left w:type="dxa" w:w="100"/>
+              <w:bottom w:type="dxa" w:w="80"/>
+              <w:right w:type="dxa" w:w="100"/>
+            </w:tcMar>
+          </w:tcPr>
+          <w:p>
+            <w:r>
+              <w:rPr>
+                <w:rFonts w:ascii="Calibri" w:cs="Calibri" w:eastAsia="Calibri" w:hAnsi="Calibri"/>
+                <w:sz w:val="18"/>
+                <w:szCs w:val="18"/>
+              </w:rPr>
+              <w:t xml:space="preserve">p_av = 0,0163 por microtarefa</w:t>
+            </w:r>
+          </w:p>
+        </w:tc>
+        <w:tc>
+          <w:tcPr>
+            <w:tcW w:type="dxa" w:w="2200"/>
+            <w:tcMar>
+              <w:top w:type="dxa" w:w="80"/>
+              <w:left w:type="dxa" w:w="100"/>
+              <w:bottom w:type="dxa" w:w="80"/>
+              <w:right w:type="dxa" w:w="100"/>
+            </w:tcMar>
+          </w:tcPr>
+          <w:p>
+            <w:pPr>
+              <w:spacing w:after="40"/>
+            </w:pPr>
+            <w:r>
+              <w:rPr>
+                <w:rFonts w:ascii="Calibri" w:cs="Calibri" w:eastAsia="Calibri" w:hAnsi="Calibri"/>
+                <w:b/>
+                <w:bCs/>
+                <w:color w:val="1E6B3A"/>
+                <w:sz w:val="18"/>
+                <w:szCs w:val="18"/>
+              </w:rPr>
+              <w:t xml:space="preserve">MEDIDO</w:t>
+            </w:r>
+          </w:p>
+        </w:tc>
+        <w:tc>
+          <w:tcPr>
+            <w:tcW w:type="dxa" w:w="4000"/>
+            <w:tcMar>
+              <w:top w:type="dxa" w:w="80"/>
+              <w:left w:type="dxa" w:w="100"/>
+              <w:bottom w:type="dxa" w:w="80"/>
+              <w:right w:type="dxa" w:w="100"/>
+            </w:tcMar>
+          </w:tcPr>
+          <w:p>
+            <w:r>
+              <w:rPr>
+                <w:rFonts w:ascii="Calibri" w:cs="Calibri" w:eastAsia="Calibri" w:hAnsi="Calibri"/>
+                <w:sz w:val="18"/>
+                <w:szCs w:val="18"/>
+              </w:rPr>
+              <w:t xml:space="preserve">Stewart 1992, Tab. 1, p. 173</w:t>
+            </w:r>
+          </w:p>
+        </w:tc>
+      </w:tr>
+      <w:tr>
+        <w:trPr>
+          <w:cantSplit/>
+        </w:trPr>
+        <w:tc>
+          <w:tcPr>
+            <w:tcW w:type="dxa" w:w="3500"/>
+            <w:shd w:fill="F2F2F2" w:color="auto" w:val="clear"/>
+            <w:tcMar>
+              <w:top w:type="dxa" w:w="80"/>
+              <w:left w:type="dxa" w:w="100"/>
+              <w:bottom w:type="dxa" w:w="80"/>
+              <w:right w:type="dxa" w:w="100"/>
+            </w:tcMar>
+          </w:tcPr>
+          <w:p>
+            <w:r>
+              <w:rPr>
+                <w:rFonts w:ascii="Calibri" w:cs="Calibri" w:eastAsia="Calibri" w:hAnsi="Calibri"/>
+                <w:sz w:val="18"/>
+                <w:szCs w:val="18"/>
+              </w:rPr>
+              <w:t xml:space="preserve">CV = 1,13 entre indivíduos; φ = 0,845 intraindividual</w:t>
+            </w:r>
+          </w:p>
+        </w:tc>
+        <w:tc>
+          <w:tcPr>
+            <w:tcW w:type="dxa" w:w="2200"/>
+            <w:shd w:fill="F2F2F2" w:color="auto" w:val="clear"/>
+            <w:tcMar>
+              <w:top w:type="dxa" w:w="80"/>
+              <w:left w:type="dxa" w:w="100"/>
+              <w:bottom w:type="dxa" w:w="80"/>
+              <w:right w:type="dxa" w:w="100"/>
+            </w:tcMar>
+          </w:tcPr>
+          <w:p>
+            <w:pPr>
+              <w:spacing w:after="40"/>
+            </w:pPr>
+            <w:r>
+              <w:rPr>
+                <w:rFonts w:ascii="Calibri" w:cs="Calibri" w:eastAsia="Calibri" w:hAnsi="Calibri"/>
+                <w:b/>
+                <w:bCs/>
+                <w:color w:val="1E6B3A"/>
+                <w:sz w:val="18"/>
+                <w:szCs w:val="18"/>
+              </w:rPr>
+              <w:t xml:space="preserve">MEDIDO</w:t>
+            </w:r>
+          </w:p>
+        </w:tc>
+        <w:tc>
+          <w:tcPr>
+            <w:tcW w:type="dxa" w:w="4000"/>
+            <w:shd w:fill="F2F2F2" w:color="auto" w:val="clear"/>
+            <w:tcMar>
+              <w:top w:type="dxa" w:w="80"/>
+              <w:left w:type="dxa" w:w="100"/>
+              <w:bottom w:type="dxa" w:w="80"/>
+              <w:right w:type="dxa" w:w="100"/>
+            </w:tcMar>
+          </w:tcPr>
+          <w:p>
+            <w:r>
+              <w:rPr>
+                <w:rFonts w:ascii="Calibri" w:cs="Calibri" w:eastAsia="Calibri" w:hAnsi="Calibri"/>
+                <w:sz w:val="18"/>
+                <w:szCs w:val="18"/>
+              </w:rPr>
+              <w:t xml:space="preserve">Stewart 1992, p. 174–175</w:t>
+            </w:r>
+          </w:p>
+        </w:tc>
+      </w:tr>
+      <w:tr>
+        <w:trPr>
+          <w:cantSplit/>
+        </w:trPr>
+        <w:tc>
+          <w:tcPr>
+            <w:tcW w:type="dxa" w:w="3500"/>
+            <w:tcMar>
+              <w:top w:type="dxa" w:w="80"/>
+              <w:left w:type="dxa" w:w="100"/>
+              <w:bottom w:type="dxa" w:w="80"/>
+              <w:right w:type="dxa" w:w="100"/>
+            </w:tcMar>
+          </w:tcPr>
+          <w:p>
+            <w:r>
+              <w:rPr>
+                <w:rFonts w:ascii="Calibri" w:cs="Calibri" w:eastAsia="Calibri" w:hAnsi="Calibri"/>
+                <w:sz w:val="18"/>
+                <w:szCs w:val="18"/>
+              </w:rPr>
+              <w:t xml:space="preserve">Independência rejeitada, χ² = 10,174 &gt; 5,991</w:t>
+            </w:r>
+          </w:p>
+        </w:tc>
+        <w:tc>
+          <w:tcPr>
+            <w:tcW w:type="dxa" w:w="2200"/>
+            <w:tcMar>
+              <w:top w:type="dxa" w:w="80"/>
+              <w:left w:type="dxa" w:w="100"/>
+              <w:bottom w:type="dxa" w:w="80"/>
+              <w:right w:type="dxa" w:w="100"/>
+            </w:tcMar>
+          </w:tcPr>
+          <w:p>
+            <w:pPr>
+              <w:spacing w:after="40"/>
+            </w:pPr>
+            <w:r>
+              <w:rPr>
+                <w:rFonts w:ascii="Calibri" w:cs="Calibri" w:eastAsia="Calibri" w:hAnsi="Calibri"/>
+                <w:b/>
+                <w:bCs/>
+                <w:color w:val="1E6B3A"/>
+                <w:sz w:val="18"/>
+                <w:szCs w:val="18"/>
+              </w:rPr>
+              <w:t xml:space="preserve">MEDIDO</w:t>
+            </w:r>
+          </w:p>
+        </w:tc>
+        <w:tc>
+          <w:tcPr>
+            <w:tcW w:type="dxa" w:w="4000"/>
+            <w:tcMar>
+              <w:top w:type="dxa" w:w="80"/>
+              <w:left w:type="dxa" w:w="100"/>
+              <w:bottom w:type="dxa" w:w="80"/>
+              <w:right w:type="dxa" w:w="100"/>
+            </w:tcMar>
+          </w:tcPr>
+          <w:p>
+            <w:r>
+              <w:rPr>
+                <w:rFonts w:ascii="Calibri" w:cs="Calibri" w:eastAsia="Calibri" w:hAnsi="Calibri"/>
+                <w:sz w:val="18"/>
+                <w:szCs w:val="18"/>
+              </w:rPr>
+              <w:t xml:space="preserve">Stewart 1992, Tab. 2, p. 175</w:t>
+            </w:r>
+          </w:p>
+        </w:tc>
+      </w:tr>
+      <w:tr>
+        <w:trPr>
+          <w:cantSplit/>
+        </w:trPr>
+        <w:tc>
+          <w:tcPr>
+            <w:tcW w:type="dxa" w:w="3500"/>
+            <w:shd w:fill="F2F2F2" w:color="auto" w:val="clear"/>
+            <w:tcMar>
+              <w:top w:type="dxa" w:w="80"/>
+              <w:left w:type="dxa" w:w="100"/>
+              <w:bottom w:type="dxa" w:w="80"/>
+              <w:right w:type="dxa" w:w="100"/>
+            </w:tcMar>
+          </w:tcPr>
+          <w:p>
+            <w:r>
+              <w:rPr>
+                <w:rFonts w:ascii="Calibri" w:cs="Calibri" w:eastAsia="Calibri" w:hAnsi="Calibri"/>
+                <w:sz w:val="18"/>
+                <w:szCs w:val="18"/>
+              </w:rPr>
+              <w:t xml:space="preserve">19,4% → 44,4% de estratégia não compensatória; McNemar p = 0,02</w:t>
+            </w:r>
+          </w:p>
+        </w:tc>
+        <w:tc>
+          <w:tcPr>
+            <w:tcW w:type="dxa" w:w="2200"/>
+            <w:shd w:fill="F2F2F2" w:color="auto" w:val="clear"/>
+            <w:tcMar>
+              <w:top w:type="dxa" w:w="80"/>
+              <w:left w:type="dxa" w:w="100"/>
+              <w:bottom w:type="dxa" w:w="80"/>
+              <w:right w:type="dxa" w:w="100"/>
+            </w:tcMar>
+          </w:tcPr>
+          <w:p>
+            <w:pPr>
+              <w:spacing w:after="40"/>
+            </w:pPr>
+            <w:r>
+              <w:rPr>
+                <w:rFonts w:ascii="Calibri" w:cs="Calibri" w:eastAsia="Calibri" w:hAnsi="Calibri"/>
+                <w:b/>
+                <w:bCs/>
+                <w:color w:val="1E6B3A"/>
+                <w:sz w:val="18"/>
+                <w:szCs w:val="18"/>
+              </w:rPr>
+              <w:t xml:space="preserve">MEDIDO</w:t>
+            </w:r>
+          </w:p>
+        </w:tc>
+        <w:tc>
+          <w:tcPr>
+            <w:tcW w:type="dxa" w:w="4000"/>
+            <w:shd w:fill="F2F2F2" w:color="auto" w:val="clear"/>
+            <w:tcMar>
+              <w:top w:type="dxa" w:w="80"/>
+              <w:left w:type="dxa" w:w="100"/>
+              <w:bottom w:type="dxa" w:w="80"/>
+              <w:right w:type="dxa" w:w="100"/>
+            </w:tcMar>
+          </w:tcPr>
+          <w:p>
+            <w:r>
+              <w:rPr>
+                <w:rFonts w:ascii="Calibri" w:cs="Calibri" w:eastAsia="Calibri" w:hAnsi="Calibri"/>
+                <w:sz w:val="18"/>
+                <w:szCs w:val="18"/>
+              </w:rPr>
+              <w:t xml:space="preserve">Rieskamp &amp; Hoffrage 2008, Est. 2, p. 266–267</w:t>
+            </w:r>
+          </w:p>
+        </w:tc>
+      </w:tr>
+      <w:tr>
+        <w:trPr>
+          <w:cantSplit/>
+        </w:trPr>
+        <w:tc>
+          <w:tcPr>
+            <w:tcW w:type="dxa" w:w="3500"/>
+            <w:tcMar>
+              <w:top w:type="dxa" w:w="80"/>
+              <w:left w:type="dxa" w:w="100"/>
+              <w:bottom w:type="dxa" w:w="80"/>
+              <w:right w:type="dxa" w:w="100"/>
+            </w:tcMar>
+          </w:tcPr>
+          <w:p>
+            <w:r>
+              <w:rPr>
+                <w:rFonts w:ascii="Calibri" w:cs="Calibri" w:eastAsia="Calibri" w:hAnsi="Calibri"/>
+                <w:sz w:val="18"/>
+                <w:szCs w:val="18"/>
+              </w:rPr>
+              <w:t xml:space="preserve">ΔC = [15 + 3(C_p − C_r)]/100; τ pela Eq. (4); −0,05 no insucesso; reset de competência</w:t>
+            </w:r>
+          </w:p>
+        </w:tc>
+        <w:tc>
+          <w:tcPr>
+            <w:tcW w:type="dxa" w:w="2200"/>
+            <w:tcMar>
+              <w:top w:type="dxa" w:w="80"/>
+              <w:left w:type="dxa" w:w="100"/>
+              <w:bottom w:type="dxa" w:w="80"/>
+              <w:right w:type="dxa" w:w="100"/>
+            </w:tcMar>
+          </w:tcPr>
+          <w:p>
+            <w:pPr>
+              <w:spacing w:after="40"/>
+            </w:pPr>
+            <w:r>
+              <w:rPr>
+                <w:rFonts w:ascii="Calibri" w:cs="Calibri" w:eastAsia="Calibri" w:hAnsi="Calibri"/>
+                <w:b/>
+                <w:bCs/>
+                <w:color w:val="1E6B3A"/>
+                <w:sz w:val="18"/>
+                <w:szCs w:val="18"/>
+              </w:rPr>
+              <w:t xml:space="preserve">MEDIDO</w:t>
+            </w:r>
+          </w:p>
+        </w:tc>
+        <w:tc>
+          <w:tcPr>
+            <w:tcW w:type="dxa" w:w="4000"/>
+            <w:tcMar>
+              <w:top w:type="dxa" w:w="80"/>
+              <w:left w:type="dxa" w:w="100"/>
+              <w:bottom w:type="dxa" w:w="80"/>
+              <w:right w:type="dxa" w:w="100"/>
+            </w:tcMar>
+          </w:tcPr>
+          <w:p>
+            <w:r>
+              <w:rPr>
+                <w:rFonts w:ascii="Calibri" w:cs="Calibri" w:eastAsia="Calibri" w:hAnsi="Calibri"/>
+                <w:sz w:val="18"/>
+                <w:szCs w:val="18"/>
+              </w:rPr>
+              <w:t xml:space="preserve">Crowder et al. 2012, p. 1431</w:t>
+            </w:r>
+          </w:p>
+        </w:tc>
+      </w:tr>
+      <w:tr>
+        <w:trPr>
+          <w:cantSplit/>
+        </w:trPr>
+        <w:tc>
+          <w:tcPr>
+            <w:tcW w:type="dxa" w:w="3500"/>
+            <w:shd w:fill="F2F2F2" w:color="auto" w:val="clear"/>
+            <w:tcMar>
+              <w:top w:type="dxa" w:w="80"/>
+              <w:left w:type="dxa" w:w="100"/>
+              <w:bottom w:type="dxa" w:w="80"/>
+              <w:right w:type="dxa" w:w="100"/>
+            </w:tcMar>
+          </w:tcPr>
+          <w:p>
+            <w:r>
+              <w:rPr>
+                <w:rFonts w:ascii="Calibri" w:cs="Calibri" w:eastAsia="Calibri" w:hAnsi="Calibri"/>
+                <w:sz w:val="18"/>
+                <w:szCs w:val="18"/>
+              </w:rPr>
+              <w:t xml:space="preserve">Retrabalho: 48% das horas de projeto, 24% das de execução</w:t>
+            </w:r>
+          </w:p>
+        </w:tc>
+        <w:tc>
+          <w:tcPr>
+            <w:tcW w:type="dxa" w:w="2200"/>
+            <w:shd w:fill="F2F2F2" w:color="auto" w:val="clear"/>
+            <w:tcMar>
+              <w:top w:type="dxa" w:w="80"/>
+              <w:left w:type="dxa" w:w="100"/>
+              <w:bottom w:type="dxa" w:w="80"/>
+              <w:right w:type="dxa" w:w="100"/>
+            </w:tcMar>
+          </w:tcPr>
+          <w:p>
+            <w:pPr>
+              <w:spacing w:after="40"/>
+            </w:pPr>
+            <w:r>
+              <w:rPr>
+                <w:rFonts w:ascii="Calibri" w:cs="Calibri" w:eastAsia="Calibri" w:hAnsi="Calibri"/>
+                <w:b/>
+                <w:bCs/>
+                <w:color w:val="8A6300"/>
+                <w:sz w:val="18"/>
+                <w:szCs w:val="18"/>
+              </w:rPr>
+              <w:t xml:space="preserve">MEDIDO, COM RESSALVA</w:t>
+            </w:r>
+          </w:p>
+        </w:tc>
+        <w:tc>
+          <w:tcPr>
+            <w:tcW w:type="dxa" w:w="4000"/>
+            <w:shd w:fill="F2F2F2" w:color="auto" w:val="clear"/>
+            <w:tcMar>
+              <w:top w:type="dxa" w:w="80"/>
+              <w:left w:type="dxa" w:w="100"/>
+              <w:bottom w:type="dxa" w:w="80"/>
+              <w:right w:type="dxa" w:w="100"/>
+            </w:tcMar>
+          </w:tcPr>
+          <w:p>
+            <w:r>
+              <w:rPr>
+                <w:rFonts w:ascii="Calibri" w:cs="Calibri" w:eastAsia="Calibri" w:hAnsi="Calibri"/>
+                <w:sz w:val="18"/>
+                <w:szCs w:val="18"/>
+              </w:rPr>
+              <w:t xml:space="preserve">Reichelt &amp; Lyneis 1999, p. 146 — saída de modelo calibrado, não contagem direta</w:t>
+            </w:r>
+          </w:p>
+        </w:tc>
+      </w:tr>
+      <w:tr>
+        <w:trPr>
+          <w:cantSplit/>
+        </w:trPr>
+        <w:tc>
+          <w:tcPr>
+            <w:tcW w:type="dxa" w:w="3500"/>
+            <w:tcMar>
+              <w:top w:type="dxa" w:w="80"/>
+              <w:left w:type="dxa" w:w="100"/>
+              <w:bottom w:type="dxa" w:w="80"/>
+              <w:right w:type="dxa" w:w="100"/>
+            </w:tcMar>
+          </w:tcPr>
+          <w:p>
+            <w:r>
+              <w:rPr>
+                <w:rFonts w:ascii="Calibri" w:cs="Calibri" w:eastAsia="Calibri" w:hAnsi="Calibri"/>
+                <w:sz w:val="18"/>
+                <w:szCs w:val="18"/>
+              </w:rPr>
+              <w:t xml:space="preserve">ε(30 s) = 0,268, IC95 [0,197 ; 0,339], n = 32</w:t>
+            </w:r>
+          </w:p>
+        </w:tc>
+        <w:tc>
+          <w:tcPr>
+            <w:tcW w:type="dxa" w:w="2200"/>
+            <w:tcMar>
+              <w:top w:type="dxa" w:w="80"/>
+              <w:left w:type="dxa" w:w="100"/>
+              <w:bottom w:type="dxa" w:w="80"/>
+              <w:right w:type="dxa" w:w="100"/>
+            </w:tcMar>
+          </w:tcPr>
+          <w:p>
+            <w:pPr>
+              <w:spacing w:after="40"/>
+            </w:pPr>
+            <w:r>
+              <w:rPr>
+                <w:rFonts w:ascii="Calibri" w:cs="Calibri" w:eastAsia="Calibri" w:hAnsi="Calibri"/>
+                <w:b/>
+                <w:bCs/>
+                <w:color w:val="8A6300"/>
+                <w:sz w:val="18"/>
+                <w:szCs w:val="18"/>
+              </w:rPr>
+              <w:t xml:space="preserve">RECALCULADO</w:t>
+            </w:r>
+          </w:p>
+        </w:tc>
+        <w:tc>
+          <w:tcPr>
+            <w:tcW w:type="dxa" w:w="4000"/>
+            <w:tcMar>
+              <w:top w:type="dxa" w:w="80"/>
+              <w:left w:type="dxa" w:w="100"/>
+              <w:bottom w:type="dxa" w:w="80"/>
+              <w:right w:type="dxa" w:w="100"/>
+            </w:tcMar>
+          </w:tcPr>
+          <w:p>
+            <w:r>
+              <w:rPr>
+                <w:rFonts w:ascii="Calibri" w:cs="Calibri" w:eastAsia="Calibri" w:hAnsi="Calibri"/>
+                <w:sz w:val="18"/>
+                <w:szCs w:val="18"/>
+              </w:rPr>
+              <w:t xml:space="preserve">Dados OSF q2dm6, reanalisados pelo revisor</w:t>
+            </w:r>
+          </w:p>
+        </w:tc>
+      </w:tr>
+      <w:tr>
+        <w:trPr>
+          <w:cantSplit/>
+        </w:trPr>
+        <w:tc>
+          <w:tcPr>
+            <w:tcW w:type="dxa" w:w="3500"/>
+            <w:shd w:fill="F2F2F2" w:color="auto" w:val="clear"/>
+            <w:tcMar>
+              <w:top w:type="dxa" w:w="80"/>
+              <w:left w:type="dxa" w:w="100"/>
+              <w:bottom w:type="dxa" w:w="80"/>
+              <w:right w:type="dxa" w:w="100"/>
+            </w:tcMar>
+          </w:tcPr>
+          <w:p>
+            <w:r>
+              <w:rPr>
+                <w:rFonts w:ascii="Calibri" w:cs="Calibri" w:eastAsia="Calibri" w:hAnsi="Calibri"/>
+                <w:sz w:val="18"/>
+                <w:szCs w:val="18"/>
+              </w:rPr>
+              <w:t xml:space="preserve">k ≈ 3,9 e 7,8 para F_ancora = 0,05 e 0,10</w:t>
+            </w:r>
+          </w:p>
+        </w:tc>
+        <w:tc>
+          <w:tcPr>
+            <w:tcW w:type="dxa" w:w="2200"/>
+            <w:shd w:fill="F2F2F2" w:color="auto" w:val="clear"/>
+            <w:tcMar>
+              <w:top w:type="dxa" w:w="80"/>
+              <w:left w:type="dxa" w:w="100"/>
+              <w:bottom w:type="dxa" w:w="80"/>
+              <w:right w:type="dxa" w:w="100"/>
+            </w:tcMar>
+          </w:tcPr>
+          <w:p>
+            <w:pPr>
+              <w:spacing w:after="40"/>
+            </w:pPr>
+            <w:r>
+              <w:rPr>
+                <w:rFonts w:ascii="Calibri" w:cs="Calibri" w:eastAsia="Calibri" w:hAnsi="Calibri"/>
+                <w:b/>
+                <w:bCs/>
+                <w:color w:val="8A6300"/>
+                <w:sz w:val="18"/>
+                <w:szCs w:val="18"/>
+              </w:rPr>
+              <w:t xml:space="preserve">RECALCULADO</w:t>
+            </w:r>
+          </w:p>
+        </w:tc>
+        <w:tc>
+          <w:tcPr>
+            <w:tcW w:type="dxa" w:w="4000"/>
+            <w:shd w:fill="F2F2F2" w:color="auto" w:val="clear"/>
+            <w:tcMar>
+              <w:top w:type="dxa" w:w="80"/>
+              <w:left w:type="dxa" w:w="100"/>
+              <w:bottom w:type="dxa" w:w="80"/>
+              <w:right w:type="dxa" w:w="100"/>
+            </w:tcMar>
+          </w:tcPr>
+          <w:p>
+            <w:r>
+              <w:rPr>
+                <w:rFonts w:ascii="Calibri" w:cs="Calibri" w:eastAsia="Calibri" w:hAnsi="Calibri"/>
+                <w:sz w:val="18"/>
+                <w:szCs w:val="18"/>
+              </w:rPr>
+              <w:t xml:space="preserve">Divisão nossa sobre a Tab. 1 de 1988</w:t>
+            </w:r>
+          </w:p>
+        </w:tc>
+      </w:tr>
+      <w:tr>
+        <w:trPr>
+          <w:cantSplit/>
+        </w:trPr>
+        <w:tc>
+          <w:tcPr>
+            <w:tcW w:type="dxa" w:w="3500"/>
+            <w:tcMar>
+              <w:top w:type="dxa" w:w="80"/>
+              <w:left w:type="dxa" w:w="100"/>
+              <w:bottom w:type="dxa" w:w="80"/>
+              <w:right w:type="dxa" w:w="100"/>
+            </w:tcMar>
+          </w:tcPr>
+          <w:p>
+            <w:r>
+              <w:rPr>
+                <w:rFonts w:ascii="Calibri" w:cs="Calibri" w:eastAsia="Calibri" w:hAnsi="Calibri"/>
+                <w:sz w:val="18"/>
+                <w:szCs w:val="18"/>
+              </w:rPr>
+              <w:t xml:space="preserve">+27,0% / +43,7% e +94,2% / +110,7% na probabilidade de falha</w:t>
+            </w:r>
+          </w:p>
+        </w:tc>
+        <w:tc>
+          <w:tcPr>
+            <w:tcW w:type="dxa" w:w="2200"/>
+            <w:tcMar>
+              <w:top w:type="dxa" w:w="80"/>
+              <w:left w:type="dxa" w:w="100"/>
+              <w:bottom w:type="dxa" w:w="80"/>
+              <w:right w:type="dxa" w:w="100"/>
+            </w:tcMar>
+          </w:tcPr>
+          <w:p>
+            <w:pPr>
+              <w:spacing w:after="40"/>
+            </w:pPr>
+            <w:r>
+              <w:rPr>
+                <w:rFonts w:ascii="Calibri" w:cs="Calibri" w:eastAsia="Calibri" w:hAnsi="Calibri"/>
+                <w:b/>
+                <w:bCs/>
+                <w:color w:val="8A6300"/>
+                <w:sz w:val="18"/>
+                <w:szCs w:val="18"/>
+              </w:rPr>
+              <w:t xml:space="preserve">RECALCULADO</w:t>
+            </w:r>
+          </w:p>
+        </w:tc>
+        <w:tc>
+          <w:tcPr>
+            <w:tcW w:type="dxa" w:w="4000"/>
+            <w:tcMar>
+              <w:top w:type="dxa" w:w="80"/>
+              <w:left w:type="dxa" w:w="100"/>
+              <w:bottom w:type="dxa" w:w="80"/>
+              <w:right w:type="dxa" w:w="100"/>
+            </w:tcMar>
+          </w:tcPr>
+          <w:p>
+            <w:r>
+              <w:rPr>
+                <w:rFonts w:ascii="Calibri" w:cs="Calibri" w:eastAsia="Calibri" w:hAnsi="Calibri"/>
+                <w:sz w:val="18"/>
+                <w:szCs w:val="18"/>
+              </w:rPr>
+              <w:t xml:space="preserve">Nosso, sobre a Tab. 3 de Stewart 1992 — o texto do autor resume 20–30% e 50%</w:t>
+            </w:r>
+          </w:p>
+        </w:tc>
+      </w:tr>
+      <w:tr>
+        <w:trPr>
+          <w:cantSplit/>
+        </w:trPr>
+        <w:tc>
+          <w:tcPr>
+            <w:tcW w:type="dxa" w:w="3500"/>
+            <w:shd w:fill="F2F2F2" w:color="auto" w:val="clear"/>
+            <w:tcMar>
+              <w:top w:type="dxa" w:w="80"/>
+              <w:left w:type="dxa" w:w="100"/>
+              <w:bottom w:type="dxa" w:w="80"/>
+              <w:right w:type="dxa" w:w="100"/>
+            </w:tcMar>
+          </w:tcPr>
+          <w:p>
+            <w:r>
+              <w:rPr>
+                <w:rFonts w:ascii="Calibri" w:cs="Calibri" w:eastAsia="Calibri" w:hAnsi="Calibri"/>
+                <w:sz w:val="18"/>
+                <w:szCs w:val="18"/>
+              </w:rPr>
+              <w:t xml:space="preserve">β_carga = 0,432; β_complexidade = −0,015 (p = 0,812)</w:t>
+            </w:r>
+          </w:p>
+        </w:tc>
+        <w:tc>
+          <w:tcPr>
+            <w:tcW w:type="dxa" w:w="2200"/>
+            <w:shd w:fill="F2F2F2" w:color="auto" w:val="clear"/>
+            <w:tcMar>
+              <w:top w:type="dxa" w:w="80"/>
+              <w:left w:type="dxa" w:w="100"/>
+              <w:bottom w:type="dxa" w:w="80"/>
+              <w:right w:type="dxa" w:w="100"/>
+            </w:tcMar>
+          </w:tcPr>
+          <w:p>
+            <w:pPr>
+              <w:spacing w:after="40"/>
+            </w:pPr>
+            <w:r>
+              <w:rPr>
+                <w:rFonts w:ascii="Calibri" w:cs="Calibri" w:eastAsia="Calibri" w:hAnsi="Calibri"/>
+                <w:b/>
+                <w:bCs/>
+                <w:color w:val="8A6300"/>
+                <w:sz w:val="18"/>
+                <w:szCs w:val="18"/>
+              </w:rPr>
+              <w:t xml:space="preserve">RECALCULADO</w:t>
+            </w:r>
+          </w:p>
+        </w:tc>
+        <w:tc>
+          <w:tcPr>
+            <w:tcW w:type="dxa" w:w="4000"/>
+            <w:shd w:fill="F2F2F2" w:color="auto" w:val="clear"/>
+            <w:tcMar>
+              <w:top w:type="dxa" w:w="80"/>
+              <w:left w:type="dxa" w:w="100"/>
+              <w:bottom w:type="dxa" w:w="80"/>
+              <w:right w:type="dxa" w:w="100"/>
+            </w:tcMar>
+          </w:tcPr>
+          <w:p>
+            <w:r>
+              <w:rPr>
+                <w:rFonts w:ascii="Calibri" w:cs="Calibri" w:eastAsia="Calibri" w:hAnsi="Calibri"/>
+                <w:sz w:val="18"/>
+                <w:szCs w:val="18"/>
+              </w:rPr>
+              <w:t xml:space="preserve">Regressão conjunta na base Zhao, feita na análise paralela</w:t>
+            </w:r>
+          </w:p>
+        </w:tc>
+      </w:tr>
+      <w:tr>
+        <w:trPr>
+          <w:cantSplit/>
+        </w:trPr>
+        <w:tc>
+          <w:tcPr>
+            <w:tcW w:type="dxa" w:w="3500"/>
+            <w:tcMar>
+              <w:top w:type="dxa" w:w="80"/>
+              <w:left w:type="dxa" w:w="100"/>
+              <w:bottom w:type="dxa" w:w="80"/>
+              <w:right w:type="dxa" w:w="100"/>
+            </w:tcMar>
+          </w:tcPr>
+          <w:p>
+            <w:r>
+              <w:rPr>
+                <w:rFonts w:ascii="Calibri" w:cs="Calibri" w:eastAsia="Calibri" w:hAnsi="Calibri"/>
+                <w:sz w:val="18"/>
+                <w:szCs w:val="18"/>
+              </w:rPr>
+              <w:t xml:space="preserve">97,5% do contraste de taxa_omissao é premissa de reporte</w:t>
+            </w:r>
+          </w:p>
+        </w:tc>
+        <w:tc>
+          <w:tcPr>
+            <w:tcW w:type="dxa" w:w="2200"/>
+            <w:tcMar>
+              <w:top w:type="dxa" w:w="80"/>
+              <w:left w:type="dxa" w:w="100"/>
+              <w:bottom w:type="dxa" w:w="80"/>
+              <w:right w:type="dxa" w:w="100"/>
+            </w:tcMar>
+          </w:tcPr>
+          <w:p>
+            <w:pPr>
+              <w:spacing w:after="40"/>
+            </w:pPr>
+            <w:r>
+              <w:rPr>
+                <w:rFonts w:ascii="Calibri" w:cs="Calibri" w:eastAsia="Calibri" w:hAnsi="Calibri"/>
+                <w:b/>
+                <w:bCs/>
+                <w:color w:val="8A6300"/>
+                <w:sz w:val="18"/>
+                <w:szCs w:val="18"/>
+              </w:rPr>
+              <w:t xml:space="preserve">RECALCULADO</w:t>
+            </w:r>
+          </w:p>
+        </w:tc>
+        <w:tc>
+          <w:tcPr>
+            <w:tcW w:type="dxa" w:w="4000"/>
+            <w:tcMar>
+              <w:top w:type="dxa" w:w="80"/>
+              <w:left w:type="dxa" w:w="100"/>
+              <w:bottom w:type="dxa" w:w="80"/>
+              <w:right w:type="dxa" w:w="100"/>
+            </w:tcMar>
+          </w:tcPr>
+          <w:p>
+            <w:r>
+              <w:rPr>
+                <w:rFonts w:ascii="Calibri" w:cs="Calibri" w:eastAsia="Calibri" w:hAnsi="Calibri"/>
+                <w:sz w:val="18"/>
+                <w:szCs w:val="18"/>
+              </w:rPr>
+              <w:t xml:space="preserve">Decomposição T2 por intervenção, lote próprio</w:t>
+            </w:r>
+          </w:p>
+        </w:tc>
+      </w:tr>
+      <w:tr>
+        <w:trPr>
+          <w:cantSplit/>
+        </w:trPr>
+        <w:tc>
+          <w:tcPr>
+            <w:tcW w:type="dxa" w:w="3500"/>
+            <w:shd w:fill="F2F2F2" w:color="auto" w:val="clear"/>
+            <w:tcMar>
+              <w:top w:type="dxa" w:w="80"/>
+              <w:left w:type="dxa" w:w="100"/>
+              <w:bottom w:type="dxa" w:w="80"/>
+              <w:right w:type="dxa" w:w="100"/>
+            </w:tcMar>
+          </w:tcPr>
+          <w:p>
+            <w:r>
+              <w:rPr>
+                <w:rFonts w:ascii="Calibri" w:cs="Calibri" w:eastAsia="Calibri" w:hAnsi="Calibri"/>
+                <w:sz w:val="18"/>
+                <w:szCs w:val="18"/>
+              </w:rPr>
+              <w:t xml:space="preserve">Ausência de efeito de pressão sobre erro</w:t>
+            </w:r>
+          </w:p>
+        </w:tc>
+        <w:tc>
+          <w:tcPr>
+            <w:tcW w:type="dxa" w:w="2200"/>
+            <w:shd w:fill="F2F2F2" w:color="auto" w:val="clear"/>
+            <w:tcMar>
+              <w:top w:type="dxa" w:w="80"/>
+              <w:left w:type="dxa" w:w="100"/>
+              <w:bottom w:type="dxa" w:w="80"/>
+              <w:right w:type="dxa" w:w="100"/>
+            </w:tcMar>
+          </w:tcPr>
+          <w:p>
+            <w:pPr>
+              <w:spacing w:after="40"/>
+            </w:pPr>
+            <w:r>
+              <w:rPr>
+                <w:rFonts w:ascii="Calibri" w:cs="Calibri" w:eastAsia="Calibri" w:hAnsi="Calibri"/>
+                <w:b/>
+                <w:bCs/>
+                <w:color w:val="9C2B1B"/>
+                <w:sz w:val="18"/>
+                <w:szCs w:val="18"/>
+              </w:rPr>
+              <w:t xml:space="preserve">COMPATÍVEL, NÃO ESTABELECE</w:t>
+            </w:r>
+          </w:p>
+        </w:tc>
+        <w:tc>
+          <w:tcPr>
+            <w:tcW w:type="dxa" w:w="4000"/>
+            <w:shd w:fill="F2F2F2" w:color="auto" w:val="clear"/>
+            <w:tcMar>
+              <w:top w:type="dxa" w:w="80"/>
+              <w:left w:type="dxa" w:w="100"/>
+              <w:bottom w:type="dxa" w:w="80"/>
+              <w:right w:type="dxa" w:w="100"/>
+            </w:tcMar>
+          </w:tcPr>
+          <w:p>
+            <w:r>
+              <w:rPr>
+                <w:rFonts w:ascii="Calibri" w:cs="Calibri" w:eastAsia="Calibri" w:hAnsi="Calibri"/>
+                <w:sz w:val="18"/>
+                <w:szCs w:val="18"/>
+              </w:rPr>
+              <w:t xml:space="preserve">Três tentativas nulas ou opostas, cada uma com descasamento de construto. Stewart 1992 não testa (ver R-12)</w:t>
+            </w:r>
+          </w:p>
+        </w:tc>
+      </w:tr>
+      <w:tr>
+        <w:trPr>
+          <w:cantSplit/>
+        </w:trPr>
+        <w:tc>
+          <w:tcPr>
+            <w:tcW w:type="dxa" w:w="3500"/>
+            <w:tcMar>
+              <w:top w:type="dxa" w:w="80"/>
+              <w:left w:type="dxa" w:w="100"/>
+              <w:bottom w:type="dxa" w:w="80"/>
+              <w:right w:type="dxa" w:w="100"/>
+            </w:tcMar>
+          </w:tcPr>
+          <w:p>
+            <w:r>
+              <w:rPr>
+                <w:rFonts w:ascii="Calibri" w:cs="Calibri" w:eastAsia="Calibri" w:hAnsi="Calibri"/>
+                <w:sz w:val="18"/>
+                <w:szCs w:val="18"/>
+              </w:rPr>
+              <w:t xml:space="preserve">Boehm &amp; Basili como comparador de retrabalho</w:t>
+            </w:r>
+          </w:p>
+        </w:tc>
+        <w:tc>
+          <w:tcPr>
+            <w:tcW w:type="dxa" w:w="2200"/>
+            <w:tcMar>
+              <w:top w:type="dxa" w:w="80"/>
+              <w:left w:type="dxa" w:w="100"/>
+              <w:bottom w:type="dxa" w:w="80"/>
+              <w:right w:type="dxa" w:w="100"/>
+            </w:tcMar>
+          </w:tcPr>
+          <w:p>
+            <w:pPr>
+              <w:spacing w:after="40"/>
+            </w:pPr>
+            <w:r>
+              <w:rPr>
+                <w:rFonts w:ascii="Calibri" w:cs="Calibri" w:eastAsia="Calibri" w:hAnsi="Calibri"/>
+                <w:b/>
+                <w:bCs/>
+                <w:color w:val="9C2B1B"/>
+                <w:sz w:val="18"/>
+                <w:szCs w:val="18"/>
+              </w:rPr>
+              <w:t xml:space="preserve">COMPATÍVEL, NÃO ESTABELECE</w:t>
+            </w:r>
+          </w:p>
+        </w:tc>
+        <w:tc>
+          <w:tcPr>
+            <w:tcW w:type="dxa" w:w="4000"/>
+            <w:tcMar>
+              <w:top w:type="dxa" w:w="80"/>
+              <w:left w:type="dxa" w:w="100"/>
+              <w:bottom w:type="dxa" w:w="80"/>
+              <w:right w:type="dxa" w:w="100"/>
+            </w:tcMar>
+          </w:tcPr>
+          <w:p>
+            <w:r>
+              <w:rPr>
+                <w:rFonts w:ascii="Calibri" w:cs="Calibri" w:eastAsia="Calibri" w:hAnsi="Calibri"/>
+                <w:sz w:val="18"/>
+                <w:szCs w:val="18"/>
+              </w:rPr>
+              <w:t xml:space="preserve">Unidade bate (esforço); domínio não (software)</w:t>
+            </w:r>
+          </w:p>
+        </w:tc>
+      </w:tr>
+      <w:tr>
+        <w:trPr>
+          <w:cantSplit/>
+        </w:trPr>
+        <w:tc>
+          <w:tcPr>
+            <w:tcW w:type="dxa" w:w="3500"/>
+            <w:shd w:fill="F2F2F2" w:color="auto" w:val="clear"/>
+            <w:tcMar>
+              <w:top w:type="dxa" w:w="80"/>
+              <w:left w:type="dxa" w:w="100"/>
+              <w:bottom w:type="dxa" w:w="80"/>
+              <w:right w:type="dxa" w:w="100"/>
+            </w:tcMar>
+          </w:tcPr>
+          <w:p>
+            <w:r>
+              <w:rPr>
+                <w:rFonts w:ascii="Calibri" w:cs="Calibri" w:eastAsia="Calibri" w:hAnsi="Calibri"/>
+                <w:sz w:val="18"/>
+                <w:szCs w:val="18"/>
+              </w:rPr>
+              <w:t xml:space="preserve">Reichelt &amp; Lyneis como envelope de plausibilidade</w:t>
+            </w:r>
+          </w:p>
+        </w:tc>
+        <w:tc>
+          <w:tcPr>
+            <w:tcW w:type="dxa" w:w="2200"/>
+            <w:shd w:fill="F2F2F2" w:color="auto" w:val="clear"/>
+            <w:tcMar>
+              <w:top w:type="dxa" w:w="80"/>
+              <w:left w:type="dxa" w:w="100"/>
+              <w:bottom w:type="dxa" w:w="80"/>
+              <w:right w:type="dxa" w:w="100"/>
+            </w:tcMar>
+          </w:tcPr>
+          <w:p>
+            <w:pPr>
+              <w:spacing w:after="40"/>
+            </w:pPr>
+            <w:r>
+              <w:rPr>
+                <w:rFonts w:ascii="Calibri" w:cs="Calibri" w:eastAsia="Calibri" w:hAnsi="Calibri"/>
+                <w:b/>
+                <w:bCs/>
+                <w:color w:val="9C2B1B"/>
+                <w:sz w:val="18"/>
+                <w:szCs w:val="18"/>
+              </w:rPr>
+              <w:t xml:space="preserve">COMPATÍVEL, NÃO ESTABELECE</w:t>
+            </w:r>
+          </w:p>
+        </w:tc>
+        <w:tc>
+          <w:tcPr>
+            <w:tcW w:type="dxa" w:w="4000"/>
+            <w:shd w:fill="F2F2F2" w:color="auto" w:val="clear"/>
+            <w:tcMar>
+              <w:top w:type="dxa" w:w="80"/>
+              <w:left w:type="dxa" w:w="100"/>
+              <w:bottom w:type="dxa" w:w="80"/>
+              <w:right w:type="dxa" w:w="100"/>
+            </w:tcMar>
+          </w:tcPr>
+          <w:p>
+            <w:r>
+              <w:rPr>
+                <w:rFonts w:ascii="Calibri" w:cs="Calibri" w:eastAsia="Calibri" w:hAnsi="Calibri"/>
+                <w:sz w:val="18"/>
+                <w:szCs w:val="18"/>
+              </w:rPr>
+              <w:t xml:space="preserve">Saída de modelo de Dinâmica de Sistemas da mesma linhagem deste trabalho</w:t>
+            </w:r>
+          </w:p>
+        </w:tc>
+      </w:tr>
+      <w:tr>
+        <w:trPr>
+          <w:cantSplit/>
+        </w:trPr>
+        <w:tc>
+          <w:tcPr>
+            <w:tcW w:type="dxa" w:w="3500"/>
+            <w:tcMar>
+              <w:top w:type="dxa" w:w="80"/>
+              <w:left w:type="dxa" w:w="100"/>
+              <w:bottom w:type="dxa" w:w="80"/>
+              <w:right w:type="dxa" w:w="100"/>
+            </w:tcMar>
+          </w:tcPr>
+          <w:p>
+            <w:r>
+              <w:rPr>
+                <w:rFonts w:ascii="Calibri" w:cs="Calibri" w:eastAsia="Calibri" w:hAnsi="Calibri"/>
+                <w:sz w:val="18"/>
+                <w:szCs w:val="18"/>
+              </w:rPr>
+              <w:t xml:space="preserve">k por atividade J60</w:t>
+            </w:r>
+          </w:p>
+        </w:tc>
+        <w:tc>
+          <w:tcPr>
+            <w:tcW w:type="dxa" w:w="2200"/>
+            <w:tcMar>
+              <w:top w:type="dxa" w:w="80"/>
+              <w:left w:type="dxa" w:w="100"/>
+              <w:bottom w:type="dxa" w:w="80"/>
+              <w:right w:type="dxa" w:w="100"/>
+            </w:tcMar>
+          </w:tcPr>
+          <w:p>
+            <w:pPr>
+              <w:spacing w:after="40"/>
+            </w:pPr>
+            <w:r>
+              <w:rPr>
+                <w:rFonts w:ascii="Calibri" w:cs="Calibri" w:eastAsia="Calibri" w:hAnsi="Calibri"/>
+                <w:b/>
+                <w:bCs/>
+                <w:color w:val="8A6300"/>
+                <w:sz w:val="18"/>
+                <w:szCs w:val="18"/>
+              </w:rPr>
+              <w:t xml:space="preserve">DECISÃO DE MODELAGEM</w:t>
+            </w:r>
+          </w:p>
+        </w:tc>
+        <w:tc>
+          <w:tcPr>
+            <w:tcW w:type="dxa" w:w="4000"/>
+            <w:tcMar>
+              <w:top w:type="dxa" w:w="80"/>
+              <w:left w:type="dxa" w:w="100"/>
+              <w:bottom w:type="dxa" w:w="80"/>
+              <w:right w:type="dxa" w:w="100"/>
+            </w:tcMar>
+          </w:tcPr>
+          <w:p>
+            <w:r>
+              <w:rPr>
+                <w:rFonts w:ascii="Calibri" w:cs="Calibri" w:eastAsia="Calibri" w:hAnsi="Calibri"/>
+                <w:sz w:val="18"/>
+                <w:szCs w:val="18"/>
+              </w:rPr>
+              <w:t xml:space="preserve">Sintético, varrido, preferencialmente k ≤ 8 (D-20)</w:t>
+            </w:r>
+          </w:p>
+        </w:tc>
+      </w:tr>
+      <w:tr>
+        <w:trPr>
+          <w:cantSplit/>
+        </w:trPr>
+        <w:tc>
+          <w:tcPr>
+            <w:tcW w:type="dxa" w:w="3500"/>
+            <w:shd w:fill="F2F2F2" w:color="auto" w:val="clear"/>
+            <w:tcMar>
+              <w:top w:type="dxa" w:w="80"/>
+              <w:left w:type="dxa" w:w="100"/>
+              <w:bottom w:type="dxa" w:w="80"/>
+              <w:right w:type="dxa" w:w="100"/>
+            </w:tcMar>
+          </w:tcPr>
+          <w:p>
+            <w:r>
+              <w:rPr>
+                <w:rFonts w:ascii="Calibri" w:cs="Calibri" w:eastAsia="Calibri" w:hAnsi="Calibri"/>
+                <w:sz w:val="18"/>
+                <w:szCs w:val="18"/>
+              </w:rPr>
+              <w:t xml:space="preserve">ρ_omissão = 0,35, faixa [0,20 ; 0,50]</w:t>
+            </w:r>
+          </w:p>
+        </w:tc>
+        <w:tc>
+          <w:tcPr>
+            <w:tcW w:type="dxa" w:w="2200"/>
+            <w:shd w:fill="F2F2F2" w:color="auto" w:val="clear"/>
+            <w:tcMar>
+              <w:top w:type="dxa" w:w="80"/>
+              <w:left w:type="dxa" w:w="100"/>
+              <w:bottom w:type="dxa" w:w="80"/>
+              <w:right w:type="dxa" w:w="100"/>
+            </w:tcMar>
+          </w:tcPr>
+          <w:p>
+            <w:pPr>
+              <w:spacing w:after="40"/>
+            </w:pPr>
+            <w:r>
+              <w:rPr>
+                <w:rFonts w:ascii="Calibri" w:cs="Calibri" w:eastAsia="Calibri" w:hAnsi="Calibri"/>
+                <w:b/>
+                <w:bCs/>
+                <w:color w:val="8A6300"/>
+                <w:sz w:val="18"/>
+                <w:szCs w:val="18"/>
+              </w:rPr>
+              <w:t xml:space="preserve">DECISÃO DE MODELAGEM</w:t>
+            </w:r>
+          </w:p>
+        </w:tc>
+        <w:tc>
+          <w:tcPr>
+            <w:tcW w:type="dxa" w:w="4000"/>
+            <w:shd w:fill="F2F2F2" w:color="auto" w:val="clear"/>
+            <w:tcMar>
+              <w:top w:type="dxa" w:w="80"/>
+              <w:left w:type="dxa" w:w="100"/>
+              <w:bottom w:type="dxa" w:w="80"/>
+              <w:right w:type="dxa" w:w="100"/>
+            </w:tcMar>
+          </w:tcPr>
+          <w:p>
+            <w:r>
+              <w:rPr>
+                <w:rFonts w:ascii="Calibri" w:cs="Calibri" w:eastAsia="Calibri" w:hAnsi="Calibri"/>
+                <w:sz w:val="18"/>
+                <w:szCs w:val="18"/>
+              </w:rPr>
+              <w:t xml:space="preserve">Derivada de dado humano de outro domínio (D-02)</w:t>
+            </w:r>
+          </w:p>
+        </w:tc>
+      </w:tr>
+      <w:tr>
+        <w:trPr>
+          <w:cantSplit/>
+        </w:trPr>
+        <w:tc>
+          <w:tcPr>
+            <w:tcW w:type="dxa" w:w="3500"/>
+            <w:tcMar>
+              <w:top w:type="dxa" w:w="80"/>
+              <w:left w:type="dxa" w:w="100"/>
+              <w:bottom w:type="dxa" w:w="80"/>
+              <w:right w:type="dxa" w:w="100"/>
+            </w:tcMar>
+          </w:tcPr>
+          <w:p>
+            <w:r>
+              <w:rPr>
+                <w:rFonts w:ascii="Calibri" w:cs="Calibri" w:eastAsia="Calibri" w:hAnsi="Calibri"/>
+                <w:sz w:val="18"/>
+                <w:szCs w:val="18"/>
+              </w:rPr>
+              <w:t xml:space="preserve">f_atalho</w:t>
+            </w:r>
+          </w:p>
+        </w:tc>
+        <w:tc>
+          <w:tcPr>
+            <w:tcW w:type="dxa" w:w="2200"/>
+            <w:tcMar>
+              <w:top w:type="dxa" w:w="80"/>
+              <w:left w:type="dxa" w:w="100"/>
+              <w:bottom w:type="dxa" w:w="80"/>
+              <w:right w:type="dxa" w:w="100"/>
+            </w:tcMar>
+          </w:tcPr>
+          <w:p>
+            <w:pPr>
+              <w:spacing w:after="40"/>
+            </w:pPr>
+            <w:r>
+              <w:rPr>
+                <w:rFonts w:ascii="Calibri" w:cs="Calibri" w:eastAsia="Calibri" w:hAnsi="Calibri"/>
+                <w:b/>
+                <w:bCs/>
+                <w:color w:val="9C2B1B"/>
+                <w:sz w:val="18"/>
+                <w:szCs w:val="18"/>
+              </w:rPr>
+              <w:t xml:space="preserve">DECISÃO SEM FONTE</w:t>
+            </w:r>
+          </w:p>
+        </w:tc>
+        <w:tc>
+          <w:tcPr>
+            <w:tcW w:type="dxa" w:w="4000"/>
+            <w:tcMar>
+              <w:top w:type="dxa" w:w="80"/>
+              <w:left w:type="dxa" w:w="100"/>
+              <w:bottom w:type="dxa" w:w="80"/>
+              <w:right w:type="dxa" w:w="100"/>
+            </w:tcMar>
+          </w:tcPr>
+          <w:p>
+            <w:r>
+              <w:rPr>
+                <w:rFonts w:ascii="Calibri" w:cs="Calibri" w:eastAsia="Calibri" w:hAnsi="Calibri"/>
+                <w:sz w:val="18"/>
+                <w:szCs w:val="18"/>
+              </w:rPr>
+              <w:t xml:space="preserve">Parâmetro de sensibilidade declarado (D-03)</w:t>
+            </w:r>
+          </w:p>
+        </w:tc>
+      </w:tr>
+      <w:tr>
+        <w:trPr>
+          <w:cantSplit/>
+        </w:trPr>
+        <w:tc>
+          <w:tcPr>
+            <w:tcW w:type="dxa" w:w="3500"/>
+            <w:shd w:fill="F2F2F2" w:color="auto" w:val="clear"/>
+            <w:tcMar>
+              <w:top w:type="dxa" w:w="80"/>
+              <w:left w:type="dxa" w:w="100"/>
+              <w:bottom w:type="dxa" w:w="80"/>
+              <w:right w:type="dxa" w:w="100"/>
+            </w:tcMar>
+          </w:tcPr>
+          <w:p>
+            <w:r>
+              <w:rPr>
+                <w:rFonts w:ascii="Calibri" w:cs="Calibri" w:eastAsia="Calibri" w:hAnsi="Calibri"/>
+                <w:sz w:val="18"/>
+                <w:szCs w:val="18"/>
+              </w:rPr>
+              <w:t xml:space="preserve">F_ancora de 0,15 a 0,25</w:t>
+            </w:r>
+          </w:p>
+        </w:tc>
+        <w:tc>
+          <w:tcPr>
+            <w:tcW w:type="dxa" w:w="2200"/>
+            <w:shd w:fill="F2F2F2" w:color="auto" w:val="clear"/>
+            <w:tcMar>
+              <w:top w:type="dxa" w:w="80"/>
+              <w:left w:type="dxa" w:w="100"/>
+              <w:bottom w:type="dxa" w:w="80"/>
+              <w:right w:type="dxa" w:w="100"/>
+            </w:tcMar>
+          </w:tcPr>
+          <w:p>
+            <w:pPr>
+              <w:spacing w:after="40"/>
+            </w:pPr>
+            <w:r>
+              <w:rPr>
+                <w:rFonts w:ascii="Calibri" w:cs="Calibri" w:eastAsia="Calibri" w:hAnsi="Calibri"/>
+                <w:b/>
+                <w:bCs/>
+                <w:color w:val="9C2B1B"/>
+                <w:sz w:val="18"/>
+                <w:szCs w:val="18"/>
+              </w:rPr>
+              <w:t xml:space="preserve">EXTRAPOLAÇÃO</w:t>
+            </w:r>
+          </w:p>
+        </w:tc>
+        <w:tc>
+          <w:tcPr>
+            <w:tcW w:type="dxa" w:w="4000"/>
+            <w:shd w:fill="F2F2F2" w:color="auto" w:val="clear"/>
+            <w:tcMar>
+              <w:top w:type="dxa" w:w="80"/>
+              <w:left w:type="dxa" w:w="100"/>
+              <w:bottom w:type="dxa" w:w="80"/>
+              <w:right w:type="dxa" w:w="100"/>
+            </w:tcMar>
+          </w:tcPr>
+          <w:p>
+            <w:r>
+              <w:rPr>
+                <w:rFonts w:ascii="Calibri" w:cs="Calibri" w:eastAsia="Calibri" w:hAnsi="Calibri"/>
+                <w:sz w:val="18"/>
+                <w:szCs w:val="18"/>
+              </w:rPr>
+              <w:t xml:space="preserve">Além do maior k publicado (D-15, R-11)</w:t>
+            </w:r>
+          </w:p>
+        </w:tc>
+      </w:tr>
+      <w:tr>
+        <w:trPr>
+          <w:cantSplit/>
+        </w:trPr>
+        <w:tc>
+          <w:tcPr>
+            <w:tcW w:type="dxa" w:w="3500"/>
+            <w:tcMar>
+              <w:top w:type="dxa" w:w="80"/>
+              <w:left w:type="dxa" w:w="100"/>
+              <w:bottom w:type="dxa" w:w="80"/>
+              <w:right w:type="dxa" w:w="100"/>
+            </w:tcMar>
+          </w:tcPr>
+          <w:p>
+            <w:r>
+              <w:rPr>
+                <w:rFonts w:ascii="Calibri" w:cs="Calibri" w:eastAsia="Calibri" w:hAnsi="Calibri"/>
+                <w:sz w:val="18"/>
+                <w:szCs w:val="18"/>
+              </w:rPr>
+              <w:t xml:space="preserve">Forma logística de p_heu; E = D·P/B; Di</w:t>
+            </w:r>
+          </w:p>
+        </w:tc>
+        <w:tc>
+          <w:tcPr>
+            <w:tcW w:type="dxa" w:w="2200"/>
+            <w:tcMar>
+              <w:top w:type="dxa" w:w="80"/>
+              <w:left w:type="dxa" w:w="100"/>
+              <w:bottom w:type="dxa" w:w="80"/>
+              <w:right w:type="dxa" w:w="100"/>
+            </w:tcMar>
+          </w:tcPr>
+          <w:p>
+            <w:pPr>
+              <w:spacing w:after="40"/>
+            </w:pPr>
+            <w:r>
+              <w:rPr>
+                <w:rFonts w:ascii="Calibri" w:cs="Calibri" w:eastAsia="Calibri" w:hAnsi="Calibri"/>
+                <w:b/>
+                <w:bCs/>
+                <w:color w:val="8A6300"/>
+                <w:sz w:val="18"/>
+                <w:szCs w:val="18"/>
+              </w:rPr>
+              <w:t xml:space="preserve">DECISÃO DE MODELAGEM</w:t>
+            </w:r>
+          </w:p>
+        </w:tc>
+        <w:tc>
+          <w:tcPr>
+            <w:tcW w:type="dxa" w:w="4000"/>
+            <w:tcMar>
+              <w:top w:type="dxa" w:w="80"/>
+              <w:left w:type="dxa" w:w="100"/>
+              <w:bottom w:type="dxa" w:w="80"/>
+              <w:right w:type="dxa" w:w="100"/>
+            </w:tcMar>
+          </w:tcPr>
+          <w:p>
+            <w:r>
+              <w:rPr>
+                <w:rFonts w:ascii="Calibri" w:cs="Calibri" w:eastAsia="Calibri" w:hAnsi="Calibri"/>
+                <w:sz w:val="18"/>
+                <w:szCs w:val="18"/>
+              </w:rPr>
+              <w:t xml:space="preserve">Escolhas do trabalho, não medidas</w:t>
+            </w:r>
+          </w:p>
+        </w:tc>
+      </w:tr>
+      <w:tr>
+        <w:trPr>
+          <w:cantSplit/>
+        </w:trPr>
+        <w:tc>
+          <w:tcPr>
+            <w:tcW w:type="dxa" w:w="3500"/>
+            <w:shd w:fill="F2F2F2" w:color="auto" w:val="clear"/>
+            <w:tcMar>
+              <w:top w:type="dxa" w:w="80"/>
+              <w:left w:type="dxa" w:w="100"/>
+              <w:bottom w:type="dxa" w:w="80"/>
+              <w:right w:type="dxa" w:w="100"/>
+            </w:tcMar>
+          </w:tcPr>
+          <w:p>
+            <w:r>
+              <w:rPr>
+                <w:rFonts w:ascii="Calibri" w:cs="Calibri" w:eastAsia="Calibri" w:hAnsi="Calibri"/>
+                <w:sz w:val="18"/>
+                <w:szCs w:val="18"/>
+              </w:rPr>
+              <w:t xml:space="preserve">p_reporte, p_deteccao, tau_inicial, tau_min</w:t>
+            </w:r>
+          </w:p>
+        </w:tc>
+        <w:tc>
+          <w:tcPr>
+            <w:tcW w:type="dxa" w:w="2200"/>
+            <w:shd w:fill="F2F2F2" w:color="auto" w:val="clear"/>
+            <w:tcMar>
+              <w:top w:type="dxa" w:w="80"/>
+              <w:left w:type="dxa" w:w="100"/>
+              <w:bottom w:type="dxa" w:w="80"/>
+              <w:right w:type="dxa" w:w="100"/>
+            </w:tcMar>
+          </w:tcPr>
+          <w:p>
+            <w:pPr>
+              <w:spacing w:after="40"/>
+            </w:pPr>
+            <w:r>
+              <w:rPr>
+                <w:rFonts w:ascii="Calibri" w:cs="Calibri" w:eastAsia="Calibri" w:hAnsi="Calibri"/>
+                <w:b/>
+                <w:bCs/>
+                <w:color w:val="8A6300"/>
+                <w:sz w:val="18"/>
+                <w:szCs w:val="18"/>
+              </w:rPr>
+              <w:t xml:space="preserve">PREMISSA DE CENÁRIO</w:t>
+            </w:r>
+          </w:p>
+        </w:tc>
+        <w:tc>
+          <w:tcPr>
+            <w:tcW w:type="dxa" w:w="4000"/>
+            <w:shd w:fill="F2F2F2" w:color="auto" w:val="clear"/>
+            <w:tcMar>
+              <w:top w:type="dxa" w:w="80"/>
+              <w:left w:type="dxa" w:w="100"/>
+              <w:bottom w:type="dxa" w:w="80"/>
+              <w:right w:type="dxa" w:w="100"/>
+            </w:tcMar>
+          </w:tcPr>
+          <w:p>
+            <w:r>
+              <w:rPr>
+                <w:rFonts w:ascii="Calibri" w:cs="Calibri" w:eastAsia="Calibri" w:hAnsi="Calibri"/>
+                <w:sz w:val="18"/>
+                <w:szCs w:val="18"/>
+              </w:rPr>
+              <w:t xml:space="preserve">Declaradas no YAML; governam a maior parte do contraste (A-13)</w:t>
+            </w:r>
+          </w:p>
+        </w:tc>
+      </w:tr>
+    </w:tbl>
+    <w:p>
+      <w:pPr>
+        <w:spacing w:after="120" w:before="0"/>
+      </w:pPr>
+      <w:r>
+        <w:rPr>
+          <w:rFonts w:ascii="Calibri" w:cs="Calibri" w:eastAsia="Calibri" w:hAnsi="Calibri"/>
+          <w:b/>
+          <w:bCs/>
+          <w:sz w:val="20"/>
+          <w:szCs w:val="20"/>
+        </w:rPr>
+        <w:t xml:space="preserve">Regra de ouro: nenhuma linha muda de classe sem que a mudança seja registrada aqui, com data e motivo. Uma decisão de modelagem que vira “resultado da literatura” sem esse registro é o erro que este documento existe para impedir.</w:t>
+      </w:r>
+    </w:p>
+    <w:p>
+      <w:pPr>
+        <w:pStyle w:val="Heading3"/>
+        <w:spacing w:after="100" w:before="220"/>
+      </w:pPr>
+      <w:r>
+        <w:rPr>
+          <w:rFonts w:ascii="Calibri" w:cs="Calibri" w:eastAsia="Calibri" w:hAnsi="Calibri"/>
+          <w:b/>
+          <w:bCs/>
+          <w:color w:val="333333"/>
+          <w:sz w:val="21"/>
+          <w:szCs w:val="21"/>
+        </w:rPr>
         <w:t xml:space="preserve">Quem é canônico para quê — leia antes de usar este arquivo</w:t>
       </w:r>
     </w:p>
@@ -3192,6 +5044,1265 @@
           <w:szCs w:val="20"/>
         </w:rPr>
         <w:t xml:space="preserve">uma rodada e duas linhas de código. Custo de descobrir depois: retirar um achado já redigido, defendido e possivelmente já apresentado.</w:t>
+      </w:r>
+    </w:p>
+    <w:p>
+      <w:pPr>
+        <w:pBdr>
+          <w:bottom w:val="single" w:color="D9A8C0" w:sz="6"/>
+        </w:pBdr>
+        <w:spacing w:after="160" w:before="60"/>
+      </w:pPr>
+      <w:r>
+        <w:rPr>
+          <w:sz w:val="2"/>
+          <w:szCs w:val="2"/>
+        </w:rPr>
+        <w:t xml:space="preserve"/>
+      </w:r>
+    </w:p>
+    <w:p>
+      <w:pPr>
+        <w:pStyle w:val="Heading2"/>
+        <w:spacing w:after="140" w:before="280"/>
+      </w:pPr>
+      <w:r>
+        <w:rPr>
+          <w:rFonts w:ascii="Calibri" w:cs="Calibri" w:eastAsia="Calibri" w:hAnsi="Calibri"/>
+          <w:b/>
+          <w:bCs/>
+          <w:color w:val="5E1B39"/>
+          <w:sz w:val="24"/>
+          <w:szCs w:val="24"/>
+        </w:rPr>
+        <w:t xml:space="preserve">D-15 — F_ancora ancorada em Stewart &amp; Melchers (1988), com recorte declarado</w:t>
+      </w:r>
+    </w:p>
+    <w:p>
+      <w:pPr>
+        <w:spacing w:after="70"/>
+        <w:ind w:left="200"/>
+      </w:pPr>
+      <w:r>
+        <w:rPr>
+          <w:rFonts w:ascii="Calibri" w:cs="Calibri" w:eastAsia="Calibri" w:hAnsi="Calibri"/>
+          <w:b/>
+          <w:bCs/>
+          <w:color w:val="1E6B3A"/>
+          <w:sz w:val="17"/>
+          <w:szCs w:val="17"/>
+        </w:rPr>
+        <w:t xml:space="preserve">FONTE SUSTENTA   </w:t>
+      </w:r>
+      <w:r>
+        <w:rPr>
+          <w:rFonts w:ascii="Calibri" w:cs="Calibri" w:eastAsia="Calibri" w:hAnsi="Calibri"/>
+          <w:sz w:val="20"/>
+          <w:szCs w:val="20"/>
+        </w:rPr>
+        <w:t xml:space="preserve">Tabela 1, p. 290: taxas medidas em engenheiros civis profissionais. Cálculo de 1, 2, 3, 4, 5 e 8 passos = 0,0128 / 0,0256 / 0,0384 / 0,0512 / 0,0640 / 0,1024 — relação linear exata com k, cobrindo </w:t>
+      </w:r>
+      <w:r>
+        <w:rPr>
+          <w:rFonts w:ascii="Calibri" w:cs="Calibri" w:eastAsia="Calibri" w:hAnsi="Calibri"/>
+          <w:b/>
+          <w:bCs/>
+          <w:sz w:val="20"/>
+          <w:szCs w:val="20"/>
+        </w:rPr>
+        <w:t xml:space="preserve">[0,0128 ; 0,1024]</w:t>
+      </w:r>
+      <w:r>
+        <w:rPr>
+          <w:rFonts w:ascii="Calibri" w:cs="Calibri" w:eastAsia="Calibri" w:hAnsi="Calibri"/>
+          <w:sz w:val="20"/>
+          <w:szCs w:val="20"/>
+        </w:rPr>
+        <w:t xml:space="preserve">. Consulta a tabela: 0,0126.</w:t>
+      </w:r>
+    </w:p>
+    <w:p>
+      <w:pPr>
+        <w:spacing w:after="70"/>
+        <w:ind w:left="200"/>
+      </w:pPr>
+      <w:r>
+        <w:rPr>
+          <w:rFonts w:ascii="Calibri" w:cs="Calibri" w:eastAsia="Calibri" w:hAnsi="Calibri"/>
+          <w:b/>
+          <w:bCs/>
+          <w:color w:val="9B2C5E"/>
+          <w:sz w:val="17"/>
+          <w:szCs w:val="17"/>
+        </w:rPr>
+        <w:t xml:space="preserve">DECISÃO DO MODELO   </w:t>
+      </w:r>
+      <w:r>
+        <w:rPr>
+          <w:rFonts w:ascii="Calibri" w:cs="Calibri" w:eastAsia="Calibri" w:hAnsi="Calibri"/>
+          <w:sz w:val="20"/>
+          <w:szCs w:val="20"/>
+        </w:rPr>
+        <w:t xml:space="preserve">Ancorar a probabilidade basal de erro por atividade nessas taxas, em vez de faixa a priori. Dos cinco valores varridos, </w:t>
+      </w:r>
+      <w:r>
+        <w:rPr>
+          <w:rFonts w:ascii="Calibri" w:cs="Calibri" w:eastAsia="Calibri" w:hAnsi="Calibri"/>
+          <w:b/>
+          <w:bCs/>
+          <w:sz w:val="20"/>
+          <w:szCs w:val="20"/>
+        </w:rPr>
+        <w:t xml:space="preserve">0,05 e 0,10 ficam ancorados</w:t>
+      </w:r>
+      <w:r>
+        <w:rPr>
+          <w:rFonts w:ascii="Calibri" w:cs="Calibri" w:eastAsia="Calibri" w:hAnsi="Calibri"/>
+          <w:sz w:val="20"/>
+          <w:szCs w:val="20"/>
+        </w:rPr>
+        <w:t xml:space="preserve"> (k ≈ 3,9 e 7,8); 0,15 a 0,25 entram como </w:t>
+      </w:r>
+      <w:r>
+        <w:rPr>
+          <w:rFonts w:ascii="Calibri" w:cs="Calibri" w:eastAsia="Calibri" w:hAnsi="Calibri"/>
+          <w:b/>
+          <w:bCs/>
+          <w:sz w:val="20"/>
+          <w:szCs w:val="20"/>
+        </w:rPr>
+        <w:t xml:space="preserve">cenário de sensibilidade</w:t>
+      </w:r>
+      <w:r>
+        <w:rPr>
+          <w:rFonts w:ascii="Calibri" w:cs="Calibri" w:eastAsia="Calibri" w:hAnsi="Calibri"/>
+          <w:sz w:val="20"/>
+          <w:szCs w:val="20"/>
+        </w:rPr>
+        <w:t xml:space="preserve">.</w:t>
+      </w:r>
+    </w:p>
+    <w:p>
+      <w:pPr>
+        <w:spacing w:after="120"/>
+        <w:ind w:left="200"/>
+      </w:pPr>
+      <w:r>
+        <w:rPr>
+          <w:rFonts w:ascii="Calibri" w:cs="Calibri" w:eastAsia="Calibri" w:hAnsi="Calibri"/>
+          <w:b/>
+          <w:bCs/>
+          <w:color w:val="9C2B1B"/>
+          <w:sz w:val="17"/>
+          <w:szCs w:val="17"/>
+        </w:rPr>
+        <w:t xml:space="preserve">NÃO SUSTENTA   </w:t>
+      </w:r>
+      <w:r>
+        <w:rPr>
+          <w:rFonts w:ascii="Calibri" w:cs="Calibri" w:eastAsia="Calibri" w:hAnsi="Calibri"/>
+          <w:sz w:val="20"/>
+          <w:szCs w:val="20"/>
+        </w:rPr>
+        <w:t xml:space="preserve">Extrapolar a linearidade acima de k = 8, que é o maior número de passos publicado. E a linearidade é </w:t>
+      </w:r>
+      <w:r>
+        <w:rPr>
+          <w:rFonts w:ascii="Calibri" w:cs="Calibri" w:eastAsia="Calibri" w:hAnsi="Calibri"/>
+          <w:b/>
+          <w:bCs/>
+          <w:sz w:val="20"/>
+          <w:szCs w:val="20"/>
+        </w:rPr>
+        <w:t xml:space="preserve">empírica nos pontos medidos</w:t>
+      </w:r>
+      <w:r>
+        <w:rPr>
+          <w:rFonts w:ascii="Calibri" w:cs="Calibri" w:eastAsia="Calibri" w:hAnsi="Calibri"/>
+          <w:sz w:val="20"/>
+          <w:szCs w:val="20"/>
+        </w:rPr>
+        <w:t xml:space="preserve"> — os autores não a derivam de composição alguma (ver R-14).</w:t>
+      </w:r>
+    </w:p>
+    <w:p>
+      <w:pPr>
+        <w:spacing w:after="90"/>
+        <w:ind w:left="200"/>
+      </w:pPr>
+      <w:r>
+        <w:rPr>
+          <w:rFonts w:ascii="Calibri" w:cs="Calibri" w:eastAsia="Calibri" w:hAnsi="Calibri"/>
+          <w:b/>
+          <w:bCs/>
+          <w:color w:val="9B2C5E"/>
+          <w:sz w:val="20"/>
+          <w:szCs w:val="20"/>
+        </w:rPr>
+        <w:t xml:space="preserve">Ressalva de amostra:  </w:t>
+      </w:r>
+      <w:r>
+        <w:rPr>
+          <w:rFonts w:ascii="Calibri" w:cs="Calibri" w:eastAsia="Calibri" w:hAnsi="Calibri"/>
+          <w:sz w:val="20"/>
+          <w:szCs w:val="20"/>
+        </w:rPr>
+        <w:t xml:space="preserve">o p_av = 0,0163 de Stewart (1992) vem de um conjunto que descartou deliberadamente as tarefas de cálculo de quatro e cinco passos, para igualar dificuldade. 0,0163 e 0,0128 são de amostras relacionadas, não idênticas — não misturar numa mesma conta sem declarar.</w:t>
+      </w:r>
+    </w:p>
+    <w:p>
+      <w:pPr>
+        <w:spacing w:after="90"/>
+        <w:ind w:left="200"/>
+      </w:pPr>
+      <w:r>
+        <w:rPr>
+          <w:rFonts w:ascii="Calibri" w:cs="Calibri" w:eastAsia="Calibri" w:hAnsi="Calibri"/>
+          <w:b/>
+          <w:bCs/>
+          <w:color w:val="9B2C5E"/>
+          <w:sz w:val="20"/>
+          <w:szCs w:val="20"/>
+        </w:rPr>
+        <w:t xml:space="preserve">O que continua aberto:  </w:t>
+      </w:r>
+      <w:r>
+        <w:rPr>
+          <w:rFonts w:ascii="Calibri" w:cs="Calibri" w:eastAsia="Calibri" w:hAnsi="Calibri"/>
+          <w:sz w:val="20"/>
+          <w:szCs w:val="20"/>
+        </w:rPr>
+        <w:t xml:space="preserve">o elo atividade J60 → k. Ninguém publica quantos passos elementares tem uma atividade abstrata do PSPLIB. É o único ponto onde a autorização para dados sintéticos se aplica, e a decomposição deve preferencialmente cair dentro de k ≤ 8, onde há dado.</w:t>
+      </w:r>
+    </w:p>
+    <w:p>
+      <w:pPr>
+        <w:pBdr>
+          <w:bottom w:val="single" w:color="D9A8C0" w:sz="6"/>
+        </w:pBdr>
+        <w:spacing w:after="160" w:before="60"/>
+      </w:pPr>
+      <w:r>
+        <w:rPr>
+          <w:sz w:val="2"/>
+          <w:szCs w:val="2"/>
+        </w:rPr>
+        <w:t xml:space="preserve"/>
+      </w:r>
+    </w:p>
+    <w:p>
+      <w:pPr>
+        <w:pStyle w:val="Heading2"/>
+        <w:spacing w:after="140" w:before="280"/>
+      </w:pPr>
+      <w:r>
+        <w:rPr>
+          <w:rFonts w:ascii="Calibri" w:cs="Calibri" w:eastAsia="Calibri" w:hAnsi="Calibri"/>
+          <w:b/>
+          <w:bCs/>
+          <w:color w:val="5E1B39"/>
+          <w:sz w:val="24"/>
+          <w:szCs w:val="24"/>
+        </w:rPr>
+        <w:t xml:space="preserve">D-16 — Heterogeneidade de taxa de erro entre agentes (CV = 1,13)</w:t>
+      </w:r>
+    </w:p>
+    <w:p>
+      <w:pPr>
+        <w:spacing w:after="70"/>
+        <w:ind w:left="200"/>
+      </w:pPr>
+      <w:r>
+        <w:rPr>
+          <w:rFonts w:ascii="Calibri" w:cs="Calibri" w:eastAsia="Calibri" w:hAnsi="Calibri"/>
+          <w:b/>
+          <w:bCs/>
+          <w:color w:val="1E6B3A"/>
+          <w:sz w:val="17"/>
+          <w:szCs w:val="17"/>
+        </w:rPr>
+        <w:t xml:space="preserve">FONTE SUSTENTA   </w:t>
+      </w:r>
+      <w:r>
+        <w:rPr>
+          <w:rFonts w:ascii="Calibri" w:cs="Calibri" w:eastAsia="Calibri" w:hAnsi="Calibri"/>
+          <w:sz w:val="20"/>
+          <w:szCs w:val="20"/>
+        </w:rPr>
+        <w:t xml:space="preserve">Stewart 1992, p. 174: beta-binomial ajustada aos dados com μ = 0,0163 e σ² = 0,00034, dando V = σ/μ = 1,13 — que o autor declara poder ser assumido constante para qualquer taxa média. Parâmetros α = 0,7546 e β = 45,4563.</w:t>
+      </w:r>
+    </w:p>
+    <w:p>
+      <w:pPr>
+        <w:spacing w:after="70"/>
+        <w:ind w:left="200"/>
+      </w:pPr>
+      <w:r>
+        <w:rPr>
+          <w:rFonts w:ascii="Calibri" w:cs="Calibri" w:eastAsia="Calibri" w:hAnsi="Calibri"/>
+          <w:b/>
+          <w:bCs/>
+          <w:color w:val="9B2C5E"/>
+          <w:sz w:val="17"/>
+          <w:szCs w:val="17"/>
+        </w:rPr>
+        <w:t xml:space="preserve">DECISÃO DO MODELO   </w:t>
+      </w:r>
+      <w:r>
+        <w:rPr>
+          <w:rFonts w:ascii="Calibri" w:cs="Calibri" w:eastAsia="Calibri" w:hAnsi="Calibri"/>
+          <w:sz w:val="20"/>
+          <w:szCs w:val="20"/>
+        </w:rPr>
+        <w:t xml:space="preserve">Introduzir variação entre agentes na taxa basal de erro, com distribuição Beta de coeficiente de variação 1,13, como alternativa preservada. O nominal histórico permanece.</w:t>
+      </w:r>
+    </w:p>
+    <w:p>
+      <w:pPr>
+        <w:spacing w:after="120"/>
+        <w:ind w:left="200"/>
+      </w:pPr>
+      <w:r>
+        <w:rPr>
+          <w:rFonts w:ascii="Calibri" w:cs="Calibri" w:eastAsia="Calibri" w:hAnsi="Calibri"/>
+          <w:b/>
+          <w:bCs/>
+          <w:color w:val="9C2B1B"/>
+          <w:sz w:val="17"/>
+          <w:szCs w:val="17"/>
+        </w:rPr>
+        <w:t xml:space="preserve">NÃO SUSTENTA   </w:t>
+      </w:r>
+      <w:r>
+        <w:rPr>
+          <w:rFonts w:ascii="Calibri" w:cs="Calibri" w:eastAsia="Calibri" w:hAnsi="Calibri"/>
+          <w:sz w:val="20"/>
+          <w:szCs w:val="20"/>
+        </w:rPr>
+        <w:t xml:space="preserve">Que a heterogeneidade observada em microtarefas individuais de escritório de projeto se transfira sem mudança para agentes que executam atividades inteiras do J60. A forma da distribuição é adotada; a escala é hipótese nossa.</w:t>
+      </w:r>
+    </w:p>
+    <w:p>
+      <w:pPr>
+        <w:spacing w:after="90"/>
+        <w:ind w:left="200"/>
+      </w:pPr>
+      <w:r>
+        <w:rPr>
+          <w:rFonts w:ascii="Calibri" w:cs="Calibri" w:eastAsia="Calibri" w:hAnsi="Calibri"/>
+          <w:b/>
+          <w:bCs/>
+          <w:color w:val="9B2C5E"/>
+          <w:sz w:val="20"/>
+          <w:szCs w:val="20"/>
+        </w:rPr>
+        <w:t xml:space="preserve">Por que importa:  </w:t>
+      </w:r>
+      <w:r>
+        <w:rPr>
+          <w:rFonts w:ascii="Calibri" w:cs="Calibri" w:eastAsia="Calibri" w:hAnsi="Calibri"/>
+          <w:sz w:val="20"/>
+          <w:szCs w:val="20"/>
+        </w:rPr>
+        <w:t xml:space="preserve">o modelo não tem heterogeneidade nenhuma na taxa de erro entre agentes — F_base é por nível de tarefa e R_error é global. É a primeira heterogeneidade empiricamente ancorada do trabalho, e vem do domínio certo.</w:t>
+      </w:r>
+    </w:p>
+    <w:p>
+      <w:pPr>
+        <w:pBdr>
+          <w:bottom w:val="single" w:color="D9A8C0" w:sz="6"/>
+        </w:pBdr>
+        <w:spacing w:after="160" w:before="60"/>
+      </w:pPr>
+      <w:r>
+        <w:rPr>
+          <w:sz w:val="2"/>
+          <w:szCs w:val="2"/>
+        </w:rPr>
+        <w:t xml:space="preserve"/>
+      </w:r>
+    </w:p>
+    <w:p>
+      <w:pPr>
+        <w:pStyle w:val="Heading2"/>
+        <w:spacing w:after="140" w:before="280"/>
+      </w:pPr>
+      <w:r>
+        <w:rPr>
+          <w:rFonts w:ascii="Calibri" w:cs="Calibri" w:eastAsia="Calibri" w:hAnsi="Calibri"/>
+          <w:b/>
+          <w:bCs/>
+          <w:color w:val="5E1B39"/>
+          <w:sz w:val="24"/>
+          <w:szCs w:val="24"/>
+        </w:rPr>
+        <w:t xml:space="preserve">D-17 — A não independência entre erros vira fator de sensibilidade</w:t>
+      </w:r>
+    </w:p>
+    <w:p>
+      <w:pPr>
+        <w:spacing w:after="70"/>
+        <w:ind w:left="200"/>
+      </w:pPr>
+      <w:r>
+        <w:rPr>
+          <w:rFonts w:ascii="Calibri" w:cs="Calibri" w:eastAsia="Calibri" w:hAnsi="Calibri"/>
+          <w:b/>
+          <w:bCs/>
+          <w:color w:val="1E6B3A"/>
+          <w:sz w:val="17"/>
+          <w:szCs w:val="17"/>
+        </w:rPr>
+        <w:t xml:space="preserve">FONTE SUSTENTA   </w:t>
+      </w:r>
+      <w:r>
+        <w:rPr>
+          <w:rFonts w:ascii="Calibri" w:cs="Calibri" w:eastAsia="Calibri" w:hAnsi="Calibri"/>
+          <w:sz w:val="20"/>
+          <w:szCs w:val="20"/>
+        </w:rPr>
+        <w:t xml:space="preserve">Stewart 1992, Tabela 2, p. 175: binomial χ² = 10,174 contra crítico 5,991 — independência rejeitada em α = 0,05. Beta-binomial χ² = 0,162; binomial p-dependente χ² = 0,583, com p_x = φ·p_av·x e φ = 0,845.</w:t>
+      </w:r>
+    </w:p>
+    <w:p>
+      <w:pPr>
+        <w:spacing w:after="70"/>
+        <w:ind w:left="200"/>
+      </w:pPr>
+      <w:r>
+        <w:rPr>
+          <w:rFonts w:ascii="Calibri" w:cs="Calibri" w:eastAsia="Calibri" w:hAnsi="Calibri"/>
+          <w:b/>
+          <w:bCs/>
+          <w:color w:val="9B2C5E"/>
+          <w:sz w:val="17"/>
+          <w:szCs w:val="17"/>
+        </w:rPr>
+        <w:t xml:space="preserve">DECISÃO DO MODELO   </w:t>
+      </w:r>
+      <w:r>
+        <w:rPr>
+          <w:rFonts w:ascii="Calibri" w:cs="Calibri" w:eastAsia="Calibri" w:hAnsi="Calibri"/>
+          <w:sz w:val="20"/>
+          <w:szCs w:val="20"/>
+        </w:rPr>
+        <w:t xml:space="preserve">Rodar alternativa com correlação intraindividual e reportar o efeito sobre os cinco indicadores, em vez de manter a independência como hipótese silenciosa.</w:t>
+      </w:r>
+    </w:p>
+    <w:p>
+      <w:pPr>
+        <w:spacing w:after="120"/>
+        <w:ind w:left="200"/>
+      </w:pPr>
+      <w:r>
+        <w:rPr>
+          <w:rFonts w:ascii="Calibri" w:cs="Calibri" w:eastAsia="Calibri" w:hAnsi="Calibri"/>
+          <w:b/>
+          <w:bCs/>
+          <w:color w:val="9C2B1B"/>
+          <w:sz w:val="17"/>
+          <w:szCs w:val="17"/>
+        </w:rPr>
+        <w:t xml:space="preserve">NÃO SUSTENTA   </w:t>
+      </w:r>
+      <w:r>
+        <w:rPr>
+          <w:rFonts w:ascii="Calibri" w:cs="Calibri" w:eastAsia="Calibri" w:hAnsi="Calibri"/>
+          <w:sz w:val="20"/>
+          <w:szCs w:val="20"/>
+        </w:rPr>
+        <w:t xml:space="preserve">Que a magnitude do efeito seja universal. Os aumentos de probabilidade de falha são daquela análise de confiabilidade específica (viga de aço de pórtico), com dois procedimentos de projeto — não uma lei geral aplicável a este simulador.</w:t>
+      </w:r>
+    </w:p>
+    <w:p>
+      <w:pPr>
+        <w:spacing w:after="90"/>
+        <w:ind w:left="200"/>
+      </w:pPr>
+      <w:r>
+        <w:rPr>
+          <w:rFonts w:ascii="Calibri" w:cs="Calibri" w:eastAsia="Calibri" w:hAnsi="Calibri"/>
+          <w:b/>
+          <w:bCs/>
+          <w:color w:val="9B2C5E"/>
+          <w:sz w:val="20"/>
+          <w:szCs w:val="20"/>
+        </w:rPr>
+        <w:t xml:space="preserve">Magnitude — citar a tabela, não o resumo:  </w:t>
+      </w:r>
+      <w:r>
+        <w:rPr>
+          <w:rFonts w:ascii="Calibri" w:cs="Calibri" w:eastAsia="Calibri" w:hAnsi="Calibri"/>
+          <w:sz w:val="20"/>
+          <w:szCs w:val="20"/>
+        </w:rPr>
+        <w:t xml:space="preserve">o texto de Stewart resume aumentos de </w:t>
+      </w:r>
+      <w:r>
+        <w:rPr>
+          <w:rFonts w:ascii="Calibri" w:cs="Calibri" w:eastAsia="Calibri" w:hAnsi="Calibri"/>
+          <w:i/>
+          <w:iCs/>
+          <w:sz w:val="20"/>
+          <w:szCs w:val="20"/>
+        </w:rPr>
+        <w:t xml:space="preserve">aproximadamente 20–30% e 50%</w:t>
+      </w:r>
+      <w:r>
+        <w:rPr>
+          <w:rFonts w:ascii="Calibri" w:cs="Calibri" w:eastAsia="Calibri" w:hAnsi="Calibri"/>
+          <w:sz w:val="20"/>
+          <w:szCs w:val="20"/>
+        </w:rPr>
+        <w:t xml:space="preserve"> na probabilidade de falha. O recálculo direto da Tabela 3 (p. 177), feito pelo revisor, dá </w:t>
+      </w:r>
+      <w:r>
+        <w:rPr>
+          <w:rFonts w:ascii="Calibri" w:cs="Calibri" w:eastAsia="Calibri" w:hAnsi="Calibri"/>
+          <w:b/>
+          <w:bCs/>
+          <w:sz w:val="20"/>
+          <w:szCs w:val="20"/>
+        </w:rPr>
+        <w:t xml:space="preserve">27,0% e 43,7%</w:t>
+      </w:r>
+      <w:r>
+        <w:rPr>
+          <w:rFonts w:ascii="Calibri" w:cs="Calibri" w:eastAsia="Calibri" w:hAnsi="Calibri"/>
+          <w:sz w:val="20"/>
+          <w:szCs w:val="20"/>
+        </w:rPr>
+        <w:t xml:space="preserve"> para a beta-binomial e </w:t>
+      </w:r>
+      <w:r>
+        <w:rPr>
+          <w:rFonts w:ascii="Calibri" w:cs="Calibri" w:eastAsia="Calibri" w:hAnsi="Calibri"/>
+          <w:b/>
+          <w:bCs/>
+          <w:sz w:val="20"/>
+          <w:szCs w:val="20"/>
+        </w:rPr>
+        <w:t xml:space="preserve">94,2% e 110,7%</w:t>
+      </w:r>
+      <w:r>
+        <w:rPr>
+          <w:rFonts w:ascii="Calibri" w:cs="Calibri" w:eastAsia="Calibri" w:hAnsi="Calibri"/>
+          <w:sz w:val="20"/>
+          <w:szCs w:val="20"/>
+        </w:rPr>
+        <w:t xml:space="preserve"> para a p-dependente, nos dois procedimentos publicados. Registrar as duas coisas e deixar explícito que o recálculo é nosso — não corrigir o autor em silêncio.</w:t>
+      </w:r>
+    </w:p>
+    <w:p>
+      <w:pPr>
+        <w:spacing w:after="90"/>
+        <w:ind w:left="200"/>
+      </w:pPr>
+      <w:r>
+        <w:rPr>
+          <w:rFonts w:ascii="Calibri" w:cs="Calibri" w:eastAsia="Calibri" w:hAnsi="Calibri"/>
+          <w:b/>
+          <w:bCs/>
+          <w:color w:val="9B2C5E"/>
+          <w:sz w:val="20"/>
+          <w:szCs w:val="20"/>
+        </w:rPr>
+        <w:t xml:space="preserve">Escopo:  </w:t>
+      </w:r>
+      <w:r>
+        <w:rPr>
+          <w:rFonts w:ascii="Calibri" w:cs="Calibri" w:eastAsia="Calibri" w:hAnsi="Calibri"/>
+          <w:sz w:val="20"/>
+          <w:szCs w:val="20"/>
+        </w:rPr>
+        <w:t xml:space="preserve">os aumentos são daquela análise de confiabilidade específica (viga de aço de pórtico), não lei geral.</w:t>
+      </w:r>
+    </w:p>
+    <w:p>
+      <w:pPr>
+        <w:pBdr>
+          <w:bottom w:val="single" w:color="D9A8C0" w:sz="6"/>
+        </w:pBdr>
+        <w:spacing w:after="160" w:before="60"/>
+      </w:pPr>
+      <w:r>
+        <w:rPr>
+          <w:sz w:val="2"/>
+          <w:szCs w:val="2"/>
+        </w:rPr>
+        <w:t xml:space="preserve"/>
+      </w:r>
+    </w:p>
+    <w:p>
+      <w:pPr>
+        <w:pStyle w:val="Heading2"/>
+        <w:spacing w:after="140" w:before="280"/>
+      </w:pPr>
+      <w:r>
+        <w:rPr>
+          <w:rFonts w:ascii="Calibri" w:cs="Calibri" w:eastAsia="Calibri" w:hAnsi="Calibri"/>
+          <w:b/>
+          <w:bCs/>
+          <w:color w:val="5E1B39"/>
+          <w:sz w:val="24"/>
+          <w:szCs w:val="24"/>
+        </w:rPr>
+        <w:t xml:space="preserve">D-18 — Rieskamp restringe a seleção de estratégia, não o erro direto</w:t>
+      </w:r>
+    </w:p>
+    <w:p>
+      <w:pPr>
+        <w:spacing w:after="90"/>
+        <w:ind w:left="200"/>
+      </w:pPr>
+      <w:r>
+        <w:rPr>
+          <w:rFonts w:ascii="Calibri" w:cs="Calibri" w:eastAsia="Calibri" w:hAnsi="Calibri"/>
+          <w:b/>
+          <w:bCs/>
+          <w:color w:val="9B2C5E"/>
+          <w:sz w:val="20"/>
+          <w:szCs w:val="20"/>
+        </w:rPr>
+        <w:t xml:space="preserve">Decisão:  </w:t>
+      </w:r>
+      <w:r>
+        <w:rPr>
+          <w:rFonts w:ascii="Calibri" w:cs="Calibri" w:eastAsia="Calibri" w:hAnsi="Calibri"/>
+          <w:sz w:val="20"/>
+          <w:szCs w:val="20"/>
+        </w:rPr>
+        <w:t xml:space="preserve">O modelo tem </w:t>
+      </w:r>
+      <w:r>
+        <w:rPr>
+          <w:rFonts w:ascii="Calibri" w:cs="Calibri" w:eastAsia="Calibri" w:hAnsi="Calibri"/>
+          <w:b/>
+          <w:bCs/>
+          <w:sz w:val="20"/>
+          <w:szCs w:val="20"/>
+        </w:rPr>
+        <w:t xml:space="preserve">dois canais</w:t>
+      </w:r>
+      <w:r>
+        <w:rPr>
+          <w:rFonts w:ascii="Calibri" w:cs="Calibri" w:eastAsia="Calibri" w:hAnsi="Calibri"/>
+          <w:sz w:val="20"/>
+          <w:szCs w:val="20"/>
+        </w:rPr>
+        <w:t xml:space="preserve"> da pressão para o erro, e eles passam a ser tratados separadamente no texto: </w:t>
+      </w:r>
+      <w:r>
+        <w:rPr>
+          <w:rFonts w:ascii="Calibri" w:cs="Calibri" w:eastAsia="Calibri" w:hAnsi="Calibri"/>
+          <w:i/>
+          <w:iCs/>
+          <w:sz w:val="20"/>
+          <w:szCs w:val="20"/>
+        </w:rPr>
+        <w:t xml:space="preserve">p_heu = σ((E − τ_sat)/s)</w:t>
+      </w:r>
+      <w:r>
+        <w:rPr>
+          <w:rFonts w:ascii="Calibri" w:cs="Calibri" w:eastAsia="Calibri" w:hAnsi="Calibri"/>
+          <w:sz w:val="20"/>
+          <w:szCs w:val="20"/>
+        </w:rPr>
+        <w:t xml:space="preserve"> é </w:t>
+      </w:r>
+      <w:r>
+        <w:rPr>
+          <w:rFonts w:ascii="Calibri" w:cs="Calibri" w:eastAsia="Calibri" w:hAnsi="Calibri"/>
+          <w:b/>
+          <w:bCs/>
+          <w:sz w:val="20"/>
+          <w:szCs w:val="20"/>
+        </w:rPr>
+        <w:t xml:space="preserve">seleção de estratégia</w:t>
+      </w:r>
+      <w:r>
+        <w:rPr>
+          <w:rFonts w:ascii="Calibri" w:cs="Calibri" w:eastAsia="Calibri" w:hAnsi="Calibri"/>
+          <w:sz w:val="20"/>
+          <w:szCs w:val="20"/>
+        </w:rPr>
+        <w:t xml:space="preserve"> e tem apoio empírico; </w:t>
+      </w:r>
+      <w:r>
+        <w:rPr>
+          <w:rFonts w:ascii="Calibri" w:cs="Calibri" w:eastAsia="Calibri" w:hAnsi="Calibri"/>
+          <w:i/>
+          <w:iCs/>
+          <w:sz w:val="20"/>
+          <w:szCs w:val="20"/>
+        </w:rPr>
+        <w:t xml:space="preserve">R_error·(1 − μ_cog)</w:t>
+      </w:r>
+      <w:r>
+        <w:rPr>
+          <w:rFonts w:ascii="Calibri" w:cs="Calibri" w:eastAsia="Calibri" w:hAnsi="Calibri"/>
+          <w:sz w:val="20"/>
+          <w:szCs w:val="20"/>
+        </w:rPr>
+        <w:t xml:space="preserve"> é </w:t>
+      </w:r>
+      <w:r>
+        <w:rPr>
+          <w:rFonts w:ascii="Calibri" w:cs="Calibri" w:eastAsia="Calibri" w:hAnsi="Calibri"/>
+          <w:b/>
+          <w:bCs/>
+          <w:sz w:val="20"/>
+          <w:szCs w:val="20"/>
+        </w:rPr>
+        <w:t xml:space="preserve">erro direto</w:t>
+      </w:r>
+      <w:r>
+        <w:rPr>
+          <w:rFonts w:ascii="Calibri" w:cs="Calibri" w:eastAsia="Calibri" w:hAnsi="Calibri"/>
+          <w:sz w:val="20"/>
+          <w:szCs w:val="20"/>
+        </w:rPr>
+        <w:t xml:space="preserve"> e não tem apoio de campo.</w:t>
+      </w:r>
+    </w:p>
+    <w:p>
+      <w:pPr>
+        <w:spacing w:after="70"/>
+        <w:ind w:left="200"/>
+      </w:pPr>
+      <w:r>
+        <w:rPr>
+          <w:rFonts w:ascii="Calibri" w:cs="Calibri" w:eastAsia="Calibri" w:hAnsi="Calibri"/>
+          <w:b/>
+          <w:bCs/>
+          <w:color w:val="1E6B3A"/>
+          <w:sz w:val="17"/>
+          <w:szCs w:val="17"/>
+        </w:rPr>
+        <w:t xml:space="preserve">FONTE SUSTENTA   </w:t>
+      </w:r>
+      <w:r>
+        <w:rPr>
+          <w:rFonts w:ascii="Calibri" w:cs="Calibri" w:eastAsia="Calibri" w:hAnsi="Calibri"/>
+          <w:sz w:val="20"/>
+          <w:szCs w:val="20"/>
+        </w:rPr>
+        <w:t xml:space="preserve">Rieskamp &amp; Hoffrage 2008, Estudo 2, p. 266–267: dos 36 participantes, 7 (19,4%) classificados com estratégia não compensatória sob baixa pressão e 16 (44,4%) sob alta — 11 dos 29 compensatórios migraram, e apenas 2 dos 7 não compensatórios voltaram. McNemar p = 0,02.</w:t>
+      </w:r>
+    </w:p>
+    <w:p>
+      <w:pPr>
+        <w:spacing w:after="70"/>
+        <w:ind w:left="200"/>
+      </w:pPr>
+      <w:r>
+        <w:rPr>
+          <w:rFonts w:ascii="Calibri" w:cs="Calibri" w:eastAsia="Calibri" w:hAnsi="Calibri"/>
+          <w:b/>
+          <w:bCs/>
+          <w:color w:val="9B2C5E"/>
+          <w:sz w:val="17"/>
+          <w:szCs w:val="17"/>
+        </w:rPr>
+        <w:t xml:space="preserve">DECISÃO DO MODELO   </w:t>
+      </w:r>
+      <w:r>
+        <w:rPr>
+          <w:rFonts w:ascii="Calibri" w:cs="Calibri" w:eastAsia="Calibri" w:hAnsi="Calibri"/>
+          <w:sz w:val="20"/>
+          <w:szCs w:val="20"/>
+        </w:rPr>
+        <w:t xml:space="preserve">Tratar p_heu e R_error·(1 − μ_cog) como canais separados no texto e nos testes. Usar o contraste apenas como MUDANÇA RELATIVA (2,3×, ou +25 p.p.) em faixa de sensibilidade declarada.</w:t>
+      </w:r>
+    </w:p>
+    <w:p>
+      <w:pPr>
+        <w:spacing w:after="120"/>
+        <w:ind w:left="200"/>
+      </w:pPr>
+      <w:r>
+        <w:rPr>
+          <w:rFonts w:ascii="Calibri" w:cs="Calibri" w:eastAsia="Calibri" w:hAnsi="Calibri"/>
+          <w:b/>
+          <w:bCs/>
+          <w:color w:val="9C2B1B"/>
+          <w:sz w:val="17"/>
+          <w:szCs w:val="17"/>
+        </w:rPr>
+        <w:t xml:space="preserve">NÃO SUSTENTA   </w:t>
+      </w:r>
+      <w:r>
+        <w:rPr>
+          <w:rFonts w:ascii="Calibri" w:cs="Calibri" w:eastAsia="Calibri" w:hAnsi="Calibri"/>
+          <w:sz w:val="20"/>
+          <w:szCs w:val="20"/>
+        </w:rPr>
+        <w:t xml:space="preserve">Uma taxa absoluta de Porta 1: a unidade é </w:t>
+      </w:r>
+      <w:r>
+        <w:rPr>
+          <w:rFonts w:ascii="Calibri" w:cs="Calibri" w:eastAsia="Calibri" w:hAnsi="Calibri"/>
+          <w:b/>
+          <w:bCs/>
+          <w:sz w:val="20"/>
+          <w:szCs w:val="20"/>
+        </w:rPr>
+        <w:t xml:space="preserve">participante classificado</w:t>
+      </w:r>
+      <w:r>
+        <w:rPr>
+          <w:rFonts w:ascii="Calibri" w:cs="Calibri" w:eastAsia="Calibri" w:hAnsi="Calibri"/>
+          <w:sz w:val="20"/>
+          <w:szCs w:val="20"/>
+        </w:rPr>
+        <w:t xml:space="preserve">, não execução de tarefa — comparar com os 67,4% / 57,9% do modelo é descasamento de denominador. Também não sustenta efeito sobre erro direto. E o Estudo 1 NÃO achou o efeito (χ²(1) = 0,10, p = 0,75); o contraste do Estudo 2 é pressão contra ausência de pressão, e o P do modelo nunca desce abaixo de 0,30.</w:t>
+      </w:r>
+    </w:p>
+    <w:p>
+      <w:pPr>
+        <w:pBdr>
+          <w:bottom w:val="single" w:color="D9A8C0" w:sz="6"/>
+        </w:pBdr>
+        <w:spacing w:after="160" w:before="60"/>
+      </w:pPr>
+      <w:r>
+        <w:rPr>
+          <w:sz w:val="2"/>
+          <w:szCs w:val="2"/>
+        </w:rPr>
+        <w:t xml:space="preserve"/>
+      </w:r>
+    </w:p>
+    <w:p>
+      <w:pPr>
+        <w:pStyle w:val="Heading2"/>
+        <w:spacing w:after="140" w:before="280"/>
+      </w:pPr>
+      <w:r>
+        <w:rPr>
+          <w:rFonts w:ascii="Calibri" w:cs="Calibri" w:eastAsia="Calibri" w:hAnsi="Calibri"/>
+          <w:b/>
+          <w:bCs/>
+          <w:color w:val="5E1B39"/>
+          <w:sz w:val="24"/>
+          <w:szCs w:val="24"/>
+        </w:rPr>
+        <w:t xml:space="preserve">D-19 — Zhao sustenta carga → desgaste; não define B</w:t>
+      </w:r>
+    </w:p>
+    <w:p>
+      <w:pPr>
+        <w:spacing w:after="70"/>
+        <w:ind w:left="200"/>
+      </w:pPr>
+      <w:r>
+        <w:rPr>
+          <w:rFonts w:ascii="Calibri" w:cs="Calibri" w:eastAsia="Calibri" w:hAnsi="Calibri"/>
+          <w:b/>
+          <w:bCs/>
+          <w:color w:val="1E6B3A"/>
+          <w:sz w:val="17"/>
+          <w:szCs w:val="17"/>
+        </w:rPr>
+        <w:t xml:space="preserve">FONTE SUSTENTA   </w:t>
+      </w:r>
+      <w:r>
+        <w:rPr>
+          <w:rFonts w:ascii="Calibri" w:cs="Calibri" w:eastAsia="Calibri" w:hAnsi="Calibri"/>
+          <w:sz w:val="20"/>
+          <w:szCs w:val="20"/>
+        </w:rPr>
+        <w:t xml:space="preserve">Zhao et al. 2026, verificado na origem: 274 profissionais de gestão de obras de metrô; carga 3 itens α = 0,838; complexidade 5 itens α = 0,859; exaustão MBI-GS 6 itens α = 0,925; β = 0,608 e 0,349 em modelos separados de demanda. Desenho transversal; viés de método comum declarado pelos autores.</w:t>
+      </w:r>
+    </w:p>
+    <w:p>
+      <w:pPr>
+        <w:spacing w:after="70"/>
+        <w:ind w:left="200"/>
+      </w:pPr>
+      <w:r>
+        <w:rPr>
+          <w:rFonts w:ascii="Calibri" w:cs="Calibri" w:eastAsia="Calibri" w:hAnsi="Calibri"/>
+          <w:b/>
+          <w:bCs/>
+          <w:color w:val="9B2C5E"/>
+          <w:sz w:val="17"/>
+          <w:szCs w:val="17"/>
+        </w:rPr>
+        <w:t xml:space="preserve">DECISÃO DO MODELO   </w:t>
+      </w:r>
+      <w:r>
+        <w:rPr>
+          <w:rFonts w:ascii="Calibri" w:cs="Calibri" w:eastAsia="Calibri" w:hAnsi="Calibri"/>
+          <w:sz w:val="20"/>
+          <w:szCs w:val="20"/>
+        </w:rPr>
+        <w:t xml:space="preserve">Usar como apoio estrutural à direção carga → desgaste, na população certa (gestão de obras de engenharia). Manter B como estado dinâmico do simulador.</w:t>
+      </w:r>
+    </w:p>
+    <w:p>
+      <w:pPr>
+        <w:spacing w:after="120"/>
+        <w:ind w:left="200"/>
+      </w:pPr>
+      <w:r>
+        <w:rPr>
+          <w:rFonts w:ascii="Calibri" w:cs="Calibri" w:eastAsia="Calibri" w:hAnsi="Calibri"/>
+          <w:b/>
+          <w:bCs/>
+          <w:color w:val="9C2B1B"/>
+          <w:sz w:val="17"/>
+          <w:szCs w:val="17"/>
+        </w:rPr>
+        <w:t xml:space="preserve">NÃO SUSTENTA   </w:t>
+      </w:r>
+      <w:r>
+        <w:rPr>
+          <w:rFonts w:ascii="Calibri" w:cs="Calibri" w:eastAsia="Calibri" w:hAnsi="Calibri"/>
+          <w:sz w:val="20"/>
+          <w:szCs w:val="20"/>
+        </w:rPr>
+        <w:t xml:space="preserve">Definir B. O desenho é </w:t>
+      </w:r>
+      <w:r>
+        <w:rPr>
+          <w:rFonts w:ascii="Calibri" w:cs="Calibri" w:eastAsia="Calibri" w:hAnsi="Calibri"/>
+          <w:b/>
+          <w:bCs/>
+          <w:sz w:val="20"/>
+          <w:szCs w:val="20"/>
+        </w:rPr>
+        <w:t xml:space="preserve">transversal</w:t>
+      </w:r>
+      <w:r>
+        <w:rPr>
+          <w:rFonts w:ascii="Calibri" w:cs="Calibri" w:eastAsia="Calibri" w:hAnsi="Calibri"/>
+          <w:sz w:val="20"/>
+          <w:szCs w:val="20"/>
+        </w:rPr>
+        <w:t xml:space="preserve"> e não informa dinâmica de depleção; e a regressão conjunta na própria base dá β_carga = 0,432 contra β_complexidade = −0,015 (p = 0,812), então exaustão é essencialmente carga — B = 1 − norm(exaustão) faria D e P entrarem duas vezes em E = D·P/B.</w:t>
+      </w:r>
+    </w:p>
+    <w:p>
+      <w:pPr>
+        <w:spacing w:after="90"/>
+        <w:ind w:left="200"/>
+      </w:pPr>
+      <w:r>
+        <w:rPr>
+          <w:rFonts w:ascii="Calibri" w:cs="Calibri" w:eastAsia="Calibri" w:hAnsi="Calibri"/>
+          <w:b/>
+          <w:bCs/>
+          <w:color w:val="9B2C5E"/>
+          <w:sz w:val="20"/>
+          <w:szCs w:val="20"/>
+        </w:rPr>
+        <w:t xml:space="preserve">Por que não vira B — três razões:  </w:t>
+      </w:r>
+      <w:r>
+        <w:rPr>
+          <w:rFonts w:ascii="Calibri" w:cs="Calibri" w:eastAsia="Calibri" w:hAnsi="Calibri"/>
+          <w:sz w:val="20"/>
+          <w:szCs w:val="20"/>
+        </w:rPr>
+        <w:t xml:space="preserve">(i) o desenho é </w:t>
+      </w:r>
+      <w:r>
+        <w:rPr>
+          <w:rFonts w:ascii="Calibri" w:cs="Calibri" w:eastAsia="Calibri" w:hAnsi="Calibri"/>
+          <w:b/>
+          <w:bCs/>
+          <w:sz w:val="20"/>
+          <w:szCs w:val="20"/>
+        </w:rPr>
+        <w:t xml:space="preserve">transversal</w:t>
+      </w:r>
+      <w:r>
+        <w:rPr>
+          <w:rFonts w:ascii="Calibri" w:cs="Calibri" w:eastAsia="Calibri" w:hAnsi="Calibri"/>
+          <w:sz w:val="20"/>
+          <w:szCs w:val="20"/>
+        </w:rPr>
+        <w:t xml:space="preserve"> e B é recurso que esgota e recupera ao longo do projeto; (ii) </w:t>
+      </w:r>
+      <w:r>
+        <w:rPr>
+          <w:rFonts w:ascii="Calibri" w:cs="Calibri" w:eastAsia="Calibri" w:hAnsi="Calibri"/>
+          <w:b/>
+          <w:bCs/>
+          <w:sz w:val="20"/>
+          <w:szCs w:val="20"/>
+        </w:rPr>
+        <w:t xml:space="preserve">dupla contagem</w:t>
+      </w:r>
+      <w:r>
+        <w:rPr>
+          <w:rFonts w:ascii="Calibri" w:cs="Calibri" w:eastAsia="Calibri" w:hAnsi="Calibri"/>
+          <w:sz w:val="20"/>
+          <w:szCs w:val="20"/>
+        </w:rPr>
+        <w:t xml:space="preserve"> — a regressão conjunta na base dá β_carga = 0,432 e β_complexidade = −0,015 (p = 0,812), então exaustão é essencialmente carga, e B = 1 − norm(exaustão) faria E = D·P/f(D,P), com D e P entrando duas vezes; (iii) escala afetiva Likert não é capacidade mecânica, e a transformação trocaria um parâmetro arbitrário por uma </w:t>
+      </w:r>
+      <w:r>
+        <w:rPr>
+          <w:rFonts w:ascii="Calibri" w:cs="Calibri" w:eastAsia="Calibri" w:hAnsi="Calibri"/>
+          <w:b/>
+          <w:bCs/>
+          <w:sz w:val="20"/>
+          <w:szCs w:val="20"/>
+        </w:rPr>
+        <w:t xml:space="preserve">função</w:t>
+      </w:r>
+      <w:r>
+        <w:rPr>
+          <w:rFonts w:ascii="Calibri" w:cs="Calibri" w:eastAsia="Calibri" w:hAnsi="Calibri"/>
+          <w:sz w:val="20"/>
+          <w:szCs w:val="20"/>
+        </w:rPr>
+        <w:t xml:space="preserve"> arbitrária, com mais graus de liberdade e escondidos.</w:t>
+      </w:r>
+    </w:p>
+    <w:p>
+      <w:pPr>
+        <w:spacing w:after="90"/>
+        <w:ind w:left="200"/>
+      </w:pPr>
+      <w:r>
+        <w:rPr>
+          <w:rFonts w:ascii="Calibri" w:cs="Calibri" w:eastAsia="Calibri" w:hAnsi="Calibri"/>
+          <w:b/>
+          <w:bCs/>
+          <w:color w:val="9B2C5E"/>
+          <w:sz w:val="20"/>
+          <w:szCs w:val="20"/>
+        </w:rPr>
+        <w:t xml:space="preserve">Subproduto útil:  </w:t>
+      </w:r>
+      <w:r>
+        <w:rPr>
+          <w:rFonts w:ascii="Calibri" w:cs="Calibri" w:eastAsia="Calibri" w:hAnsi="Calibri"/>
+          <w:sz w:val="20"/>
+          <w:szCs w:val="20"/>
+        </w:rPr>
+        <w:t xml:space="preserve">carga e complexidade são empiricamente separáveis (r = 0,480, VIF 1,30), o que sustenta manter P e D como construtos distintos no modelo.</w:t>
+      </w:r>
+    </w:p>
+    <w:p>
+      <w:pPr>
+        <w:pBdr>
+          <w:bottom w:val="single" w:color="D9A8C0" w:sz="6"/>
+        </w:pBdr>
+        <w:spacing w:after="160" w:before="60"/>
+      </w:pPr>
+      <w:r>
+        <w:rPr>
+          <w:sz w:val="2"/>
+          <w:szCs w:val="2"/>
+        </w:rPr>
+        <w:t xml:space="preserve"/>
+      </w:r>
+    </w:p>
+    <w:p>
+      <w:pPr>
+        <w:pStyle w:val="Heading2"/>
+        <w:spacing w:after="140" w:before="280"/>
+      </w:pPr>
+      <w:r>
+        <w:rPr>
+          <w:rFonts w:ascii="Calibri" w:cs="Calibri" w:eastAsia="Calibri" w:hAnsi="Calibri"/>
+          <w:b/>
+          <w:bCs/>
+          <w:color w:val="5E1B39"/>
+          <w:sz w:val="24"/>
+          <w:szCs w:val="24"/>
+        </w:rPr>
+        <w:t xml:space="preserve">D-20 — Autorização para dados sintéticos: onde se aplica e onde não</w:t>
+      </w:r>
+    </w:p>
+    <w:p>
+      <w:pPr>
+        <w:spacing w:after="70"/>
+        <w:ind w:left="200"/>
+      </w:pPr>
+      <w:r>
+        <w:rPr>
+          <w:rFonts w:ascii="Calibri" w:cs="Calibri" w:eastAsia="Calibri" w:hAnsi="Calibri"/>
+          <w:b/>
+          <w:bCs/>
+          <w:color w:val="1E6B3A"/>
+          <w:sz w:val="17"/>
+          <w:szCs w:val="17"/>
+        </w:rPr>
+        <w:t xml:space="preserve">FONTE SUSTENTA   </w:t>
+      </w:r>
+      <w:r>
+        <w:rPr>
+          <w:rFonts w:ascii="Calibri" w:cs="Calibri" w:eastAsia="Calibri" w:hAnsi="Calibri"/>
+          <w:sz w:val="20"/>
+          <w:szCs w:val="20"/>
+        </w:rPr>
+        <w:t xml:space="preserve">Nada. Esta decisão não se apoia em fonte externa — é autorização do orientador, registrada em 17/09/2026: uso de dados sintéticos ou semissintéticos permitido, desde que pertinentes, metodologicamente justificados, rastreáveis e claramente identificados como sintéticos.</w:t>
+      </w:r>
+    </w:p>
+    <w:p>
+      <w:pPr>
+        <w:spacing w:after="70"/>
+        <w:ind w:left="200"/>
+      </w:pPr>
+      <w:r>
+        <w:rPr>
+          <w:rFonts w:ascii="Calibri" w:cs="Calibri" w:eastAsia="Calibri" w:hAnsi="Calibri"/>
+          <w:b/>
+          <w:bCs/>
+          <w:color w:val="9B2C5E"/>
+          <w:sz w:val="17"/>
+          <w:szCs w:val="17"/>
+        </w:rPr>
+        <w:t xml:space="preserve">DECISÃO DO MODELO   </w:t>
+      </w:r>
+      <w:r>
+        <w:rPr>
+          <w:rFonts w:ascii="Calibri" w:cs="Calibri" w:eastAsia="Calibri" w:hAnsi="Calibri"/>
+          <w:sz w:val="20"/>
+          <w:szCs w:val="20"/>
+        </w:rPr>
+        <w:t xml:space="preserve">Aplicar a autorização a um único ponto hoje: a ponte atividade J60 → k microtarefas. Declarada sintética, associada à dificuldade, varrida, e preferencialmente contida em k ≤ 8.</w:t>
+      </w:r>
+    </w:p>
+    <w:p>
+      <w:pPr>
+        <w:spacing w:after="120"/>
+        <w:ind w:left="200"/>
+      </w:pPr>
+      <w:r>
+        <w:rPr>
+          <w:rFonts w:ascii="Calibri" w:cs="Calibri" w:eastAsia="Calibri" w:hAnsi="Calibri"/>
+          <w:b/>
+          <w:bCs/>
+          <w:color w:val="9C2B1B"/>
+          <w:sz w:val="17"/>
+          <w:szCs w:val="17"/>
+        </w:rPr>
+        <w:t xml:space="preserve">NÃO SUSTENTA   </w:t>
+      </w:r>
+      <w:r>
+        <w:rPr>
+          <w:rFonts w:ascii="Calibri" w:cs="Calibri" w:eastAsia="Calibri" w:hAnsi="Calibri"/>
+          <w:sz w:val="20"/>
+          <w:szCs w:val="20"/>
+        </w:rPr>
+        <w:t xml:space="preserve">Qualquer coisa sintética que sustente conclusão. O teste: se a conclusão muda quando se muda a escolha de síntese, a conclusão é sobre a síntese.</w:t>
+      </w:r>
+    </w:p>
+    <w:p>
+      <w:pPr>
+        <w:spacing w:after="90"/>
+        <w:ind w:left="200"/>
+      </w:pPr>
+      <w:r>
+        <w:rPr>
+          <w:rFonts w:ascii="Calibri" w:cs="Calibri" w:eastAsia="Calibri" w:hAnsi="Calibri"/>
+          <w:b/>
+          <w:bCs/>
+          <w:color w:val="9B2C5E"/>
+          <w:sz w:val="20"/>
+          <w:szCs w:val="20"/>
+        </w:rPr>
+        <w:t xml:space="preserve">Onde se aplica — um único ponto hoje:  </w:t>
+      </w:r>
+      <w:r>
+        <w:rPr>
+          <w:rFonts w:ascii="Calibri" w:cs="Calibri" w:eastAsia="Calibri" w:hAnsi="Calibri"/>
+          <w:sz w:val="20"/>
+          <w:szCs w:val="20"/>
+        </w:rPr>
+        <w:t xml:space="preserve">a ponte </w:t>
+      </w:r>
+      <w:r>
+        <w:rPr>
+          <w:rFonts w:ascii="Calibri" w:cs="Calibri" w:eastAsia="Calibri" w:hAnsi="Calibri"/>
+          <w:b/>
+          <w:bCs/>
+          <w:sz w:val="20"/>
+          <w:szCs w:val="20"/>
+        </w:rPr>
+        <w:t xml:space="preserve">atividade J60 → k microtarefas</w:t>
+      </w:r>
+      <w:r>
+        <w:rPr>
+          <w:rFonts w:ascii="Calibri" w:cs="Calibri" w:eastAsia="Calibri" w:hAnsi="Calibri"/>
+          <w:sz w:val="20"/>
+          <w:szCs w:val="20"/>
+        </w:rPr>
+        <w:t xml:space="preserve">, que nenhuma fonte observa porque a pergunta não existe fora deste modelo. A decomposição deve ser declarada sintética, associada à dificuldade, varrida, e preferencialmente contida em k ≤ 8.</w:t>
+      </w:r>
+    </w:p>
+    <w:p>
+      <w:pPr>
+        <w:spacing w:after="90"/>
+        <w:ind w:left="200"/>
+      </w:pPr>
+      <w:r>
+        <w:rPr>
+          <w:rFonts w:ascii="Calibri" w:cs="Calibri" w:eastAsia="Calibri" w:hAnsi="Calibri"/>
+          <w:b/>
+          <w:bCs/>
+          <w:color w:val="9B2C5E"/>
+          <w:sz w:val="20"/>
+          <w:szCs w:val="20"/>
+        </w:rPr>
+        <w:t xml:space="preserve">Onde não se aplica:  </w:t>
+      </w:r>
+      <w:r>
+        <w:rPr>
+          <w:rFonts w:ascii="Calibri" w:cs="Calibri" w:eastAsia="Calibri" w:hAnsi="Calibri"/>
+          <w:sz w:val="20"/>
+          <w:szCs w:val="20"/>
+        </w:rPr>
+        <w:t xml:space="preserve">gerar o dado do qual uma conclusão depende. O teste é único: </w:t>
+      </w:r>
+      <w:r>
+        <w:rPr>
+          <w:rFonts w:ascii="Calibri" w:cs="Calibri" w:eastAsia="Calibri" w:hAnsi="Calibri"/>
+          <w:b/>
+          <w:bCs/>
+          <w:sz w:val="20"/>
+          <w:szCs w:val="20"/>
+        </w:rPr>
+        <w:t xml:space="preserve">se a conclusão muda quando se muda a escolha de síntese, a conclusão é sobre a síntese.</w:t>
+      </w:r>
+      <w:r>
+        <w:rPr>
+          <w:rFonts w:ascii="Calibri" w:cs="Calibri" w:eastAsia="Calibri" w:hAnsi="Calibri"/>
+          <w:sz w:val="20"/>
+          <w:szCs w:val="20"/>
+        </w:rPr>
+        <w:t xml:space="preserve"> É por isso que varrer não é opcional — é o que separa síntese declarada de resultado fabricado.</w:t>
+      </w:r>
+    </w:p>
+    <w:p>
+      <w:pPr>
+        <w:spacing w:after="90"/>
+        <w:ind w:left="200"/>
+      </w:pPr>
+      <w:r>
+        <w:rPr>
+          <w:rFonts w:ascii="Calibri" w:cs="Calibri" w:eastAsia="Calibri" w:hAnsi="Calibri"/>
+          <w:b/>
+          <w:bCs/>
+          <w:color w:val="9B2C5E"/>
+          <w:sz w:val="20"/>
+          <w:szCs w:val="20"/>
+        </w:rPr>
+        <w:t xml:space="preserve">Estado:  </w:t>
+      </w:r>
+      <w:r>
+        <w:rPr>
+          <w:rFonts w:ascii="Calibri" w:cs="Calibri" w:eastAsia="Calibri" w:hAnsi="Calibri"/>
+          <w:sz w:val="20"/>
+          <w:szCs w:val="20"/>
+        </w:rPr>
+        <w:t xml:space="preserve">a permissão permanece praticamente não gasta. Todas as fontes incorporadas em D-15 a D-19 são dados reais publicados.</w:t>
       </w:r>
     </w:p>
     <w:p>
@@ -3530,7 +6641,7 @@
             <w:pPr>
               <w:spacing w:after="40"/>
             </w:pPr>
-            <w:hyperlink w:history="1" r:id="rIdmw-tmu5toxi2zzl21wop8">
+            <w:hyperlink w:history="1" r:id="rIdx11twmqlfmago0za9auhn">
               <w:r>
                 <w:rPr>
                   <w:rStyle w:val="Hyperlink"/>
@@ -3664,7 +6775,7 @@
             <w:pPr>
               <w:spacing w:after="40"/>
             </w:pPr>
-            <w:hyperlink w:history="1" r:id="rIde3gyhpdtub-bs3bl1pwih">
+            <w:hyperlink w:history="1" r:id="rId27fhu9ms8f8uw1orvi9eo">
               <w:r>
                 <w:rPr>
                   <w:rStyle w:val="Hyperlink"/>
@@ -3813,7 +6924,7 @@
             <w:pPr>
               <w:spacing w:after="40"/>
             </w:pPr>
-            <w:hyperlink w:history="1" r:id="rIdh5yzko7xbs3ov8h-7sqns">
+            <w:hyperlink w:history="1" r:id="rIdtm5kevbhasmvtjzmqcati">
               <w:r>
                 <w:rPr>
                   <w:rStyle w:val="Hyperlink"/>
@@ -3936,15 +7047,15 @@
                 <w:sz w:val="20"/>
                 <w:szCs w:val="20"/>
               </w:rPr>
-              <w:t xml:space="preserve">Kim, D. H. </w:t>
-            </w:r>
-            <w:r>
-              <w:rPr>
-                <w:rFonts w:ascii="Calibri" w:cs="Calibri" w:eastAsia="Calibri" w:hAnsi="Calibri"/>
-                <w:sz w:val="18"/>
-                <w:szCs w:val="18"/>
-              </w:rPr>
-              <w:t xml:space="preserve">Systems Thinking Tools (arquétipos sistêmicos, incluindo Soluções Sintomáticas).</w:t>
+              <w:t xml:space="preserve">Stewart, M. G.; Melchers, R. E. (1988). </w:t>
+            </w:r>
+            <w:r>
+              <w:rPr>
+                <w:rFonts w:ascii="Calibri" w:cs="Calibri" w:eastAsia="Calibri" w:hAnsi="Calibri"/>
+                <w:sz w:val="18"/>
+                <w:szCs w:val="18"/>
+              </w:rPr>
+              <w:t xml:space="preserve">“Simulation of human error in a design loading task”. Structural Safety 5(4), 285–297.</w:t>
             </w:r>
           </w:p>
         </w:tc>
@@ -3963,14 +7074,17 @@
             <w:pPr>
               <w:spacing w:after="40"/>
             </w:pPr>
-            <w:r>
-              <w:rPr>
-                <w:rFonts w:ascii="Calibri" w:cs="Calibri" w:eastAsia="Calibri" w:hAnsi="Calibri"/>
-                <w:sz w:val="18"/>
-                <w:szCs w:val="18"/>
-              </w:rPr>
-              <w:t xml:space="preserve">PDF completo nos arquivos do Projeto TCC2.</w:t>
-            </w:r>
+            <w:hyperlink w:history="1" r:id="rIdcwvrcyvjnxxpsjv2b6ufh">
+              <w:r>
+                <w:rPr>
+                  <w:rStyle w:val="Hyperlink"/>
+                  <w:rFonts w:ascii="Calibri" w:cs="Calibri" w:eastAsia="Calibri" w:hAnsi="Calibri"/>
+                  <w:sz w:val="16"/>
+                  <w:szCs w:val="16"/>
+                </w:rPr>
+                <w:t xml:space="preserve">doi.org/10.1016/0167-4730(88)90029-X</w:t>
+              </w:r>
+            </w:hyperlink>
           </w:p>
         </w:tc>
         <w:tc>
@@ -3994,7 +7108,7 @@
                 <w:sz w:val="18"/>
                 <w:szCs w:val="18"/>
               </w:rPr>
-              <w:t xml:space="preserve">Definição do arquétipo usada para concluir que a Porta 1 NÃO o instancia (D-04).</w:t>
+              <w:t xml:space="preserve">Tabela 1, p. 290: taxas por microtarefa. Cálculo de 1 a 8 passos: 0,0128 a 0,1024, lineares em k. Consulta a tabela 0,0126. Omissões de 0,40 a 0,80. Figura 1, p. 287: árvore que testa omissão primeiro, comissão depois. Base de D-15.</w:t>
             </w:r>
           </w:p>
         </w:tc>
@@ -4023,6 +7137,21 @@
                 <w:szCs w:val="18"/>
               </w:rPr>
               <w:t xml:space="preserve">TEXTO LIDO</w:t>
+            </w:r>
+          </w:p>
+          <w:p>
+            <w:pPr>
+              <w:spacing w:after="40"/>
+            </w:pPr>
+            <w:r>
+              <w:rPr>
+                <w:rFonts w:ascii="Calibri" w:cs="Calibri" w:eastAsia="Calibri" w:hAnsi="Calibri"/>
+                <w:i/>
+                <w:iCs/>
+                <w:sz w:val="20"/>
+                <w:szCs w:val="20"/>
+              </w:rPr>
+              <w:t xml:space="preserve">NÃO sustenta extrapolação acima de k = 8, nem transporte das taxas de omissão como taxa de seleção de porta.</w:t>
             </w:r>
           </w:p>
         </w:tc>
@@ -4053,6 +7182,555 @@
                 <w:sz w:val="20"/>
                 <w:szCs w:val="20"/>
               </w:rPr>
+              <w:t xml:space="preserve">Stewart, M. G. (1992). </w:t>
+            </w:r>
+            <w:r>
+              <w:rPr>
+                <w:rFonts w:ascii="Calibri" w:cs="Calibri" w:eastAsia="Calibri" w:hAnsi="Calibri"/>
+                <w:sz w:val="18"/>
+                <w:szCs w:val="18"/>
+              </w:rPr>
+              <w:t xml:space="preserve">“Modelling human error rates for human reliability analysis of a structural design task”. Reliability Engineering &amp; System Safety 36(2), 171–180.</w:t>
+            </w:r>
+          </w:p>
+        </w:tc>
+        <w:tc>
+          <w:tcPr>
+            <w:tcW w:type="dxa" w:w="2150"/>
+            <w:tcMar>
+              <w:top w:type="dxa" w:w="80"/>
+              <w:left w:type="dxa" w:w="100"/>
+              <w:bottom w:type="dxa" w:w="80"/>
+              <w:right w:type="dxa" w:w="100"/>
+            </w:tcMar>
+          </w:tcPr>
+          <w:p>
+            <w:pPr>
+              <w:spacing w:after="40"/>
+            </w:pPr>
+            <w:hyperlink w:history="1" r:id="rId92h5wbxdaad1twkhjizzs">
+              <w:r>
+                <w:rPr>
+                  <w:rStyle w:val="Hyperlink"/>
+                  <w:rFonts w:ascii="Calibri" w:cs="Calibri" w:eastAsia="Calibri" w:hAnsi="Calibri"/>
+                  <w:sz w:val="16"/>
+                  <w:szCs w:val="16"/>
+                </w:rPr>
+                <w:t xml:space="preserve">doi.org/10.1016/0951-8320(92)90097-5</w:t>
+              </w:r>
+            </w:hyperlink>
+          </w:p>
+        </w:tc>
+        <w:tc>
+          <w:tcPr>
+            <w:tcW w:type="dxa" w:w="2900"/>
+            <w:tcMar>
+              <w:top w:type="dxa" w:w="80"/>
+              <w:left w:type="dxa" w:w="100"/>
+              <w:bottom w:type="dxa" w:w="80"/>
+              <w:right w:type="dxa" w:w="100"/>
+            </w:tcMar>
+          </w:tcPr>
+          <w:p>
+            <w:pPr>
+              <w:spacing w:after="40"/>
+            </w:pPr>
+            <w:r>
+              <w:rPr>
+                <w:rFonts w:ascii="Calibri" w:cs="Calibri" w:eastAsia="Calibri" w:hAnsi="Calibri"/>
+                <w:sz w:val="18"/>
+                <w:szCs w:val="18"/>
+              </w:rPr>
+              <w:t xml:space="preserve">Tabela 1, p. 173: 94 respondentes, 38 erros em 2.327 microtarefas, p_av = 0,0163. Tabela 2, p. 175: independência rejeitada (χ² = 10,174 &gt; 5,991); CV = 1,13; φ = 0,845. Tabela 3, p. 177: probabilidades de falha. Base de D-16 e D-17.</w:t>
+            </w:r>
+          </w:p>
+        </w:tc>
+        <w:tc>
+          <w:tcPr>
+            <w:tcW w:type="dxa" w:w="1900"/>
+            <w:tcMar>
+              <w:top w:type="dxa" w:w="80"/>
+              <w:left w:type="dxa" w:w="100"/>
+              <w:bottom w:type="dxa" w:w="80"/>
+              <w:right w:type="dxa" w:w="100"/>
+            </w:tcMar>
+          </w:tcPr>
+          <w:p>
+            <w:pPr>
+              <w:spacing w:after="40"/>
+            </w:pPr>
+            <w:r>
+              <w:rPr>
+                <w:rFonts w:ascii="Calibri" w:cs="Calibri" w:eastAsia="Calibri" w:hAnsi="Calibri"/>
+                <w:b/>
+                <w:bCs/>
+                <w:color w:val="1E6B3A"/>
+                <w:sz w:val="18"/>
+                <w:szCs w:val="18"/>
+              </w:rPr>
+              <w:t xml:space="preserve">TEXTO LIDO</w:t>
+            </w:r>
+          </w:p>
+          <w:p>
+            <w:pPr>
+              <w:spacing w:after="40"/>
+            </w:pPr>
+            <w:r>
+              <w:rPr>
+                <w:rFonts w:ascii="Calibri" w:cs="Calibri" w:eastAsia="Calibri" w:hAnsi="Calibri"/>
+                <w:i/>
+                <w:iCs/>
+                <w:sz w:val="20"/>
+                <w:szCs w:val="20"/>
+              </w:rPr>
+              <w:t xml:space="preserve">NÃO sustenta efeito nulo de pressão: a manipulação falhou e o autor fundiu as amostras (ver R-12).</w:t>
+            </w:r>
+          </w:p>
+        </w:tc>
+      </w:tr>
+      <w:tr>
+        <w:trPr>
+          <w:cantSplit/>
+        </w:trPr>
+        <w:tc>
+          <w:tcPr>
+            <w:tcW w:type="dxa" w:w="2750"/>
+            <w:shd w:fill="F2F2F2" w:color="auto" w:val="clear"/>
+            <w:tcMar>
+              <w:top w:type="dxa" w:w="80"/>
+              <w:left w:type="dxa" w:w="100"/>
+              <w:bottom w:type="dxa" w:w="80"/>
+              <w:right w:type="dxa" w:w="100"/>
+            </w:tcMar>
+          </w:tcPr>
+          <w:p>
+            <w:pPr>
+              <w:spacing w:after="40"/>
+            </w:pPr>
+            <w:r>
+              <w:rPr>
+                <w:rFonts w:ascii="Calibri" w:cs="Calibri" w:eastAsia="Calibri" w:hAnsi="Calibri"/>
+                <w:b/>
+                <w:bCs/>
+                <w:sz w:val="20"/>
+                <w:szCs w:val="20"/>
+              </w:rPr>
+              <w:t xml:space="preserve">Rieskamp, J.; Hoffrage, U. (2008). </w:t>
+            </w:r>
+            <w:r>
+              <w:rPr>
+                <w:rFonts w:ascii="Calibri" w:cs="Calibri" w:eastAsia="Calibri" w:hAnsi="Calibri"/>
+                <w:sz w:val="18"/>
+                <w:szCs w:val="18"/>
+              </w:rPr>
+              <w:t xml:space="preserve">“Inferences under time pressure: how opportunity costs affect strategy selection”. Acta Psychologica 127(2), 258–276.</w:t>
+            </w:r>
+          </w:p>
+        </w:tc>
+        <w:tc>
+          <w:tcPr>
+            <w:tcW w:type="dxa" w:w="2150"/>
+            <w:shd w:fill="F2F2F2" w:color="auto" w:val="clear"/>
+            <w:tcMar>
+              <w:top w:type="dxa" w:w="80"/>
+              <w:left w:type="dxa" w:w="100"/>
+              <w:bottom w:type="dxa" w:w="80"/>
+              <w:right w:type="dxa" w:w="100"/>
+            </w:tcMar>
+          </w:tcPr>
+          <w:p>
+            <w:pPr>
+              <w:spacing w:after="40"/>
+            </w:pPr>
+            <w:hyperlink w:history="1" r:id="rIdbttvmthlm-xuqgpbh5v-t">
+              <w:r>
+                <w:rPr>
+                  <w:rStyle w:val="Hyperlink"/>
+                  <w:rFonts w:ascii="Calibri" w:cs="Calibri" w:eastAsia="Calibri" w:hAnsi="Calibri"/>
+                  <w:sz w:val="16"/>
+                  <w:szCs w:val="16"/>
+                </w:rPr>
+                <w:t xml:space="preserve">doi.org/10.1016/j.actpsy.2007.05.004</w:t>
+              </w:r>
+            </w:hyperlink>
+          </w:p>
+        </w:tc>
+        <w:tc>
+          <w:tcPr>
+            <w:tcW w:type="dxa" w:w="2900"/>
+            <w:shd w:fill="F2F2F2" w:color="auto" w:val="clear"/>
+            <w:tcMar>
+              <w:top w:type="dxa" w:w="80"/>
+              <w:left w:type="dxa" w:w="100"/>
+              <w:bottom w:type="dxa" w:w="80"/>
+              <w:right w:type="dxa" w:w="100"/>
+            </w:tcMar>
+          </w:tcPr>
+          <w:p>
+            <w:pPr>
+              <w:spacing w:after="40"/>
+            </w:pPr>
+            <w:r>
+              <w:rPr>
+                <w:rFonts w:ascii="Calibri" w:cs="Calibri" w:eastAsia="Calibri" w:hAnsi="Calibri"/>
+                <w:sz w:val="18"/>
+                <w:szCs w:val="18"/>
+              </w:rPr>
+              <w:t xml:space="preserve">Estudo 2, p. 266–267: 7/36 (19,4%) não compensatórios sob baixa pressão contra 16/36 (44,4%) sob alta; McNemar p = 0,02. Base de D-18.</w:t>
+            </w:r>
+          </w:p>
+        </w:tc>
+        <w:tc>
+          <w:tcPr>
+            <w:tcW w:type="dxa" w:w="1900"/>
+            <w:shd w:fill="F2F2F2" w:color="auto" w:val="clear"/>
+            <w:tcMar>
+              <w:top w:type="dxa" w:w="80"/>
+              <w:left w:type="dxa" w:w="100"/>
+              <w:bottom w:type="dxa" w:w="80"/>
+              <w:right w:type="dxa" w:w="100"/>
+            </w:tcMar>
+          </w:tcPr>
+          <w:p>
+            <w:pPr>
+              <w:spacing w:after="40"/>
+            </w:pPr>
+            <w:r>
+              <w:rPr>
+                <w:rFonts w:ascii="Calibri" w:cs="Calibri" w:eastAsia="Calibri" w:hAnsi="Calibri"/>
+                <w:b/>
+                <w:bCs/>
+                <w:color w:val="1E6B3A"/>
+                <w:sz w:val="18"/>
+                <w:szCs w:val="18"/>
+              </w:rPr>
+              <w:t xml:space="preserve">TEXTO LIDO</w:t>
+            </w:r>
+          </w:p>
+          <w:p>
+            <w:pPr>
+              <w:spacing w:after="40"/>
+            </w:pPr>
+            <w:r>
+              <w:rPr>
+                <w:rFonts w:ascii="Calibri" w:cs="Calibri" w:eastAsia="Calibri" w:hAnsi="Calibri"/>
+                <w:i/>
+                <w:iCs/>
+                <w:sz w:val="20"/>
+                <w:szCs w:val="20"/>
+              </w:rPr>
+              <w:t xml:space="preserve">NÃO sustenta taxa absoluta de Porta 1 (unidade é participante classificado, não execução), nem efeito sobre erro direto. Estudo 1 não achou o efeito (p = 0,75).</w:t>
+            </w:r>
+          </w:p>
+        </w:tc>
+      </w:tr>
+      <w:tr>
+        <w:trPr>
+          <w:cantSplit/>
+        </w:trPr>
+        <w:tc>
+          <w:tcPr>
+            <w:tcW w:type="dxa" w:w="2750"/>
+            <w:tcMar>
+              <w:top w:type="dxa" w:w="80"/>
+              <w:left w:type="dxa" w:w="100"/>
+              <w:bottom w:type="dxa" w:w="80"/>
+              <w:right w:type="dxa" w:w="100"/>
+            </w:tcMar>
+          </w:tcPr>
+          <w:p>
+            <w:pPr>
+              <w:spacing w:after="40"/>
+            </w:pPr>
+            <w:r>
+              <w:rPr>
+                <w:rFonts w:ascii="Calibri" w:cs="Calibri" w:eastAsia="Calibri" w:hAnsi="Calibri"/>
+                <w:b/>
+                <w:bCs/>
+                <w:sz w:val="20"/>
+                <w:szCs w:val="20"/>
+              </w:rPr>
+              <w:t xml:space="preserve">Zhao, C.; Qi, J.; Chen, Y. (2026). </w:t>
+            </w:r>
+            <w:r>
+              <w:rPr>
+                <w:rFonts w:ascii="Calibri" w:cs="Calibri" w:eastAsia="Calibri" w:hAnsi="Calibri"/>
+                <w:sz w:val="18"/>
+                <w:szCs w:val="18"/>
+              </w:rPr>
+              <w:t xml:space="preserve">“Job demands, job resources, and burnout among metro site management personnel in China”. Frontiers in Psychology, 23/07/2026.</w:t>
+            </w:r>
+          </w:p>
+        </w:tc>
+        <w:tc>
+          <w:tcPr>
+            <w:tcW w:type="dxa" w:w="2150"/>
+            <w:tcMar>
+              <w:top w:type="dxa" w:w="80"/>
+              <w:left w:type="dxa" w:w="100"/>
+              <w:bottom w:type="dxa" w:w="80"/>
+              <w:right w:type="dxa" w:w="100"/>
+            </w:tcMar>
+          </w:tcPr>
+          <w:p>
+            <w:pPr>
+              <w:spacing w:after="40"/>
+            </w:pPr>
+            <w:hyperlink w:history="1" r:id="rIdviyyuvmclegm-3vqe0dsy">
+              <w:r>
+                <w:rPr>
+                  <w:rStyle w:val="Hyperlink"/>
+                  <w:rFonts w:ascii="Calibri" w:cs="Calibri" w:eastAsia="Calibri" w:hAnsi="Calibri"/>
+                  <w:sz w:val="16"/>
+                  <w:szCs w:val="16"/>
+                </w:rPr>
+                <w:t xml:space="preserve">doi.org/10.3389/fpsyg.2026.1856402</w:t>
+              </w:r>
+            </w:hyperlink>
+          </w:p>
+          <w:p>
+            <w:pPr>
+              <w:spacing w:after="40"/>
+            </w:pPr>
+            <w:r>
+              <w:rPr>
+                <w:rFonts w:ascii="Calibri" w:cs="Calibri" w:eastAsia="Calibri" w:hAnsi="Calibri"/>
+                <w:i/>
+                <w:iCs/>
+                <w:sz w:val="14"/>
+                <w:szCs w:val="14"/>
+              </w:rPr>
+              <w:t xml:space="preserve">Dados: zenodo.21153010 (conforme o artigo)</w:t>
+            </w:r>
+          </w:p>
+        </w:tc>
+        <w:tc>
+          <w:tcPr>
+            <w:tcW w:type="dxa" w:w="2900"/>
+            <w:tcMar>
+              <w:top w:type="dxa" w:w="80"/>
+              <w:left w:type="dxa" w:w="100"/>
+              <w:bottom w:type="dxa" w:w="80"/>
+              <w:right w:type="dxa" w:w="100"/>
+            </w:tcMar>
+          </w:tcPr>
+          <w:p>
+            <w:pPr>
+              <w:spacing w:after="40"/>
+            </w:pPr>
+            <w:r>
+              <w:rPr>
+                <w:rFonts w:ascii="Calibri" w:cs="Calibri" w:eastAsia="Calibri" w:hAnsi="Calibri"/>
+                <w:sz w:val="18"/>
+                <w:szCs w:val="18"/>
+              </w:rPr>
+              <w:t xml:space="preserve">274 profissionais de gestão de obras; carga → exaustão β = 0,608; complexidade β = 0,349; transversal. Base de D-19.</w:t>
+            </w:r>
+          </w:p>
+        </w:tc>
+        <w:tc>
+          <w:tcPr>
+            <w:tcW w:type="dxa" w:w="1900"/>
+            <w:tcMar>
+              <w:top w:type="dxa" w:w="80"/>
+              <w:left w:type="dxa" w:w="100"/>
+              <w:bottom w:type="dxa" w:w="80"/>
+              <w:right w:type="dxa" w:w="100"/>
+            </w:tcMar>
+          </w:tcPr>
+          <w:p>
+            <w:pPr>
+              <w:spacing w:after="40"/>
+            </w:pPr>
+            <w:r>
+              <w:rPr>
+                <w:rFonts w:ascii="Calibri" w:cs="Calibri" w:eastAsia="Calibri" w:hAnsi="Calibri"/>
+                <w:b/>
+                <w:bCs/>
+                <w:color w:val="8A6300"/>
+                <w:sz w:val="18"/>
+                <w:szCs w:val="18"/>
+              </w:rPr>
+              <w:t xml:space="preserve">ARTIGO VERIFICADO NA ORIGEM</w:t>
+            </w:r>
+          </w:p>
+          <w:p>
+            <w:pPr>
+              <w:spacing w:after="40"/>
+            </w:pPr>
+            <w:r>
+              <w:rPr>
+                <w:rFonts w:ascii="Calibri" w:cs="Calibri" w:eastAsia="Calibri" w:hAnsi="Calibri"/>
+                <w:b/>
+                <w:bCs/>
+                <w:color w:val="9C2B1B"/>
+                <w:sz w:val="18"/>
+                <w:szCs w:val="18"/>
+              </w:rPr>
+              <w:t xml:space="preserve">NÃO define B</w:t>
+            </w:r>
+          </w:p>
+          <w:p>
+            <w:pPr>
+              <w:spacing w:after="40"/>
+            </w:pPr>
+            <w:r>
+              <w:rPr>
+                <w:rFonts w:ascii="Calibri" w:cs="Calibri" w:eastAsia="Calibri" w:hAnsi="Calibri"/>
+                <w:i/>
+                <w:iCs/>
+                <w:sz w:val="20"/>
+                <w:szCs w:val="20"/>
+              </w:rPr>
+              <w:t xml:space="preserve">Transversal; não informa dinâmica de depleção. Viés de método comum declarado.</w:t>
+            </w:r>
+          </w:p>
+        </w:tc>
+      </w:tr>
+      <w:tr>
+        <w:trPr>
+          <w:cantSplit/>
+        </w:trPr>
+        <w:tc>
+          <w:tcPr>
+            <w:tcW w:type="dxa" w:w="2750"/>
+            <w:shd w:fill="F2F2F2" w:color="auto" w:val="clear"/>
+            <w:tcMar>
+              <w:top w:type="dxa" w:w="80"/>
+              <w:left w:type="dxa" w:w="100"/>
+              <w:bottom w:type="dxa" w:w="80"/>
+              <w:right w:type="dxa" w:w="100"/>
+            </w:tcMar>
+          </w:tcPr>
+          <w:p>
+            <w:pPr>
+              <w:spacing w:after="40"/>
+            </w:pPr>
+            <w:r>
+              <w:rPr>
+                <w:rFonts w:ascii="Calibri" w:cs="Calibri" w:eastAsia="Calibri" w:hAnsi="Calibri"/>
+                <w:b/>
+                <w:bCs/>
+                <w:sz w:val="20"/>
+                <w:szCs w:val="20"/>
+              </w:rPr>
+              <w:t xml:space="preserve">Kim, D. H. </w:t>
+            </w:r>
+            <w:r>
+              <w:rPr>
+                <w:rFonts w:ascii="Calibri" w:cs="Calibri" w:eastAsia="Calibri" w:hAnsi="Calibri"/>
+                <w:sz w:val="18"/>
+                <w:szCs w:val="18"/>
+              </w:rPr>
+              <w:t xml:space="preserve">Systems Thinking Tools (arquétipos sistêmicos, incluindo Soluções Sintomáticas).</w:t>
+            </w:r>
+          </w:p>
+        </w:tc>
+        <w:tc>
+          <w:tcPr>
+            <w:tcW w:type="dxa" w:w="2150"/>
+            <w:shd w:fill="F2F2F2" w:color="auto" w:val="clear"/>
+            <w:tcMar>
+              <w:top w:type="dxa" w:w="80"/>
+              <w:left w:type="dxa" w:w="100"/>
+              <w:bottom w:type="dxa" w:w="80"/>
+              <w:right w:type="dxa" w:w="100"/>
+            </w:tcMar>
+          </w:tcPr>
+          <w:p>
+            <w:pPr>
+              <w:spacing w:after="40"/>
+            </w:pPr>
+            <w:r>
+              <w:rPr>
+                <w:rFonts w:ascii="Calibri" w:cs="Calibri" w:eastAsia="Calibri" w:hAnsi="Calibri"/>
+                <w:sz w:val="18"/>
+                <w:szCs w:val="18"/>
+              </w:rPr>
+              <w:t xml:space="preserve">PDF completo nos arquivos do Projeto TCC2.</w:t>
+            </w:r>
+          </w:p>
+        </w:tc>
+        <w:tc>
+          <w:tcPr>
+            <w:tcW w:type="dxa" w:w="2900"/>
+            <w:shd w:fill="F2F2F2" w:color="auto" w:val="clear"/>
+            <w:tcMar>
+              <w:top w:type="dxa" w:w="80"/>
+              <w:left w:type="dxa" w:w="100"/>
+              <w:bottom w:type="dxa" w:w="80"/>
+              <w:right w:type="dxa" w:w="100"/>
+            </w:tcMar>
+          </w:tcPr>
+          <w:p>
+            <w:pPr>
+              <w:spacing w:after="40"/>
+            </w:pPr>
+            <w:r>
+              <w:rPr>
+                <w:rFonts w:ascii="Calibri" w:cs="Calibri" w:eastAsia="Calibri" w:hAnsi="Calibri"/>
+                <w:sz w:val="18"/>
+                <w:szCs w:val="18"/>
+              </w:rPr>
+              <w:t xml:space="preserve">Definição do arquétipo usada para concluir que a Porta 1 NÃO o instancia (D-04).</w:t>
+            </w:r>
+          </w:p>
+        </w:tc>
+        <w:tc>
+          <w:tcPr>
+            <w:tcW w:type="dxa" w:w="1900"/>
+            <w:shd w:fill="F2F2F2" w:color="auto" w:val="clear"/>
+            <w:tcMar>
+              <w:top w:type="dxa" w:w="80"/>
+              <w:left w:type="dxa" w:w="100"/>
+              <w:bottom w:type="dxa" w:w="80"/>
+              <w:right w:type="dxa" w:w="100"/>
+            </w:tcMar>
+          </w:tcPr>
+          <w:p>
+            <w:pPr>
+              <w:spacing w:after="40"/>
+            </w:pPr>
+            <w:r>
+              <w:rPr>
+                <w:rFonts w:ascii="Calibri" w:cs="Calibri" w:eastAsia="Calibri" w:hAnsi="Calibri"/>
+                <w:b/>
+                <w:bCs/>
+                <w:color w:val="1E6B3A"/>
+                <w:sz w:val="18"/>
+                <w:szCs w:val="18"/>
+              </w:rPr>
+              <w:t xml:space="preserve">TEXTO LIDO</w:t>
+            </w:r>
+          </w:p>
+        </w:tc>
+      </w:tr>
+      <w:tr>
+        <w:trPr>
+          <w:cantSplit/>
+        </w:trPr>
+        <w:tc>
+          <w:tcPr>
+            <w:tcW w:type="dxa" w:w="2750"/>
+            <w:tcMar>
+              <w:top w:type="dxa" w:w="80"/>
+              <w:left w:type="dxa" w:w="100"/>
+              <w:bottom w:type="dxa" w:w="80"/>
+              <w:right w:type="dxa" w:w="100"/>
+            </w:tcMar>
+          </w:tcPr>
+          <w:p>
+            <w:pPr>
+              <w:spacing w:after="40"/>
+            </w:pPr>
+            <w:r>
+              <w:rPr>
+                <w:rFonts w:ascii="Calibri" w:cs="Calibri" w:eastAsia="Calibri" w:hAnsi="Calibri"/>
+                <w:b/>
+                <w:bCs/>
+                <w:sz w:val="20"/>
+                <w:szCs w:val="20"/>
+              </w:rPr>
               <w:t xml:space="preserve">Wood, R. E. (1986). </w:t>
             </w:r>
             <w:r>
@@ -4079,7 +7757,7 @@
             <w:pPr>
               <w:spacing w:after="40"/>
             </w:pPr>
-            <w:hyperlink w:history="1" r:id="rIdfjaznglphg-3skwhhld6c">
+            <w:hyperlink w:history="1" r:id="rIdm71bsndygxhmfchhqfuzi">
               <w:r>
                 <w:rPr>
                   <w:rStyle w:val="Hyperlink"/>
@@ -4198,7 +7876,7 @@
             <w:pPr>
               <w:spacing w:after="40"/>
             </w:pPr>
-            <w:hyperlink w:history="1" r:id="rIdgjyr0hie1umgyyi6uqiao">
+            <w:hyperlink w:history="1" r:id="rIdyjilyuikvk05bskd_ecoq">
               <w:r>
                 <w:rPr>
                   <w:rStyle w:val="Hyperlink"/>
@@ -4317,7 +7995,7 @@
             <w:pPr>
               <w:spacing w:after="40"/>
             </w:pPr>
-            <w:hyperlink w:history="1" r:id="rIdcc37m0o3wkdo5iflh0lgd">
+            <w:hyperlink w:history="1" r:id="rIdidctomlrp3i1immbxwldp">
               <w:r>
                 <w:rPr>
                   <w:rStyle w:val="Hyperlink"/>
@@ -4436,7 +8114,7 @@
             <w:pPr>
               <w:spacing w:after="40"/>
             </w:pPr>
-            <w:hyperlink w:history="1" r:id="rIdz2qxq5hti8oro1tvupahv">
+            <w:hyperlink w:history="1" r:id="rIdkiilkl-znceghdmpzqrr4">
               <w:r>
                 <w:rPr>
                   <w:rStyle w:val="Hyperlink"/>
@@ -4555,7 +8233,7 @@
             <w:pPr>
               <w:spacing w:after="40"/>
             </w:pPr>
-            <w:hyperlink w:history="1" r:id="rIdbpzezpucci1msjlusc43r">
+            <w:hyperlink w:history="1" r:id="rIddljgyq4xnwekyt-fh4ycs">
               <w:r>
                 <w:rPr>
                   <w:rStyle w:val="Hyperlink"/>
@@ -5108,7 +8786,7 @@
             <w:pPr>
               <w:spacing w:after="40"/>
             </w:pPr>
-            <w:hyperlink w:history="1" r:id="rId3zla-eqs8zw6h2k5yrkmi">
+            <w:hyperlink w:history="1" r:id="rId7qkkbctuj1xqo_xgpabot">
               <w:r>
                 <w:rPr>
                   <w:rStyle w:val="Hyperlink"/>
@@ -6599,7 +10277,7 @@
           <w:sz w:val="21"/>
           <w:szCs w:val="21"/>
         </w:rPr>
-        <w:t xml:space="preserve">R-01 — f_atalho ≈ 0,87 derivado do estudo de leitura</w:t>
+        <w:t xml:space="preserve">O padrão, que é mais útil que a lista</w:t>
       </w:r>
     </w:p>
     <w:p>
@@ -6616,15 +10294,69 @@
           <w:sz w:val="20"/>
           <w:szCs w:val="20"/>
         </w:rPr>
-        <w:t xml:space="preserve">O que eu disse:  </w:t>
-      </w:r>
-      <w:r>
-        <w:rPr>
-          <w:rFonts w:ascii="Calibri" w:cs="Calibri" w:eastAsia="Calibri" w:hAnsi="Calibri"/>
-          <w:sz w:val="20"/>
-          <w:szCs w:val="20"/>
-        </w:rPr>
-        <w:t xml:space="preserve">que o estudo de leitura sob restrição de tempo permitia estimar o fator de encurtamento de duração da heurística em cerca de 0,87.</w:t>
+        <w:t xml:space="preserve">Catorze retratações depois, o erro tem uma forma recorrente:  </w:t>
+      </w:r>
+      <w:r>
+        <w:rPr>
+          <w:rFonts w:ascii="Calibri" w:cs="Calibri" w:eastAsia="Calibri" w:hAnsi="Calibri"/>
+          <w:sz w:val="20"/>
+          <w:szCs w:val="20"/>
+        </w:rPr>
+        <w:t xml:space="preserve">eu forneço o raciocínio que a fonte não fornece, e sempre na direção que reforça a conclusão que eu já esperava. </w:t>
+      </w:r>
+      <w:r>
+        <w:rPr>
+          <w:rFonts w:ascii="Calibri" w:cs="Calibri" w:eastAsia="Calibri" w:hAnsi="Calibri"/>
+          <w:b/>
+          <w:bCs/>
+          <w:sz w:val="20"/>
+          <w:szCs w:val="20"/>
+        </w:rPr>
+        <w:t xml:space="preserve">R-12</w:t>
+      </w:r>
+      <w:r>
+        <w:rPr>
+          <w:rFonts w:ascii="Calibri" w:cs="Calibri" w:eastAsia="Calibri" w:hAnsi="Calibri"/>
+          <w:sz w:val="20"/>
+          <w:szCs w:val="20"/>
+        </w:rPr>
+        <w:t xml:space="preserve"> — manipulação falha lida como efeito nulo. </w:t>
+      </w:r>
+      <w:r>
+        <w:rPr>
+          <w:rFonts w:ascii="Calibri" w:cs="Calibri" w:eastAsia="Calibri" w:hAnsi="Calibri"/>
+          <w:b/>
+          <w:bCs/>
+          <w:sz w:val="20"/>
+          <w:szCs w:val="20"/>
+        </w:rPr>
+        <w:t xml:space="preserve">R-14</w:t>
+      </w:r>
+      <w:r>
+        <w:rPr>
+          <w:rFonts w:ascii="Calibri" w:cs="Calibri" w:eastAsia="Calibri" w:hAnsi="Calibri"/>
+          <w:sz w:val="20"/>
+          <w:szCs w:val="20"/>
+        </w:rPr>
+        <w:t xml:space="preserve"> — taxas medidas lidas como derivadas de um mecanismo. </w:t>
+      </w:r>
+      <w:r>
+        <w:rPr>
+          <w:rFonts w:ascii="Calibri" w:cs="Calibri" w:eastAsia="Calibri" w:hAnsi="Calibri"/>
+          <w:b/>
+          <w:bCs/>
+          <w:sz w:val="20"/>
+          <w:szCs w:val="20"/>
+        </w:rPr>
+        <w:t xml:space="preserve">R-02</w:t>
+      </w:r>
+      <w:r>
+        <w:rPr>
+          <w:rFonts w:ascii="Calibri" w:cs="Calibri" w:eastAsia="Calibri" w:hAnsi="Calibri"/>
+          <w:sz w:val="20"/>
+          <w:szCs w:val="20"/>
+        </w:rPr>
+        <w:t xml:space="preserve"> — uma diferença de magnitude lida como impossibilidade. Em todos os três a fonte diz menos do que eu disse que ela dizia, e o excesso vai na direção conveniente.</w:t>
       </w:r>
     </w:p>
     <w:p>
@@ -6641,40 +10373,67 @@
           <w:sz w:val="20"/>
           <w:szCs w:val="20"/>
         </w:rPr>
-        <w:t xml:space="preserve">Por que está errado:  </w:t>
-      </w:r>
-      <w:r>
-        <w:rPr>
-          <w:rFonts w:ascii="Calibri" w:cs="Calibri" w:eastAsia="Calibri" w:hAnsi="Calibri"/>
-          <w:sz w:val="20"/>
-          <w:szCs w:val="20"/>
-        </w:rPr>
-        <w:t xml:space="preserve">obtive o texto integral e o orçamento de tempo é fixado pelo experimentador (30 / 60 / 90 s). A velocidade ali é resposta a um prazo imposto, não ganho intrínseco da estratégia. A direção causal é inversa à do modelo.</w:t>
-      </w:r>
-    </w:p>
-    <w:p>
-      <w:pPr>
-        <w:spacing w:after="90"/>
-        <w:ind w:left="200"/>
-      </w:pPr>
-      <w:r>
-        <w:rPr>
-          <w:rFonts w:ascii="Calibri" w:cs="Calibri" w:eastAsia="Calibri" w:hAnsi="Calibri"/>
-          <w:b/>
-          <w:bCs/>
-          <w:color w:val="9B2C5E"/>
-          <w:sz w:val="20"/>
-          <w:szCs w:val="20"/>
-        </w:rPr>
-        <w:t xml:space="preserve">Estado:  </w:t>
-      </w:r>
-      <w:r>
-        <w:rPr>
-          <w:rFonts w:ascii="Calibri" w:cs="Calibri" w:eastAsia="Calibri" w:hAnsi="Calibri"/>
-          <w:sz w:val="20"/>
-          <w:szCs w:val="20"/>
-        </w:rPr>
-        <w:t xml:space="preserve">f_atalho volta a ser parâmetro sem fonte (D-03).</w:t>
+        <w:t xml:space="preserve">Consequência prática para a autora:  </w:t>
+      </w:r>
+      <w:r>
+        <w:rPr>
+          <w:rFonts w:ascii="Calibri" w:cs="Calibri" w:eastAsia="Calibri" w:hAnsi="Calibri"/>
+          <w:sz w:val="20"/>
+          <w:szCs w:val="20"/>
+        </w:rPr>
+        <w:t xml:space="preserve">quando eu afirmar que uma fonte </w:t>
+      </w:r>
+      <w:r>
+        <w:rPr>
+          <w:rFonts w:ascii="Calibri" w:cs="Calibri" w:eastAsia="Calibri" w:hAnsi="Calibri"/>
+          <w:b/>
+          <w:bCs/>
+          <w:sz w:val="20"/>
+          <w:szCs w:val="20"/>
+        </w:rPr>
+        <w:t xml:space="preserve">demonstra</w:t>
+      </w:r>
+      <w:r>
+        <w:rPr>
+          <w:rFonts w:ascii="Calibri" w:cs="Calibri" w:eastAsia="Calibri" w:hAnsi="Calibri"/>
+          <w:sz w:val="20"/>
+          <w:szCs w:val="20"/>
+        </w:rPr>
+        <w:t xml:space="preserve"> alguma coisa, vale perguntar se ela demonstra ou se apenas é compatível. E vale continuar cruzando com a outra conversa — das catorze retratações, </w:t>
+      </w:r>
+      <w:r>
+        <w:rPr>
+          <w:rFonts w:ascii="Calibri" w:cs="Calibri" w:eastAsia="Calibri" w:hAnsi="Calibri"/>
+          <w:b/>
+          <w:bCs/>
+          <w:sz w:val="20"/>
+          <w:szCs w:val="20"/>
+        </w:rPr>
+        <w:t xml:space="preserve">quatro foram apontadas por terceiros</w:t>
+      </w:r>
+      <w:r>
+        <w:rPr>
+          <w:rFonts w:ascii="Calibri" w:cs="Calibri" w:eastAsia="Calibri" w:hAnsi="Calibri"/>
+          <w:sz w:val="20"/>
+          <w:szCs w:val="20"/>
+        </w:rPr>
+        <w:t xml:space="preserve"> (R-07 e R-08 pelo Codex; R-09, R-11 a R-14 pela análise paralela), não por mim.</w:t>
+      </w:r>
+    </w:p>
+    <w:p>
+      <w:pPr>
+        <w:spacing w:after="120" w:before="0"/>
+      </w:pPr>
+      <w:r>
+        <w:rPr>
+          <w:rFonts w:ascii="Calibri" w:cs="Calibri" w:eastAsia="Calibri" w:hAnsi="Calibri"/>
+          <w:i/>
+          <w:iCs/>
+          <w:color w:val="666666"/>
+          <w:sz w:val="20"/>
+          <w:szCs w:val="20"/>
+        </w:rPr>
+        <w:t xml:space="preserve">Contrapeso justo: nenhuma das catorze chegou à monografia, porque todas apareceram dentro do ciclo de revisão. O procedimento está funcionando — é isso que ele existe para fazer.</w:t>
       </w:r>
     </w:p>
     <w:p>
@@ -6691,7 +10450,7 @@
           <w:sz w:val="21"/>
           <w:szCs w:val="21"/>
         </w:rPr>
-        <w:t xml:space="preserve">R-02 — “46% está fora de qualquer leitura razoável”</w:t>
+        <w:t xml:space="preserve">R-01 — f_atalho ≈ 0,87 derivado do estudo de leitura</w:t>
       </w:r>
     </w:p>
     <w:p>
@@ -6716,7 +10475,7 @@
           <w:sz w:val="20"/>
           <w:szCs w:val="20"/>
         </w:rPr>
-        <w:t xml:space="preserve">que 46% de retrabalho contra a faixa empírica de 4–11% estava fora de qualquer leitura razoável.</w:t>
+        <w:t xml:space="preserve">que o estudo de leitura sob restrição de tempo permitia estimar o fator de encurtamento de duração da heurística em cerca de 0,87.</w:t>
       </w:r>
     </w:p>
     <w:p>
@@ -6741,7 +10500,7 @@
           <w:sz w:val="20"/>
           <w:szCs w:val="20"/>
         </w:rPr>
-        <w:t xml:space="preserve">exagero. Você contrapôs com Boehm &amp; Basili (40–50% do esforço de software em retrabalho evitável) e o contraponto é legítimo.</w:t>
+        <w:t xml:space="preserve">obtive o texto integral e o orçamento de tempo é fixado pelo experimentador (30 / 60 / 90 s). A velocidade ali é resposta a um prazo imposto, não ganho intrínseco da estratégia. A direção causal é inversa à do modelo.</w:t>
       </w:r>
     </w:p>
     <w:p>
@@ -6758,15 +10517,15 @@
           <w:sz w:val="20"/>
           <w:szCs w:val="20"/>
         </w:rPr>
-        <w:t xml:space="preserve">Posição corrigida:  </w:t>
-      </w:r>
-      <w:r>
-        <w:rPr>
-          <w:rFonts w:ascii="Calibri" w:cs="Calibri" w:eastAsia="Calibri" w:hAnsi="Calibri"/>
-          <w:sz w:val="20"/>
-          <w:szCs w:val="20"/>
-        </w:rPr>
-        <w:t xml:space="preserve">concedo o exagero, mas mantenho que o contraponto desloca o problema em vez de resolvê-lo — ele reintroduz empréstimo entre domínios. A posição honesta é que 46% hoje não é defensável nem refutável, por falta de comparador na mesma unidade (D-08).</w:t>
+        <w:t xml:space="preserve">Estado:  </w:t>
+      </w:r>
+      <w:r>
+        <w:rPr>
+          <w:rFonts w:ascii="Calibri" w:cs="Calibri" w:eastAsia="Calibri" w:hAnsi="Calibri"/>
+          <w:sz w:val="20"/>
+          <w:szCs w:val="20"/>
+        </w:rPr>
+        <w:t xml:space="preserve">f_atalho volta a ser parâmetro sem fonte (D-03).</w:t>
       </w:r>
     </w:p>
     <w:p>
@@ -6783,7 +10542,7 @@
           <w:sz w:val="21"/>
           <w:szCs w:val="21"/>
         </w:rPr>
-        <w:t xml:space="preserve">R-03 — Previsão quantitativa do estreitamento do NROY</w:t>
+        <w:t xml:space="preserve">R-02 — “46% está fora de qualquer leitura razoável”</w:t>
       </w:r>
     </w:p>
     <w:p>
@@ -6808,7 +10567,7 @@
           <w:sz w:val="20"/>
           <w:szCs w:val="20"/>
         </w:rPr>
-        <w:t xml:space="preserve">que sob CRITICAL-2 as larguras do NROY apertariam para cerca de 60% e 42%.</w:t>
+        <w:t xml:space="preserve">que 46% de retrabalho contra a faixa empírica de 4–11% estava fora de qualquer leitura razoável.</w:t>
       </w:r>
     </w:p>
     <w:p>
@@ -6833,7 +10592,32 @@
           <w:sz w:val="20"/>
           <w:szCs w:val="20"/>
         </w:rPr>
-        <w:t xml:space="preserve">o piloto de fronteira mostrou 4 de 4 pontos do NROY legado rejeitados em K = 64. O NROY esvazia, não estreita. Minha aproximação de mesa era conservadora demais.</w:t>
+        <w:t xml:space="preserve">exagero. Você contrapôs com Boehm &amp; Basili (40–50% do esforço de software em retrabalho evitável) e o contraponto é legítimo.</w:t>
+      </w:r>
+    </w:p>
+    <w:p>
+      <w:pPr>
+        <w:spacing w:after="90"/>
+        <w:ind w:left="200"/>
+      </w:pPr>
+      <w:r>
+        <w:rPr>
+          <w:rFonts w:ascii="Calibri" w:cs="Calibri" w:eastAsia="Calibri" w:hAnsi="Calibri"/>
+          <w:b/>
+          <w:bCs/>
+          <w:color w:val="9B2C5E"/>
+          <w:sz w:val="20"/>
+          <w:szCs w:val="20"/>
+        </w:rPr>
+        <w:t xml:space="preserve">Posição corrigida:  </w:t>
+      </w:r>
+      <w:r>
+        <w:rPr>
+          <w:rFonts w:ascii="Calibri" w:cs="Calibri" w:eastAsia="Calibri" w:hAnsi="Calibri"/>
+          <w:sz w:val="20"/>
+          <w:szCs w:val="20"/>
+        </w:rPr>
+        <w:t xml:space="preserve">concedo o exagero, mas mantenho que o contraponto desloca o problema em vez de resolvê-lo — ele reintroduz empréstimo entre domínios. A posição honesta é que 46% hoje não é defensável nem refutável, por falta de comparador na mesma unidade (D-08).</w:t>
       </w:r>
     </w:p>
     <w:p>
@@ -6850,6 +10634,73 @@
           <w:sz w:val="21"/>
           <w:szCs w:val="21"/>
         </w:rPr>
+        <w:t xml:space="preserve">R-03 — Previsão quantitativa do estreitamento do NROY</w:t>
+      </w:r>
+    </w:p>
+    <w:p>
+      <w:pPr>
+        <w:spacing w:after="90"/>
+        <w:ind w:left="200"/>
+      </w:pPr>
+      <w:r>
+        <w:rPr>
+          <w:rFonts w:ascii="Calibri" w:cs="Calibri" w:eastAsia="Calibri" w:hAnsi="Calibri"/>
+          <w:b/>
+          <w:bCs/>
+          <w:color w:val="9B2C5E"/>
+          <w:sz w:val="20"/>
+          <w:szCs w:val="20"/>
+        </w:rPr>
+        <w:t xml:space="preserve">O que eu disse:  </w:t>
+      </w:r>
+      <w:r>
+        <w:rPr>
+          <w:rFonts w:ascii="Calibri" w:cs="Calibri" w:eastAsia="Calibri" w:hAnsi="Calibri"/>
+          <w:sz w:val="20"/>
+          <w:szCs w:val="20"/>
+        </w:rPr>
+        <w:t xml:space="preserve">que sob CRITICAL-2 as larguras do NROY apertariam para cerca de 60% e 42%.</w:t>
+      </w:r>
+    </w:p>
+    <w:p>
+      <w:pPr>
+        <w:spacing w:after="90"/>
+        <w:ind w:left="200"/>
+      </w:pPr>
+      <w:r>
+        <w:rPr>
+          <w:rFonts w:ascii="Calibri" w:cs="Calibri" w:eastAsia="Calibri" w:hAnsi="Calibri"/>
+          <w:b/>
+          <w:bCs/>
+          <w:color w:val="9B2C5E"/>
+          <w:sz w:val="20"/>
+          <w:szCs w:val="20"/>
+        </w:rPr>
+        <w:t xml:space="preserve">Por que está errado:  </w:t>
+      </w:r>
+      <w:r>
+        <w:rPr>
+          <w:rFonts w:ascii="Calibri" w:cs="Calibri" w:eastAsia="Calibri" w:hAnsi="Calibri"/>
+          <w:sz w:val="20"/>
+          <w:szCs w:val="20"/>
+        </w:rPr>
+        <w:t xml:space="preserve">o piloto de fronteira mostrou 4 de 4 pontos do NROY legado rejeitados em K = 64. O NROY esvazia, não estreita. Minha aproximação de mesa era conservadora demais.</w:t>
+      </w:r>
+    </w:p>
+    <w:p>
+      <w:pPr>
+        <w:pStyle w:val="Heading3"/>
+        <w:spacing w:after="100" w:before="220"/>
+      </w:pPr>
+      <w:r>
+        <w:rPr>
+          <w:rFonts w:ascii="Calibri" w:cs="Calibri" w:eastAsia="Calibri" w:hAnsi="Calibri"/>
+          <w:b/>
+          <w:bCs/>
+          <w:color w:val="333333"/>
+          <w:sz w:val="21"/>
+          <w:szCs w:val="21"/>
+        </w:rPr>
         <w:t xml:space="preserve">R-04 — “Renomear” o gradiente</w:t>
       </w:r>
     </w:p>
@@ -6901,6 +10752,525 @@
           <w:szCs w:val="20"/>
         </w:rPr>
         <w:t xml:space="preserve">você apontou corretamente que multiplicadores calculados sobre quartis de complexidade ciclomática não podem ser rerrotulados como gradiente de tamanho depois do fato. O recálculo sobre linhas de código é necessário, não opcional — e os próprios números que eu havia reportado (2,99 contra 5,37) já mostravam que o resultado muda.</w:t>
+      </w:r>
+    </w:p>
+    <w:p>
+      <w:pPr>
+        <w:pStyle w:val="Heading3"/>
+        <w:spacing w:after="100" w:before="220"/>
+      </w:pPr>
+      <w:r>
+        <w:rPr>
+          <w:rFonts w:ascii="Calibri" w:cs="Calibri" w:eastAsia="Calibri" w:hAnsi="Calibri"/>
+          <w:b/>
+          <w:bCs/>
+          <w:color w:val="333333"/>
+          <w:sz w:val="21"/>
+          <w:szCs w:val="21"/>
+        </w:rPr>
+        <w:t xml:space="preserve">R-14 — “A linearidade de Stewart vem da composição por independência, e foi refutada”</w:t>
+      </w:r>
+    </w:p>
+    <w:p>
+      <w:pPr>
+        <w:spacing w:after="90"/>
+        <w:ind w:left="200"/>
+      </w:pPr>
+      <w:r>
+        <w:rPr>
+          <w:rFonts w:ascii="Calibri" w:cs="Calibri" w:eastAsia="Calibri" w:hAnsi="Calibri"/>
+          <w:b/>
+          <w:bCs/>
+          <w:color w:val="9B2C5E"/>
+          <w:sz w:val="20"/>
+          <w:szCs w:val="20"/>
+        </w:rPr>
+        <w:t xml:space="preserve">O que eu escrevi:  </w:t>
+      </w:r>
+      <w:r>
+        <w:rPr>
+          <w:rFonts w:ascii="Calibri" w:cs="Calibri" w:eastAsia="Calibri" w:hAnsi="Calibri"/>
+          <w:sz w:val="20"/>
+          <w:szCs w:val="20"/>
+        </w:rPr>
+        <w:t xml:space="preserve">que a relação p(k) = k × 0,0128 é a aproximação de primeira ordem da composição por independência, e que portanto a rejeição da independência em Stewart (1992) refuta o mecanismo da reta.</w:t>
+      </w:r>
+    </w:p>
+    <w:p>
+      <w:pPr>
+        <w:spacing w:after="90"/>
+        <w:ind w:left="200"/>
+      </w:pPr>
+      <w:r>
+        <w:rPr>
+          <w:rFonts w:ascii="Calibri" w:cs="Calibri" w:eastAsia="Calibri" w:hAnsi="Calibri"/>
+          <w:b/>
+          <w:bCs/>
+          <w:color w:val="9B2C5E"/>
+          <w:sz w:val="20"/>
+          <w:szCs w:val="20"/>
+        </w:rPr>
+        <w:t xml:space="preserve">Por que está errado:  </w:t>
+      </w:r>
+      <w:r>
+        <w:rPr>
+          <w:rFonts w:ascii="Calibri" w:cs="Calibri" w:eastAsia="Calibri" w:hAnsi="Calibri"/>
+          <w:sz w:val="20"/>
+          <w:szCs w:val="20"/>
+        </w:rPr>
+        <w:t xml:space="preserve">Stewart &amp; Melchers (1988) não DERIVAM aqueles números de composição alguma — eles simplesmente reportam taxas medidas por número de passos. Eu atribuí aos autores um mecanismo que eles não enunciam, e depois tratei a minha inferência como se fosse o que a fonte diz.</w:t>
+      </w:r>
+    </w:p>
+    <w:p>
+      <w:pPr>
+        <w:spacing w:after="90"/>
+        <w:ind w:left="200"/>
+      </w:pPr>
+      <w:r>
+        <w:rPr>
+          <w:rFonts w:ascii="Calibri" w:cs="Calibri" w:eastAsia="Calibri" w:hAnsi="Calibri"/>
+          <w:b/>
+          <w:bCs/>
+          <w:color w:val="9B2C5E"/>
+          <w:sz w:val="20"/>
+          <w:szCs w:val="20"/>
+        </w:rPr>
+        <w:t xml:space="preserve">Formulação correta:  </w:t>
+      </w:r>
+      <w:r>
+        <w:rPr>
+          <w:rFonts w:ascii="Calibri" w:cs="Calibri" w:eastAsia="Calibri" w:hAnsi="Calibri"/>
+          <w:sz w:val="20"/>
+          <w:szCs w:val="20"/>
+        </w:rPr>
+        <w:t xml:space="preserve">a linearidade é empírica nos pontos publicados e não deve ser extrapolada sem cautela — ainda mais porque Stewart (1992) mostra que a ocorrência de erros não é bem descrita por independência simples. A não independência é razão SEPARADA para cautela na extrapolação, não o alicerce refutado da reta.</w:t>
+      </w:r>
+    </w:p>
+    <w:p>
+      <w:pPr>
+        <w:pStyle w:val="Heading3"/>
+        <w:spacing w:after="100" w:before="220"/>
+      </w:pPr>
+      <w:r>
+        <w:rPr>
+          <w:rFonts w:ascii="Calibri" w:cs="Calibri" w:eastAsia="Calibri" w:hAnsi="Calibri"/>
+          <w:b/>
+          <w:bCs/>
+          <w:color w:val="333333"/>
+          <w:sz w:val="21"/>
+          <w:szCs w:val="21"/>
+        </w:rPr>
+        <w:t xml:space="preserve">R-13 — A omissão de Stewart sustenta a rota de fuga</w:t>
+      </w:r>
+    </w:p>
+    <w:p>
+      <w:pPr>
+        <w:spacing w:after="90"/>
+        <w:ind w:left="200"/>
+      </w:pPr>
+      <w:r>
+        <w:rPr>
+          <w:rFonts w:ascii="Calibri" w:cs="Calibri" w:eastAsia="Calibri" w:hAnsi="Calibri"/>
+          <w:b/>
+          <w:bCs/>
+          <w:color w:val="9B2C5E"/>
+          <w:sz w:val="20"/>
+          <w:szCs w:val="20"/>
+        </w:rPr>
+        <w:t xml:space="preserve">O que eu escrevi:  </w:t>
+      </w:r>
+      <w:r>
+        <w:rPr>
+          <w:rFonts w:ascii="Calibri" w:cs="Calibri" w:eastAsia="Calibri" w:hAnsi="Calibri"/>
+          <w:sz w:val="20"/>
+          <w:szCs w:val="20"/>
+        </w:rPr>
+        <w:t xml:space="preserve">que as taxas de omissão de 0,40 a 0,80 de Stewart &amp; Melchers justificam corrigir a rota de fuga.</w:t>
+      </w:r>
+    </w:p>
+    <w:p>
+      <w:pPr>
+        <w:spacing w:after="90"/>
+        <w:ind w:left="200"/>
+      </w:pPr>
+      <w:r>
+        <w:rPr>
+          <w:rFonts w:ascii="Calibri" w:cs="Calibri" w:eastAsia="Calibri" w:hAnsi="Calibri"/>
+          <w:b/>
+          <w:bCs/>
+          <w:color w:val="9B2C5E"/>
+          <w:sz w:val="20"/>
+          <w:szCs w:val="20"/>
+        </w:rPr>
+        <w:t xml:space="preserve">Por que está errado:  </w:t>
+      </w:r>
+      <w:r>
+        <w:rPr>
+          <w:rFonts w:ascii="Calibri" w:cs="Calibri" w:eastAsia="Calibri" w:hAnsi="Calibri"/>
+          <w:sz w:val="20"/>
+          <w:szCs w:val="20"/>
+        </w:rPr>
+        <w:t xml:space="preserve">em Stewart &amp; Melchers, omissão é pular uma microtarefa DENTRO da macrotarefa; o algoritmo segue e a atividade é concluída, pior. Isso corresponde à Porta 1, não ao adiamento. O análogo da fuga é o “care left undone” de Ball e White, onde a tarefa necessária não é realizada. Eu havia mapeado Ball e White corretamente e depois misturei Stewart no mesmo balde.</w:t>
+      </w:r>
+    </w:p>
+    <w:p>
+      <w:pPr>
+        <w:pStyle w:val="Heading3"/>
+        <w:spacing w:after="100" w:before="220"/>
+      </w:pPr>
+      <w:r>
+        <w:rPr>
+          <w:rFonts w:ascii="Calibri" w:cs="Calibri" w:eastAsia="Calibri" w:hAnsi="Calibri"/>
+          <w:b/>
+          <w:bCs/>
+          <w:color w:val="333333"/>
+          <w:sz w:val="21"/>
+          <w:szCs w:val="21"/>
+        </w:rPr>
+        <w:t xml:space="preserve">R-12 — “Stewart (1992) é o quinto achado sem efeito de pressão sobre erro”</w:t>
+      </w:r>
+    </w:p>
+    <w:p>
+      <w:pPr>
+        <w:spacing w:after="90"/>
+        <w:ind w:left="200"/>
+      </w:pPr>
+      <w:r>
+        <w:rPr>
+          <w:rFonts w:ascii="Calibri" w:cs="Calibri" w:eastAsia="Calibri" w:hAnsi="Calibri"/>
+          <w:b/>
+          <w:bCs/>
+          <w:color w:val="9B2C5E"/>
+          <w:sz w:val="20"/>
+          <w:szCs w:val="20"/>
+        </w:rPr>
+        <w:t xml:space="preserve">O que eu escrevi:  </w:t>
+      </w:r>
+      <w:r>
+        <w:rPr>
+          <w:rFonts w:ascii="Calibri" w:cs="Calibri" w:eastAsia="Calibri" w:hAnsi="Calibri"/>
+          <w:sz w:val="20"/>
+          <w:szCs w:val="20"/>
+        </w:rPr>
+        <w:t xml:space="preserve">que Stewart engrossava uma lista de cinco achados independentes de efeito nulo da pressão sobre erro.</w:t>
+      </w:r>
+    </w:p>
+    <w:p>
+      <w:pPr>
+        <w:spacing w:after="90"/>
+        <w:ind w:left="200"/>
+      </w:pPr>
+      <w:r>
+        <w:rPr>
+          <w:rFonts w:ascii="Calibri" w:cs="Calibri" w:eastAsia="Calibri" w:hAnsi="Calibri"/>
+          <w:b/>
+          <w:bCs/>
+          <w:color w:val="9B2C5E"/>
+          <w:sz w:val="20"/>
+          <w:szCs w:val="20"/>
+        </w:rPr>
+        <w:t xml:space="preserve">Por que está errado:  </w:t>
+      </w:r>
+      <w:r>
+        <w:rPr>
+          <w:rFonts w:ascii="Calibri" w:cs="Calibri" w:eastAsia="Calibri" w:hAnsi="Calibri"/>
+          <w:sz w:val="20"/>
+          <w:szCs w:val="20"/>
+        </w:rPr>
+        <w:t xml:space="preserve">a manipulação de pressão FALHOU — os tempos de resposta das duas sub-amostras não diferiram e o próprio autor as funde, dizendo que as instruções não foram suficientemente explícitas. Manipulação que falha não produz informação sobre o efeito. E eu ainda contei Stewart &amp; Melchers (1988) como quarto achado, quando a hipótese “sem restrição de tempo” daquele artigo é declaração de escopo do modelo, não resultado.</w:t>
+      </w:r>
+    </w:p>
+    <w:p>
+      <w:pPr>
+        <w:spacing w:after="90"/>
+        <w:ind w:left="200"/>
+      </w:pPr>
+      <w:r>
+        <w:rPr>
+          <w:rFonts w:ascii="Calibri" w:cs="Calibri" w:eastAsia="Calibri" w:hAnsi="Calibri"/>
+          <w:b/>
+          <w:bCs/>
+          <w:color w:val="9B2C5E"/>
+          <w:sz w:val="20"/>
+          <w:szCs w:val="20"/>
+        </w:rPr>
+        <w:t xml:space="preserve">Contagem honesta:  </w:t>
+      </w:r>
+      <w:r>
+        <w:rPr>
+          <w:rFonts w:ascii="Calibri" w:cs="Calibri" w:eastAsia="Calibri" w:hAnsi="Calibri"/>
+          <w:sz w:val="20"/>
+          <w:szCs w:val="20"/>
+        </w:rPr>
+        <w:t xml:space="preserve">nenhum estudo de campo com manipulação limpa demonstrou efeito direto de pressão sobre erro no sentido do modelo; três tentativas deram nulo ou sinal oposto, cada uma com seu descasamento de construto. A recomendação de rodar o cenário com o canal desligado sobrevive — por ausência de evidência, não por demonstração de nulidade.</w:t>
+      </w:r>
+    </w:p>
+    <w:p>
+      <w:pPr>
+        <w:pStyle w:val="Heading3"/>
+        <w:spacing w:after="100" w:before="220"/>
+      </w:pPr>
+      <w:r>
+        <w:rPr>
+          <w:rFonts w:ascii="Calibri" w:cs="Calibri" w:eastAsia="Calibri" w:hAnsi="Calibri"/>
+          <w:b/>
+          <w:bCs/>
+          <w:color w:val="333333"/>
+          <w:sz w:val="21"/>
+          <w:szCs w:val="21"/>
+        </w:rPr>
+        <w:t xml:space="preserve">R-11 — “A varredura de F_ancora corresponde a 4 a 20 passos”</w:t>
+      </w:r>
+    </w:p>
+    <w:p>
+      <w:pPr>
+        <w:spacing w:after="90"/>
+        <w:ind w:left="200"/>
+      </w:pPr>
+      <w:r>
+        <w:rPr>
+          <w:rFonts w:ascii="Calibri" w:cs="Calibri" w:eastAsia="Calibri" w:hAnsi="Calibri"/>
+          <w:b/>
+          <w:bCs/>
+          <w:color w:val="9B2C5E"/>
+          <w:sz w:val="20"/>
+          <w:szCs w:val="20"/>
+        </w:rPr>
+        <w:t xml:space="preserve">O que eu escrevi:  </w:t>
+      </w:r>
+      <w:r>
+        <w:rPr>
+          <w:rFonts w:ascii="Calibri" w:cs="Calibri" w:eastAsia="Calibri" w:hAnsi="Calibri"/>
+          <w:sz w:val="20"/>
+          <w:szCs w:val="20"/>
+        </w:rPr>
+        <w:t xml:space="preserve">que a faixa [0,05 ; 0,25] mapeia em atividades de 4 a 20 passos elementares, como se fosse correspondência estabelecida.</w:t>
+      </w:r>
+    </w:p>
+    <w:p>
+      <w:pPr>
+        <w:spacing w:after="90"/>
+        <w:ind w:left="200"/>
+      </w:pPr>
+      <w:r>
+        <w:rPr>
+          <w:rFonts w:ascii="Calibri" w:cs="Calibri" w:eastAsia="Calibri" w:hAnsi="Calibri"/>
+          <w:b/>
+          <w:bCs/>
+          <w:color w:val="9B2C5E"/>
+          <w:sz w:val="20"/>
+          <w:szCs w:val="20"/>
+        </w:rPr>
+        <w:t xml:space="preserve">Por que está errado:  </w:t>
+      </w:r>
+      <w:r>
+        <w:rPr>
+          <w:rFonts w:ascii="Calibri" w:cs="Calibri" w:eastAsia="Calibri" w:hAnsi="Calibri"/>
+          <w:sz w:val="20"/>
+          <w:szCs w:val="20"/>
+        </w:rPr>
+        <w:t xml:space="preserve">a Tabela 1 de Stewart &amp; Melchers publica k = 1, 2, 3, 4, 5 e 8. O maior valor observado é 8, que dá 0,1024. Dos cinco valores varridos, apenas 0,05 e 0,10 caem na faixa observada; 0,15, 0,20 e 0,25 são extrapolação e têm de ser rotulados como cenário de sensibilidade.</w:t>
+      </w:r>
+    </w:p>
+    <w:p>
+      <w:pPr>
+        <w:pStyle w:val="Heading3"/>
+        <w:spacing w:after="100" w:before="220"/>
+      </w:pPr>
+      <w:r>
+        <w:rPr>
+          <w:rFonts w:ascii="Calibri" w:cs="Calibri" w:eastAsia="Calibri" w:hAnsi="Calibri"/>
+          <w:b/>
+          <w:bCs/>
+          <w:color w:val="333333"/>
+          <w:sz w:val="21"/>
+          <w:szCs w:val="21"/>
+        </w:rPr>
+        <w:t xml:space="preserve">R-10 — Composição de F_ancora por independência</w:t>
+      </w:r>
+    </w:p>
+    <w:p>
+      <w:pPr>
+        <w:spacing w:after="90"/>
+        <w:ind w:left="200"/>
+      </w:pPr>
+      <w:r>
+        <w:rPr>
+          <w:rFonts w:ascii="Calibri" w:cs="Calibri" w:eastAsia="Calibri" w:hAnsi="Calibri"/>
+          <w:b/>
+          <w:bCs/>
+          <w:color w:val="9B2C5E"/>
+          <w:sz w:val="20"/>
+          <w:szCs w:val="20"/>
+        </w:rPr>
+        <w:t xml:space="preserve">O que eu escrevi:  </w:t>
+      </w:r>
+      <w:r>
+        <w:rPr>
+          <w:rFonts w:ascii="Calibri" w:cs="Calibri" w:eastAsia="Calibri" w:hAnsi="Calibri"/>
+          <w:sz w:val="20"/>
+          <w:szCs w:val="20"/>
+        </w:rPr>
+        <w:t xml:space="preserve">que a composição seria F_ancora = 1 − (1 − p)^k.</w:t>
+      </w:r>
+    </w:p>
+    <w:p>
+      <w:pPr>
+        <w:spacing w:after="90"/>
+        <w:ind w:left="200"/>
+      </w:pPr>
+      <w:r>
+        <w:rPr>
+          <w:rFonts w:ascii="Calibri" w:cs="Calibri" w:eastAsia="Calibri" w:hAnsi="Calibri"/>
+          <w:b/>
+          <w:bCs/>
+          <w:color w:val="9B2C5E"/>
+          <w:sz w:val="20"/>
+          <w:szCs w:val="20"/>
+        </w:rPr>
+        <w:t xml:space="preserve">Por que está errado:  </w:t>
+      </w:r>
+      <w:r>
+        <w:rPr>
+          <w:rFonts w:ascii="Calibri" w:cs="Calibri" w:eastAsia="Calibri" w:hAnsi="Calibri"/>
+          <w:sz w:val="20"/>
+          <w:szCs w:val="20"/>
+        </w:rPr>
+        <w:t xml:space="preserve">Stewart &amp; Melchers reportam composição LINEAR no número de passos. A regra a citar é a deles, não a minha reconstrução.</w:t>
+      </w:r>
+    </w:p>
+    <w:p>
+      <w:pPr>
+        <w:pStyle w:val="Heading3"/>
+        <w:spacing w:after="100" w:before="220"/>
+      </w:pPr>
+      <w:r>
+        <w:rPr>
+          <w:rFonts w:ascii="Calibri" w:cs="Calibri" w:eastAsia="Calibri" w:hAnsi="Calibri"/>
+          <w:b/>
+          <w:bCs/>
+          <w:color w:val="333333"/>
+          <w:sz w:val="21"/>
+          <w:szCs w:val="21"/>
+        </w:rPr>
+        <w:t xml:space="preserve">R-09 — “O instrumento está desregulado porque I(verdadeiro) = 3,594”</w:t>
+      </w:r>
+    </w:p>
+    <w:p>
+      <w:pPr>
+        <w:spacing w:after="90"/>
+        <w:ind w:left="200"/>
+      </w:pPr>
+      <w:r>
+        <w:rPr>
+          <w:rFonts w:ascii="Calibri" w:cs="Calibri" w:eastAsia="Calibri" w:hAnsi="Calibri"/>
+          <w:b/>
+          <w:bCs/>
+          <w:color w:val="9B2C5E"/>
+          <w:sz w:val="20"/>
+          <w:szCs w:val="20"/>
+        </w:rPr>
+        <w:t xml:space="preserve">O que eu escrevi:  </w:t>
+      </w:r>
+      <w:r>
+        <w:rPr>
+          <w:rFonts w:ascii="Calibri" w:cs="Calibri" w:eastAsia="Calibri" w:hAnsi="Calibri"/>
+          <w:sz w:val="20"/>
+          <w:szCs w:val="20"/>
+        </w:rPr>
+        <w:t xml:space="preserve">que o History Matching rejeitaria o gabarito, logo estaria desregulado.</w:t>
+      </w:r>
+    </w:p>
+    <w:p>
+      <w:pPr>
+        <w:spacing w:after="90"/>
+        <w:ind w:left="200"/>
+      </w:pPr>
+      <w:r>
+        <w:rPr>
+          <w:rFonts w:ascii="Calibri" w:cs="Calibri" w:eastAsia="Calibri" w:hAnsi="Calibri"/>
+          <w:b/>
+          <w:bCs/>
+          <w:color w:val="9B2C5E"/>
+          <w:sz w:val="20"/>
+          <w:szCs w:val="20"/>
+        </w:rPr>
+        <w:t xml:space="preserve">Por que está errado:  </w:t>
+      </w:r>
+      <w:r>
+        <w:rPr>
+          <w:rFonts w:ascii="Calibri" w:cs="Calibri" w:eastAsia="Calibri" w:hAnsi="Calibri"/>
+          <w:sz w:val="20"/>
+          <w:szCs w:val="20"/>
+        </w:rPr>
+        <w:t xml:space="preserve">o z sintético é ele próprio aleatório: mesmo gerado no vetor verdadeiro, não coincide com a esperança em toda realização. Uma realização acima de 3 não demonstra desregulagem. A pergunta certa é a taxa de falsa exclusão sobre muitas réplicas — e os 0/20, 3/20, 2/20 e 4/20 já existentes no repositório são poucos demais para respondê-la.</w:t>
+      </w:r>
+    </w:p>
+    <w:p>
+      <w:pPr>
+        <w:pStyle w:val="Heading3"/>
+        <w:spacing w:after="100" w:before="220"/>
+      </w:pPr>
+      <w:r>
+        <w:rPr>
+          <w:rFonts w:ascii="Calibri" w:cs="Calibri" w:eastAsia="Calibri" w:hAnsi="Calibri"/>
+          <w:b/>
+          <w:bCs/>
+          <w:color w:val="333333"/>
+          <w:sz w:val="21"/>
+          <w:szCs w:val="21"/>
+        </w:rPr>
+        <w:t xml:space="preserve">R-08 — A decomposição logarítmica de taxa_omissao</w:t>
+      </w:r>
+    </w:p>
+    <w:p>
+      <w:pPr>
+        <w:spacing w:after="90"/>
+        <w:ind w:left="200"/>
+      </w:pPr>
+      <w:r>
+        <w:rPr>
+          <w:rFonts w:ascii="Calibri" w:cs="Calibri" w:eastAsia="Calibri" w:hAnsi="Calibri"/>
+          <w:b/>
+          <w:bCs/>
+          <w:color w:val="9B2C5E"/>
+          <w:sz w:val="20"/>
+          <w:szCs w:val="20"/>
+        </w:rPr>
+        <w:t xml:space="preserve">O que eu escrevi:  </w:t>
+      </w:r>
+      <w:r>
+        <w:rPr>
+          <w:rFonts w:ascii="Calibri" w:cs="Calibri" w:eastAsia="Calibri" w:hAnsi="Calibri"/>
+          <w:sz w:val="20"/>
+          <w:szCs w:val="20"/>
+        </w:rPr>
+        <w:t xml:space="preserve">que 93,4% do contraste de taxa_omissao era parcela da premissa de reporte, calculado pela razão logarítmica das probabilidades de não reporte.</w:t>
+      </w:r>
+    </w:p>
+    <w:p>
+      <w:pPr>
+        <w:spacing w:after="90"/>
+        <w:ind w:left="200"/>
+      </w:pPr>
+      <w:r>
+        <w:rPr>
+          <w:rFonts w:ascii="Calibri" w:cs="Calibri" w:eastAsia="Calibri" w:hAnsi="Calibri"/>
+          <w:b/>
+          <w:bCs/>
+          <w:color w:val="9B2C5E"/>
+          <w:sz w:val="20"/>
+          <w:szCs w:val="20"/>
+        </w:rPr>
+        <w:t xml:space="preserve">Por que está errado:  </w:t>
+      </w:r>
+      <w:r>
+        <w:rPr>
+          <w:rFonts w:ascii="Calibri" w:cs="Calibri" w:eastAsia="Calibri" w:hAnsi="Calibri"/>
+          <w:sz w:val="20"/>
+          <w:szCs w:val="20"/>
+        </w:rPr>
+        <w:t xml:space="preserve">essa comparação não identifica parcela causal, porque reporte e detecção também afetam filas, duração, pressão e sorteios futuros. A decomposição por intervenção (T2) mede o regime explicitamente, com as interações, e dá 97,5%. A conclusão qualitativa sobreviveu; o método estava errado.</w:t>
       </w:r>
     </w:p>
     <w:p>
@@ -8442,7 +12812,43 @@
           <w:sz w:val="20"/>
           <w:szCs w:val="20"/>
         </w:rPr>
-        <w:t xml:space="preserve">Decisão nova: abrir D-13, D-14 … na seção 1, sempre com os quatro campos — Decisão, Base, Estado, Ressalva. Se não há ressalva, escrever “nenhuma identificada”, em vez de omitir o campo.</w:t>
+        <w:t xml:space="preserve">Decisão nova ancorada em fonte: abrir D-21, D-22 … na seção 1, obrigatoriamente com os três campos — FONTE SUSTENTA (o que está observado e publicado, com página), DECISÃO DO MODELO (o que escolhemos fazer a partir disso), NÃO SUSTENTA (a extrapolação a evitar). Os três, sempre. É o que impede uma decisão nossa de virar “resultado da literatura” duas semanas depois.</w:t>
+      </w:r>
+    </w:p>
+    <w:p>
+      <w:pPr>
+        <w:pStyle w:val="ListParagraph"/>
+        <w:numPr>
+          <w:ilvl w:val="0"/>
+          <w:numId w:val="2"/>
+        </w:numPr>
+        <w:spacing w:after="70"/>
+      </w:pPr>
+      <w:r>
+        <w:rPr>
+          <w:rFonts w:ascii="Calibri" w:cs="Calibri" w:eastAsia="Calibri" w:hAnsi="Calibri"/>
+          <w:sz w:val="20"/>
+          <w:szCs w:val="20"/>
+        </w:rPr>
+        <w:t xml:space="preserve">Decisão sem fonte externa: mesmos três campos, com FONTE SUSTENTA preenchido com “nada — esta decisão não se apoia em fonte externa”. Não deixar o campo vazio: o vazio é ambíguo, a frase é rastreável.</w:t>
+      </w:r>
+    </w:p>
+    <w:p>
+      <w:pPr>
+        <w:pStyle w:val="ListParagraph"/>
+        <w:numPr>
+          <w:ilvl w:val="0"/>
+          <w:numId w:val="2"/>
+        </w:numPr>
+        <w:spacing w:after="70"/>
+      </w:pPr>
+      <w:r>
+        <w:rPr>
+          <w:rFonts w:ascii="Calibri" w:cs="Calibri" w:eastAsia="Calibri" w:hAnsi="Calibri"/>
+          <w:sz w:val="20"/>
+          <w:szCs w:val="20"/>
+        </w:rPr>
+        <w:t xml:space="preserve">Toda grandeza nova entra na tabela de classificação da seção 0, com uma das classes: MEDIDO, RECALCULADO, COMPATÍVEL (não estabelece), DECISÃO DE MODELAGEM, PREMISSA DE CENÁRIO ou EXTRAPOLAÇÃO.</w:t>
       </w:r>
     </w:p>
     <w:p>
@@ -8615,7 +13021,7 @@
         <w:sz w:val="16"/>
         <w:szCs w:val="16"/>
       </w:rPr>
-      <w:t xml:space="preserve">TCC2 — Histórico de decisões e fontes  ·  v3  ·  17/09/2026  ·  página </w:t>
+      <w:t xml:space="preserve">TCC2 — Histórico de decisões e fontes  ·  v6  ·  17/09/2026  ·  página </w:t>
     </w:r>
     <w:r>
       <w:rPr>

</xml_diff>